<commit_message>
update for fall 2026
</commit_message>
<xml_diff>
--- a/Ramapo620-50_syllabus1.1docx.docx
+++ b/Ramapo620-50_syllabus1.1docx.docx
@@ -79,7 +79,6 @@
         </w:rPr>
         <w:t xml:space="preserve">0 - </w:t>
       </w:r>
-      <w:proofErr w:type="gramStart"/>
       <w:r>
         <w:rPr>
           <w:rFonts w:ascii="Arial" w:hAnsi="Arial" w:cs="Arial"/>
@@ -96,105 +95,95 @@
           <w:sz w:val="24"/>
           <w:szCs w:val="24"/>
         </w:rPr>
-        <w:t>0 :</w:t>
-      </w:r>
-      <w:proofErr w:type="gramEnd"/>
-      <w:r>
-        <w:rPr>
-          <w:rFonts w:ascii="Arial" w:hAnsi="Arial" w:cs="Arial"/>
+        <w:t xml:space="preserve">0 : </w:t>
+      </w:r>
+      <w:r>
+        <w:rPr>
+          <w:rFonts w:ascii="Arial" w:hAnsi="Arial" w:cs="Arial"/>
+          <w:color w:val="000000" w:themeColor="text1"/>
+          <w:sz w:val="24"/>
+          <w:szCs w:val="24"/>
+        </w:rPr>
+        <w:t>Creative Musical Coding</w:t>
+      </w:r>
+    </w:p>
+    <w:p>
+      <w:pPr>
+        <w:rPr>
+          <w:rFonts w:ascii="Arial" w:hAnsi="Arial" w:cs="Arial"/>
+          <w:color w:val="000000" w:themeColor="text1"/>
+          <w:sz w:val="24"/>
+          <w:szCs w:val="24"/>
+        </w:rPr>
+      </w:pPr>
+      <w:r>
+        <w:rPr>
+          <w:rFonts w:ascii="Arial" w:hAnsi="Arial" w:cs="Arial"/>
+          <w:color w:val="000000" w:themeColor="text1"/>
+          <w:sz w:val="24"/>
+          <w:szCs w:val="24"/>
+        </w:rPr>
+        <w:t>Fall</w:t>
+      </w:r>
+      <w:r>
+        <w:rPr>
+          <w:rFonts w:ascii="Arial" w:hAnsi="Arial" w:cs="Arial"/>
+          <w:color w:val="000000" w:themeColor="text1"/>
+          <w:sz w:val="24"/>
+          <w:szCs w:val="24"/>
+        </w:rPr>
+        <w:t xml:space="preserve"> 202</w:t>
+      </w:r>
+      <w:r>
+        <w:rPr>
+          <w:rFonts w:ascii="Arial" w:hAnsi="Arial" w:cs="Arial"/>
+          <w:color w:val="000000" w:themeColor="text1"/>
+          <w:sz w:val="24"/>
+          <w:szCs w:val="24"/>
+        </w:rPr>
+        <w:t>6</w:t>
+      </w:r>
+    </w:p>
+    <w:p>
+      <w:pPr>
+        <w:rPr>
+          <w:rFonts w:ascii="Arial" w:hAnsi="Arial" w:cs="Arial"/>
+          <w:color w:val="000000" w:themeColor="text1"/>
+          <w:sz w:val="24"/>
+          <w:szCs w:val="24"/>
+        </w:rPr>
+      </w:pPr>
+    </w:p>
+    <w:p>
+      <w:pPr>
+        <w:rPr>
+          <w:rFonts w:ascii="Arial" w:hAnsi="Arial" w:cs="Arial"/>
+          <w:bCs/>
+          <w:color w:val="000000" w:themeColor="text1"/>
+          <w:sz w:val="24"/>
+          <w:szCs w:val="24"/>
+        </w:rPr>
+      </w:pPr>
+      <w:r>
+        <w:rPr>
+          <w:rFonts w:ascii="Arial" w:hAnsi="Arial" w:cs="Arial"/>
+          <w:bCs/>
+          <w:color w:val="000000" w:themeColor="text1"/>
+          <w:sz w:val="24"/>
+          <w:szCs w:val="24"/>
+        </w:rPr>
+        <w:t>Daniel Fishkin</w:t>
+      </w:r>
+      <w:r>
+        <w:rPr>
+          <w:rFonts w:ascii="Arial" w:hAnsi="Arial" w:cs="Arial"/>
+          <w:bCs/>
           <w:color w:val="000000" w:themeColor="text1"/>
           <w:sz w:val="24"/>
           <w:szCs w:val="24"/>
         </w:rPr>
         <w:t xml:space="preserve"> </w:t>
       </w:r>
-      <w:r>
-        <w:rPr>
-          <w:rFonts w:ascii="Arial" w:hAnsi="Arial" w:cs="Arial"/>
-          <w:color w:val="000000" w:themeColor="text1"/>
-          <w:sz w:val="24"/>
-          <w:szCs w:val="24"/>
-        </w:rPr>
-        <w:t>Creative Musical Coding</w:t>
-      </w:r>
-    </w:p>
-    <w:p>
-      <w:pPr>
-        <w:rPr>
-          <w:rFonts w:ascii="Arial" w:hAnsi="Arial" w:cs="Arial"/>
-          <w:color w:val="000000" w:themeColor="text1"/>
-          <w:sz w:val="24"/>
-          <w:szCs w:val="24"/>
-        </w:rPr>
-      </w:pPr>
-      <w:r>
-        <w:rPr>
-          <w:rFonts w:ascii="Arial" w:hAnsi="Arial" w:cs="Arial"/>
-          <w:color w:val="000000" w:themeColor="text1"/>
-          <w:sz w:val="24"/>
-          <w:szCs w:val="24"/>
-        </w:rPr>
-        <w:t>Fall</w:t>
-      </w:r>
-      <w:r>
-        <w:rPr>
-          <w:rFonts w:ascii="Arial" w:hAnsi="Arial" w:cs="Arial"/>
-          <w:color w:val="000000" w:themeColor="text1"/>
-          <w:sz w:val="24"/>
-          <w:szCs w:val="24"/>
-        </w:rPr>
-        <w:t xml:space="preserve"> 202</w:t>
-      </w:r>
-      <w:r>
-        <w:rPr>
-          <w:rFonts w:ascii="Arial" w:hAnsi="Arial" w:cs="Arial"/>
-          <w:color w:val="000000" w:themeColor="text1"/>
-          <w:sz w:val="24"/>
-          <w:szCs w:val="24"/>
-        </w:rPr>
-        <w:t>5</w:t>
-      </w:r>
-    </w:p>
-    <w:p>
-      <w:pPr>
-        <w:rPr>
-          <w:rFonts w:ascii="Arial" w:hAnsi="Arial" w:cs="Arial"/>
-          <w:color w:val="000000" w:themeColor="text1"/>
-          <w:sz w:val="24"/>
-          <w:szCs w:val="24"/>
-        </w:rPr>
-      </w:pPr>
-    </w:p>
-    <w:p>
-      <w:pPr>
-        <w:rPr>
-          <w:rFonts w:ascii="Arial" w:hAnsi="Arial" w:cs="Arial"/>
-          <w:bCs/>
-          <w:color w:val="000000" w:themeColor="text1"/>
-          <w:sz w:val="24"/>
-          <w:szCs w:val="24"/>
-        </w:rPr>
-      </w:pPr>
-      <w:r>
-        <w:rPr>
-          <w:rFonts w:ascii="Arial" w:hAnsi="Arial" w:cs="Arial"/>
-          <w:bCs/>
-          <w:color w:val="000000" w:themeColor="text1"/>
-          <w:sz w:val="24"/>
-          <w:szCs w:val="24"/>
-        </w:rPr>
-        <w:t>Daniel Fishkin</w:t>
-      </w:r>
-      <w:r>
-        <w:rPr>
-          <w:rFonts w:ascii="Arial" w:hAnsi="Arial" w:cs="Arial"/>
-          <w:bCs/>
-          <w:color w:val="000000" w:themeColor="text1"/>
-          <w:sz w:val="24"/>
-          <w:szCs w:val="24"/>
-        </w:rPr>
-        <w:t xml:space="preserve"> </w:t>
-      </w:r>
     </w:p>
     <w:p>
       <w:pPr>
@@ -301,83 +290,6 @@
       <w:pPr>
         <w:rPr>
           <w:rFonts w:ascii="Arial" w:hAnsi="Arial" w:cs="Arial"/>
-          <w:sz w:val="24"/>
-          <w:szCs w:val="24"/>
-        </w:rPr>
-      </w:pPr>
-    </w:p>
-    <w:p>
-      <w:pPr>
-        <w:rPr>
-          <w:rFonts w:ascii="Arial" w:hAnsi="Arial" w:cs="Arial"/>
-          <w:b/>
-          <w:bCs/>
-          <w:sz w:val="24"/>
-          <w:szCs w:val="24"/>
-        </w:rPr>
-      </w:pPr>
-      <w:r>
-        <w:rPr>
-          <w:rFonts w:ascii="Arial" w:hAnsi="Arial" w:cs="Arial"/>
-          <w:b/>
-          <w:bCs/>
-          <w:sz w:val="24"/>
-          <w:szCs w:val="24"/>
-        </w:rPr>
-        <w:t xml:space="preserve">Class </w:t>
-      </w:r>
-      <w:proofErr w:type="spellStart"/>
-      <w:r>
-        <w:rPr>
-          <w:rFonts w:ascii="Arial" w:hAnsi="Arial" w:cs="Arial"/>
-          <w:b/>
-          <w:bCs/>
-          <w:sz w:val="24"/>
-          <w:szCs w:val="24"/>
-        </w:rPr>
-        <w:t>Github</w:t>
-      </w:r>
-      <w:proofErr w:type="spellEnd"/>
-      <w:r>
-        <w:rPr>
-          <w:rFonts w:ascii="Arial" w:hAnsi="Arial" w:cs="Arial"/>
-          <w:b/>
-          <w:bCs/>
-          <w:sz w:val="24"/>
-          <w:szCs w:val="24"/>
-        </w:rPr>
-        <w:t>:</w:t>
-      </w:r>
-    </w:p>
-    <w:p>
-      <w:pPr>
-        <w:rPr>
-          <w:rFonts w:ascii="Arial" w:hAnsi="Arial" w:cs="Arial"/>
-          <w:b/>
-          <w:color w:val="000000" w:themeColor="text1"/>
-          <w:sz w:val="24"/>
-          <w:szCs w:val="24"/>
-        </w:rPr>
-      </w:pPr>
-      <w:hyperlink r:id="rId8" w:history="1">
-        <w:r>
-          <w:rPr>
-            <w:rStyle w:val="Hyperlink"/>
-            <w:rFonts w:ascii="Arial" w:hAnsi="Arial" w:cs="Arial"/>
-            <w:b/>
-            <w:sz w:val="24"/>
-            <w:szCs w:val="24"/>
-          </w:rPr>
-          <w:t>https://github.com/dfict/MUSI-650-20</w:t>
-        </w:r>
-      </w:hyperlink>
-    </w:p>
-    <w:p>
-      <w:pPr>
-        <w:rPr>
-          <w:rFonts w:ascii="Arial" w:hAnsi="Arial" w:cs="Arial"/>
-          <w:b/>
-          <w:color w:val="000000" w:themeColor="text1"/>
           <w:sz w:val="24"/>
           <w:szCs w:val="24"/>
         </w:rPr>
@@ -475,27 +387,7 @@
           <w:sz w:val="24"/>
           <w:szCs w:val="24"/>
         </w:rPr>
-        <w:t xml:space="preserve">This course provides a foundational introduction to music programming languages. </w:t>
-      </w:r>
-      <w:proofErr w:type="spellStart"/>
-      <w:r>
-        <w:rPr>
-          <w:rFonts w:ascii="Arial" w:eastAsia="Times New Roman" w:hAnsi="Arial" w:cs="Arial"/>
-          <w:color w:val="000000" w:themeColor="text1"/>
-          <w:sz w:val="24"/>
-          <w:szCs w:val="24"/>
-        </w:rPr>
-        <w:t>SuperCollider</w:t>
-      </w:r>
-      <w:proofErr w:type="spellEnd"/>
-      <w:r>
-        <w:rPr>
-          <w:rFonts w:ascii="Arial" w:eastAsia="Times New Roman" w:hAnsi="Arial" w:cs="Arial"/>
-          <w:color w:val="000000" w:themeColor="text1"/>
-          <w:sz w:val="24"/>
-          <w:szCs w:val="24"/>
-        </w:rPr>
-        <w:t xml:space="preserve">, </w:t>
+        <w:t xml:space="preserve">This course provides a foundational introduction to music programming languages. SuperCollider, </w:t>
       </w:r>
       <w:r>
         <w:rPr>
@@ -940,7 +832,7 @@
         </w:rPr>
         <w:tab/>
       </w:r>
-      <w:hyperlink r:id="rId9" w:history="1">
+      <w:hyperlink r:id="rId8" w:history="1">
         <w:r>
           <w:rPr>
             <w:rStyle w:val="Hyperlink"/>
@@ -1052,16 +944,7 @@
           <w:sz w:val="24"/>
           <w:szCs w:val="24"/>
         </w:rPr>
-        <w:t>50</w:t>
-      </w:r>
-      <w:r>
-        <w:rPr>
-          <w:bCs/>
-          <w:color w:val="000000" w:themeColor="text1"/>
-          <w:sz w:val="24"/>
-          <w:szCs w:val="24"/>
-        </w:rPr>
-        <w:t xml:space="preserve"> </w:t>
+        <w:t>25</w:t>
       </w:r>
     </w:p>
     <w:p>
@@ -1081,7 +964,6 @@
           <w:i/>
           <w:color w:val="000000" w:themeColor="text1"/>
         </w:rPr>
-        <w:lastRenderedPageBreak/>
         <w:t>T</w:t>
       </w:r>
       <w:r>
@@ -1124,7 +1006,7 @@
         </w:rPr>
         <w:t xml:space="preserve">Bruno Ruviaro, A Gentle Introduction to Supercollider </w:t>
       </w:r>
-      <w:hyperlink r:id="rId10" w:history="1">
+      <w:hyperlink r:id="rId9" w:history="1">
         <w:r>
           <w:rPr>
             <w:rStyle w:val="Hyperlink"/>
@@ -1185,6 +1067,7 @@
           <w:sz w:val="24"/>
           <w:szCs w:val="24"/>
         </w:rPr>
+        <w:lastRenderedPageBreak/>
         <w:t xml:space="preserve">Shiffman, Daniel. </w:t>
       </w:r>
       <w:r>
@@ -1275,7 +1158,7 @@
           <w:szCs w:val="24"/>
         </w:rPr>
       </w:pPr>
-      <w:hyperlink r:id="rId11" w:history="1">
+      <w:hyperlink r:id="rId10" w:history="1">
         <w:r>
           <w:rPr>
             <w:rStyle w:val="Hyperlink"/>
@@ -1402,7 +1285,6 @@
           <w:szCs w:val="24"/>
         </w:rPr>
       </w:pPr>
-      <w:proofErr w:type="spellStart"/>
       <w:r>
         <w:rPr>
           <w:rFonts w:ascii="Arial" w:eastAsia="Times New Roman" w:hAnsi="Arial" w:cs="Arial"/>
@@ -1412,10 +1294,12 @@
           <w:sz w:val="24"/>
           <w:szCs w:val="24"/>
         </w:rPr>
-        <w:t>collection:"Tutorials</w:t>
-      </w:r>
-      <w:proofErr w:type="spellEnd"/>
-      <w:r>
+        <w:t>collection:"Tutorials/Max Tutorials@cycling74"</w:t>
+      </w:r>
+    </w:p>
+    <w:p>
+      <w:pPr>
+        <w:ind w:left="2160"/>
         <w:rPr>
           <w:rFonts w:ascii="Arial" w:eastAsia="Times New Roman" w:hAnsi="Arial" w:cs="Arial"/>
           <w:b/>
@@ -1424,12 +1308,8 @@
           <w:sz w:val="24"/>
           <w:szCs w:val="24"/>
         </w:rPr>
-        <w:t>/Max Tutorials@cycling74"</w:t>
-      </w:r>
-    </w:p>
-    <w:p>
-      <w:pPr>
-        <w:ind w:left="2160"/>
+      </w:pPr>
+      <w:r>
         <w:rPr>
           <w:rFonts w:ascii="Arial" w:eastAsia="Times New Roman" w:hAnsi="Arial" w:cs="Arial"/>
           <w:b/>
@@ -1438,30 +1318,7 @@
           <w:sz w:val="24"/>
           <w:szCs w:val="24"/>
         </w:rPr>
-      </w:pPr>
-      <w:proofErr w:type="spellStart"/>
-      <w:r>
-        <w:rPr>
-          <w:rFonts w:ascii="Arial" w:eastAsia="Times New Roman" w:hAnsi="Arial" w:cs="Arial"/>
-          <w:b/>
-          <w:iCs/>
-          <w:color w:val="000000"/>
-          <w:sz w:val="24"/>
-          <w:szCs w:val="24"/>
-        </w:rPr>
-        <w:t>collection:"Tutorials</w:t>
-      </w:r>
-      <w:proofErr w:type="spellEnd"/>
-      <w:r>
-        <w:rPr>
-          <w:rFonts w:ascii="Arial" w:eastAsia="Times New Roman" w:hAnsi="Arial" w:cs="Arial"/>
-          <w:b/>
-          <w:iCs/>
-          <w:color w:val="000000"/>
-          <w:sz w:val="24"/>
-          <w:szCs w:val="24"/>
-        </w:rPr>
-        <w:t>/MSP Tutorials@cycling74"</w:t>
+        <w:t>collection:"Tutorials/MSP Tutorials@cycling74"</w:t>
       </w:r>
     </w:p>
     <w:p>
@@ -1512,7 +1369,7 @@
           <w:szCs w:val="24"/>
         </w:rPr>
       </w:pPr>
-      <w:hyperlink r:id="rId12" w:history="1">
+      <w:hyperlink r:id="rId11" w:history="1">
         <w:r>
           <w:rPr>
             <w:rStyle w:val="Hyperlink"/>
@@ -1605,7 +1462,7 @@
           <w:szCs w:val="24"/>
         </w:rPr>
       </w:pPr>
-      <w:hyperlink r:id="rId13" w:history="1">
+      <w:hyperlink r:id="rId12" w:history="1">
         <w:r>
           <w:rPr>
             <w:rStyle w:val="Hyperlink"/>
@@ -1639,25 +1496,7 @@
     </w:p>
     <w:p>
       <w:pPr>
-        <w:rPr>
-          <w:rFonts w:ascii="Arial" w:eastAsia="Times New Roman" w:hAnsi="Arial" w:cs="Arial"/>
-          <w:color w:val="000000"/>
-          <w:sz w:val="24"/>
-          <w:szCs w:val="24"/>
-        </w:rPr>
-      </w:pPr>
-    </w:p>
-    <w:p>
-      <w:pPr>
-        <w:ind w:left="1440" w:firstLine="720"/>
-        <w:rPr>
-          <w:rFonts w:ascii="Arial" w:eastAsia="Times New Roman" w:hAnsi="Arial" w:cs="Arial"/>
-          <w:color w:val="000000"/>
-          <w:sz w:val="24"/>
-          <w:szCs w:val="24"/>
-        </w:rPr>
-      </w:pPr>
-      <w:r>
+        <w:ind w:left="2160"/>
         <w:rPr>
           <w:rFonts w:ascii="Arial" w:eastAsia="Times New Roman" w:hAnsi="Arial" w:cs="Arial"/>
           <w:b/>
@@ -1666,50 +1505,7 @@
           <w:sz w:val="24"/>
           <w:szCs w:val="24"/>
         </w:rPr>
-        <w:t>Audacity</w:t>
-      </w:r>
-    </w:p>
-    <w:p>
-      <w:pPr>
-        <w:ind w:left="2160"/>
-        <w:rPr>
-          <w:rFonts w:ascii="Arial" w:eastAsia="Times New Roman" w:hAnsi="Arial" w:cs="Arial"/>
-          <w:color w:val="000000"/>
-          <w:sz w:val="24"/>
-          <w:szCs w:val="24"/>
-        </w:rPr>
-      </w:pPr>
-      <w:hyperlink r:id="rId14" w:history="1">
-        <w:r>
-          <w:rPr>
-            <w:rStyle w:val="Hyperlink"/>
-            <w:rFonts w:ascii="Arial" w:eastAsia="Times New Roman" w:hAnsi="Arial" w:cs="Arial"/>
-            <w:sz w:val="24"/>
-            <w:szCs w:val="24"/>
-          </w:rPr>
-          <w:t>https://www.audacityteam.org/</w:t>
-        </w:r>
-      </w:hyperlink>
-    </w:p>
-    <w:p>
-      <w:pPr>
-        <w:ind w:left="2160"/>
-        <w:rPr>
-          <w:rFonts w:ascii="Arial" w:eastAsia="Times New Roman" w:hAnsi="Arial" w:cs="Arial"/>
-          <w:color w:val="000000"/>
-          <w:sz w:val="24"/>
-          <w:szCs w:val="24"/>
-        </w:rPr>
-      </w:pPr>
-      <w:r>
-        <w:rPr>
-          <w:rFonts w:ascii="Arial" w:eastAsia="Times New Roman" w:hAnsi="Arial" w:cs="Arial"/>
-          <w:color w:val="000000"/>
-          <w:sz w:val="24"/>
-          <w:szCs w:val="24"/>
-        </w:rPr>
-        <w:t>Audacity is a basic editing program that is excellent for transforming individual sounds.</w:t>
-      </w:r>
+      </w:pPr>
     </w:p>
     <w:p>
       <w:pPr>
@@ -1723,10 +1519,7 @@
           <w:szCs w:val="24"/>
         </w:rPr>
       </w:pPr>
-    </w:p>
-    <w:p>
-      <w:pPr>
-        <w:ind w:left="2160"/>
+      <w:r>
         <w:rPr>
           <w:rFonts w:ascii="Arial" w:eastAsia="Times New Roman" w:hAnsi="Arial" w:cs="Arial"/>
           <w:b/>
@@ -1735,16 +1528,6 @@
           <w:sz w:val="24"/>
           <w:szCs w:val="24"/>
         </w:rPr>
-      </w:pPr>
-      <w:r>
-        <w:rPr>
-          <w:rFonts w:ascii="Arial" w:eastAsia="Times New Roman" w:hAnsi="Arial" w:cs="Arial"/>
-          <w:b/>
-          <w:bCs/>
-          <w:color w:val="000000"/>
-          <w:sz w:val="24"/>
-          <w:szCs w:val="24"/>
-        </w:rPr>
         <w:t>Python</w:t>
       </w:r>
     </w:p>
@@ -1766,27 +1549,7 @@
           <w:sz w:val="24"/>
           <w:szCs w:val="24"/>
         </w:rPr>
-        <w:t xml:space="preserve">Extremely powerful </w:t>
-      </w:r>
-      <w:proofErr w:type="gramStart"/>
-      <w:r>
-        <w:rPr>
-          <w:rFonts w:ascii="Arial" w:eastAsia="Times New Roman" w:hAnsi="Arial" w:cs="Arial"/>
-          <w:color w:val="000000" w:themeColor="text1"/>
-          <w:sz w:val="24"/>
-          <w:szCs w:val="24"/>
-        </w:rPr>
-        <w:t>code based</w:t>
-      </w:r>
-      <w:proofErr w:type="gramEnd"/>
-      <w:r>
-        <w:rPr>
-          <w:rFonts w:ascii="Arial" w:eastAsia="Times New Roman" w:hAnsi="Arial" w:cs="Arial"/>
-          <w:color w:val="000000" w:themeColor="text1"/>
-          <w:sz w:val="24"/>
-          <w:szCs w:val="24"/>
-        </w:rPr>
-        <w:t xml:space="preserve"> platform</w:t>
+        <w:t>Extremely powerful code based platform</w:t>
       </w:r>
     </w:p>
     <w:p>
@@ -1800,7 +1563,7 @@
           <w:szCs w:val="24"/>
         </w:rPr>
       </w:pPr>
-      <w:hyperlink r:id="rId15" w:history="1">
+      <w:hyperlink r:id="rId13" w:history="1">
         <w:r>
           <w:rPr>
             <w:rStyle w:val="Hyperlink"/>
@@ -1815,18 +1578,17 @@
     <w:p>
       <w:pPr>
         <w:spacing w:line="240" w:lineRule="auto"/>
+        <w:ind w:left="2160"/>
         <w:rPr>
           <w:rFonts w:ascii="Arial" w:eastAsia="Times New Roman" w:hAnsi="Arial" w:cs="Arial"/>
-          <w:color w:val="000000" w:themeColor="text1"/>
-          <w:sz w:val="24"/>
-          <w:szCs w:val="24"/>
-        </w:rPr>
-      </w:pPr>
-    </w:p>
-    <w:p>
-      <w:pPr>
-        <w:spacing w:line="240" w:lineRule="auto"/>
-        <w:ind w:left="2160"/>
+          <w:b/>
+          <w:bCs/>
+          <w:color w:val="000000" w:themeColor="text1"/>
+          <w:sz w:val="24"/>
+          <w:szCs w:val="24"/>
+        </w:rPr>
+      </w:pPr>
+      <w:r>
         <w:rPr>
           <w:rFonts w:ascii="Arial" w:eastAsia="Times New Roman" w:hAnsi="Arial" w:cs="Arial"/>
           <w:b/>
@@ -1835,83 +1597,7 @@
           <w:sz w:val="24"/>
           <w:szCs w:val="24"/>
         </w:rPr>
-      </w:pPr>
-      <w:proofErr w:type="spellStart"/>
-      <w:r>
-        <w:rPr>
-          <w:rFonts w:ascii="Arial" w:eastAsia="Times New Roman" w:hAnsi="Arial" w:cs="Arial"/>
-          <w:b/>
-          <w:bCs/>
-          <w:color w:val="000000" w:themeColor="text1"/>
-          <w:sz w:val="24"/>
-          <w:szCs w:val="24"/>
-        </w:rPr>
-        <w:t>Csound</w:t>
-      </w:r>
-      <w:proofErr w:type="spellEnd"/>
-    </w:p>
-    <w:p>
-      <w:pPr>
-        <w:spacing w:line="240" w:lineRule="auto"/>
-        <w:ind w:left="2160"/>
-        <w:rPr>
-          <w:rStyle w:val="Hyperlink"/>
-          <w:rFonts w:ascii="Arial" w:eastAsia="Times New Roman" w:hAnsi="Arial" w:cs="Arial"/>
-          <w:i/>
-          <w:iCs/>
-          <w:sz w:val="24"/>
-          <w:szCs w:val="24"/>
-        </w:rPr>
-      </w:pPr>
-      <w:hyperlink r:id="rId16" w:history="1">
-        <w:r>
-          <w:rPr>
-            <w:rStyle w:val="Hyperlink"/>
-            <w:rFonts w:ascii="Arial" w:eastAsia="Times New Roman" w:hAnsi="Arial" w:cs="Arial"/>
-            <w:i/>
-            <w:iCs/>
-            <w:sz w:val="24"/>
-            <w:szCs w:val="24"/>
-          </w:rPr>
-          <w:t>https://github.com/dfict/clawyer</w:t>
-        </w:r>
-      </w:hyperlink>
-    </w:p>
-    <w:p>
-      <w:pPr>
-        <w:spacing w:line="240" w:lineRule="auto"/>
-        <w:rPr>
-          <w:rFonts w:ascii="Arial" w:eastAsia="Times New Roman" w:hAnsi="Arial" w:cs="Arial"/>
-          <w:i/>
-          <w:iCs/>
-          <w:color w:val="000000" w:themeColor="text1"/>
-          <w:sz w:val="24"/>
-          <w:szCs w:val="24"/>
-        </w:rPr>
-      </w:pPr>
-    </w:p>
-    <w:p>
-      <w:pPr>
-        <w:spacing w:line="240" w:lineRule="auto"/>
-        <w:ind w:left="2160"/>
-        <w:rPr>
-          <w:rFonts w:ascii="Arial" w:eastAsia="Times New Roman" w:hAnsi="Arial" w:cs="Arial"/>
-          <w:b/>
-          <w:bCs/>
-          <w:color w:val="000000" w:themeColor="text1"/>
-          <w:sz w:val="24"/>
-          <w:szCs w:val="24"/>
-        </w:rPr>
-      </w:pPr>
-      <w:r>
-        <w:rPr>
-          <w:rFonts w:ascii="Arial" w:eastAsia="Times New Roman" w:hAnsi="Arial" w:cs="Arial"/>
-          <w:b/>
-          <w:bCs/>
-          <w:color w:val="000000" w:themeColor="text1"/>
-          <w:sz w:val="24"/>
-          <w:szCs w:val="24"/>
-        </w:rPr>
+        <w:lastRenderedPageBreak/>
         <w:t>Arduino (Processing)</w:t>
       </w:r>
     </w:p>
@@ -1958,7 +1644,7 @@
                     </pic:cNvPicPr>
                   </pic:nvPicPr>
                   <pic:blipFill rotWithShape="1">
-                    <a:blip r:embed="rId17">
+                    <a:blip r:embed="rId14">
                       <a:extLst>
                         <a:ext uri="{28A0092B-C50C-407E-A947-70E740481C1C}">
                           <a14:useLocalDpi xmlns:a14="http://schemas.microsoft.com/office/drawing/2010/main" val="0"/>
@@ -2066,19 +1752,8 @@
           <w:sz w:val="24"/>
           <w:szCs w:val="24"/>
         </w:rPr>
-        <w:t xml:space="preserve">Daisy </w:t>
-      </w:r>
-      <w:proofErr w:type="spellStart"/>
-      <w:r>
-        <w:rPr>
-          <w:rFonts w:ascii="Arial" w:eastAsia="Times New Roman" w:hAnsi="Arial" w:cs="Arial"/>
-          <w:color w:val="000000" w:themeColor="text1"/>
-          <w:sz w:val="24"/>
-          <w:szCs w:val="24"/>
-        </w:rPr>
-        <w:t>ElectroSmith</w:t>
-      </w:r>
-      <w:proofErr w:type="spellEnd"/>
+        <w:t>Daisy ElectroSmith</w:t>
+      </w:r>
     </w:p>
     <w:p>
       <w:pPr>
@@ -2091,7 +1766,7 @@
           <w:szCs w:val="24"/>
         </w:rPr>
       </w:pPr>
-      <w:hyperlink r:id="rId18" w:history="1">
+      <w:hyperlink r:id="rId15" w:history="1">
         <w:r>
           <w:rPr>
             <w:rStyle w:val="Hyperlink"/>
@@ -2255,17 +1930,17 @@
           <w:szCs w:val="24"/>
         </w:rPr>
       </w:pPr>
-    </w:p>
-    <w:p>
-      <w:pPr>
-        <w:spacing w:line="240" w:lineRule="auto"/>
+      <w:r>
         <w:rPr>
           <w:rFonts w:ascii="Arial" w:eastAsia="Times New Roman" w:hAnsi="Arial" w:cs="Arial"/>
-          <w:color w:val="000000" w:themeColor="text1"/>
-          <w:sz w:val="24"/>
-          <w:szCs w:val="24"/>
-        </w:rPr>
-      </w:pPr>
+          <w:i/>
+          <w:iCs/>
+          <w:color w:val="000000" w:themeColor="text1"/>
+          <w:sz w:val="24"/>
+          <w:szCs w:val="24"/>
+        </w:rPr>
+        <w:t>Course Repository</w:t>
+      </w:r>
       <w:r>
         <w:rPr>
           <w:rFonts w:ascii="Arial" w:eastAsia="Times New Roman" w:hAnsi="Arial" w:cs="Arial"/>
@@ -2273,145 +1948,18 @@
           <w:sz w:val="24"/>
           <w:szCs w:val="24"/>
         </w:rPr>
+        <w:t>:</w:t>
+      </w:r>
+      <w:r>
+        <w:rPr>
+          <w:rFonts w:ascii="Arial" w:eastAsia="Times New Roman" w:hAnsi="Arial" w:cs="Arial"/>
+          <w:color w:val="000000" w:themeColor="text1"/>
+          <w:sz w:val="24"/>
+          <w:szCs w:val="24"/>
+        </w:rPr>
         <w:tab/>
       </w:r>
-      <w:r>
-        <w:rPr>
-          <w:rFonts w:ascii="Arial" w:eastAsia="Times New Roman" w:hAnsi="Arial" w:cs="Arial"/>
-          <w:color w:val="000000" w:themeColor="text1"/>
-          <w:sz w:val="24"/>
-          <w:szCs w:val="24"/>
-        </w:rPr>
-        <w:tab/>
-      </w:r>
-      <w:r>
-        <w:rPr>
-          <w:rFonts w:ascii="Arial" w:eastAsia="Times New Roman" w:hAnsi="Arial" w:cs="Arial"/>
-          <w:color w:val="000000" w:themeColor="text1"/>
-          <w:sz w:val="24"/>
-          <w:szCs w:val="24"/>
-        </w:rPr>
-        <w:tab/>
-        <w:t>Flying Fish PCB (</w:t>
-      </w:r>
-      <w:proofErr w:type="spellStart"/>
-      <w:r>
-        <w:rPr>
-          <w:rFonts w:ascii="Arial" w:eastAsia="Times New Roman" w:hAnsi="Arial" w:cs="Arial"/>
-          <w:color w:val="000000" w:themeColor="text1"/>
-          <w:sz w:val="24"/>
-          <w:szCs w:val="24"/>
-        </w:rPr>
-        <w:t>DFishkin</w:t>
-      </w:r>
-      <w:proofErr w:type="spellEnd"/>
-      <w:r>
-        <w:rPr>
-          <w:rFonts w:ascii="Arial" w:eastAsia="Times New Roman" w:hAnsi="Arial" w:cs="Arial"/>
-          <w:color w:val="000000" w:themeColor="text1"/>
-          <w:sz w:val="24"/>
-          <w:szCs w:val="24"/>
-        </w:rPr>
-        <w:t>)</w:t>
-      </w:r>
-    </w:p>
-    <w:p>
-      <w:pPr>
-        <w:spacing w:line="240" w:lineRule="auto"/>
-        <w:ind w:left="1440" w:firstLine="720"/>
-        <w:rPr>
-          <w:rFonts w:ascii="Arial" w:eastAsia="Times New Roman" w:hAnsi="Arial" w:cs="Arial"/>
-          <w:color w:val="0000FF" w:themeColor="hyperlink"/>
-          <w:sz w:val="24"/>
-          <w:szCs w:val="24"/>
-          <w:u w:val="single"/>
-        </w:rPr>
-      </w:pPr>
-      <w:hyperlink r:id="rId19" w:history="1">
-        <w:r>
-          <w:rPr>
-            <w:rStyle w:val="Hyperlink"/>
-            <w:rFonts w:ascii="Arial" w:eastAsia="Times New Roman" w:hAnsi="Arial" w:cs="Arial"/>
-            <w:sz w:val="24"/>
-            <w:szCs w:val="24"/>
-          </w:rPr>
-          <w:t>https://github.com/dfict/flying_fish</w:t>
-        </w:r>
-      </w:hyperlink>
-    </w:p>
-    <w:p>
-      <w:pPr>
-        <w:spacing w:line="240" w:lineRule="auto"/>
-        <w:ind w:left="2160"/>
-        <w:rPr>
-          <w:rFonts w:ascii="Arial" w:eastAsia="Times New Roman" w:hAnsi="Arial" w:cs="Arial"/>
-          <w:color w:val="000000" w:themeColor="text1"/>
-          <w:sz w:val="24"/>
-          <w:szCs w:val="24"/>
-        </w:rPr>
-      </w:pPr>
-      <w:r>
-        <w:rPr>
-          <w:rFonts w:ascii="Arial" w:eastAsia="Times New Roman" w:hAnsi="Arial" w:cs="Arial"/>
-          <w:color w:val="000000" w:themeColor="text1"/>
-          <w:sz w:val="24"/>
-          <w:szCs w:val="24"/>
-        </w:rPr>
-        <w:t>Flying Fish is a scrappy simple circuit using the venerated Atmega328</w:t>
-      </w:r>
-    </w:p>
-    <w:p>
-      <w:pPr>
-        <w:spacing w:line="240" w:lineRule="auto"/>
-        <w:ind w:left="2160"/>
-        <w:rPr>
-          <w:rFonts w:ascii="Arial" w:eastAsia="Times New Roman" w:hAnsi="Arial" w:cs="Arial"/>
-          <w:color w:val="000000" w:themeColor="text1"/>
-          <w:sz w:val="24"/>
-          <w:szCs w:val="24"/>
-        </w:rPr>
-      </w:pPr>
-    </w:p>
-    <w:p>
-      <w:pPr>
-        <w:spacing w:line="240" w:lineRule="auto"/>
-        <w:rPr>
-          <w:rFonts w:ascii="Arial" w:eastAsia="Times New Roman" w:hAnsi="Arial" w:cs="Arial"/>
-          <w:color w:val="000000" w:themeColor="text1"/>
-          <w:sz w:val="24"/>
-          <w:szCs w:val="24"/>
-        </w:rPr>
-      </w:pPr>
-      <w:r>
-        <w:rPr>
-          <w:rFonts w:ascii="Arial" w:eastAsia="Times New Roman" w:hAnsi="Arial" w:cs="Arial"/>
-          <w:i/>
-          <w:iCs/>
-          <w:color w:val="000000" w:themeColor="text1"/>
-          <w:sz w:val="24"/>
-          <w:szCs w:val="24"/>
-        </w:rPr>
-        <w:t>Course Repository</w:t>
-      </w:r>
-      <w:r>
-        <w:rPr>
-          <w:rFonts w:ascii="Arial" w:eastAsia="Times New Roman" w:hAnsi="Arial" w:cs="Arial"/>
-          <w:color w:val="000000" w:themeColor="text1"/>
-          <w:sz w:val="24"/>
-          <w:szCs w:val="24"/>
-        </w:rPr>
-        <w:t>:</w:t>
-      </w:r>
-      <w:r>
-        <w:rPr>
-          <w:rFonts w:ascii="Arial" w:eastAsia="Times New Roman" w:hAnsi="Arial" w:cs="Arial"/>
-          <w:color w:val="000000" w:themeColor="text1"/>
-          <w:sz w:val="24"/>
-          <w:szCs w:val="24"/>
-        </w:rPr>
-        <w:tab/>
-      </w:r>
-      <w:hyperlink r:id="rId20" w:history="1">
+      <w:hyperlink r:id="rId16" w:history="1">
         <w:r>
           <w:rPr>
             <w:rStyle w:val="Hyperlink"/>
@@ -2441,80 +1989,38 @@
           <w:sz w:val="24"/>
           <w:szCs w:val="24"/>
         </w:rPr>
-        <w:t xml:space="preserve">Since this is a coding class, we use Git for version tracking. I am </w:t>
-      </w:r>
-      <w:proofErr w:type="spellStart"/>
+        <w:t xml:space="preserve">Since this is a coding class, we use Git for version tracking. I am constanting updating, refining, refactoring, and revising code bases throughout the semester and many times throughout the week. Please learn to use </w:t>
+      </w:r>
       <w:r>
         <w:rPr>
           <w:rFonts w:ascii="Arial" w:eastAsia="Times New Roman" w:hAnsi="Arial" w:cs="Arial"/>
-          <w:color w:val="000000" w:themeColor="text1"/>
-          <w:sz w:val="24"/>
-          <w:szCs w:val="24"/>
-        </w:rPr>
-        <w:t>constanting</w:t>
-      </w:r>
-      <w:proofErr w:type="spellEnd"/>
+          <w:b/>
+          <w:bCs/>
+          <w:color w:val="000000" w:themeColor="text1"/>
+          <w:sz w:val="24"/>
+          <w:szCs w:val="24"/>
+        </w:rPr>
+        <w:t>Github</w:t>
+      </w:r>
       <w:r>
         <w:rPr>
           <w:rFonts w:ascii="Arial" w:eastAsia="Times New Roman" w:hAnsi="Arial" w:cs="Arial"/>
-          <w:color w:val="000000" w:themeColor="text1"/>
-          <w:sz w:val="24"/>
-          <w:szCs w:val="24"/>
-        </w:rPr>
-        <w:t xml:space="preserve"> updating, refining, refactoring, and revising code bases throughout the semester and many times throughout the week. Please learn to use </w:t>
-      </w:r>
-      <w:proofErr w:type="spellStart"/>
+          <w:b/>
+          <w:bCs/>
+          <w:color w:val="000000" w:themeColor="text1"/>
+          <w:sz w:val="24"/>
+          <w:szCs w:val="24"/>
+        </w:rPr>
+        <w:t xml:space="preserve">! </w:t>
+      </w:r>
       <w:r>
         <w:rPr>
           <w:rFonts w:ascii="Arial" w:eastAsia="Times New Roman" w:hAnsi="Arial" w:cs="Arial"/>
-          <w:b/>
-          <w:bCs/>
-          <w:color w:val="000000" w:themeColor="text1"/>
-          <w:sz w:val="24"/>
-          <w:szCs w:val="24"/>
-        </w:rPr>
-        <w:t>Github</w:t>
-      </w:r>
-      <w:proofErr w:type="spellEnd"/>
-      <w:r>
-        <w:rPr>
-          <w:rFonts w:ascii="Arial" w:eastAsia="Times New Roman" w:hAnsi="Arial" w:cs="Arial"/>
-          <w:b/>
-          <w:bCs/>
-          <w:color w:val="000000" w:themeColor="text1"/>
-          <w:sz w:val="24"/>
-          <w:szCs w:val="24"/>
-        </w:rPr>
-        <w:t xml:space="preserve">! </w:t>
-      </w:r>
-      <w:r>
-        <w:rPr>
-          <w:rFonts w:ascii="Arial" w:eastAsia="Times New Roman" w:hAnsi="Arial" w:cs="Arial"/>
-          <w:color w:val="000000" w:themeColor="text1"/>
-          <w:sz w:val="24"/>
-          <w:szCs w:val="24"/>
-        </w:rPr>
-        <w:t xml:space="preserve">Download </w:t>
-      </w:r>
-      <w:proofErr w:type="spellStart"/>
-      <w:r>
-        <w:rPr>
-          <w:rFonts w:ascii="Arial" w:eastAsia="Times New Roman" w:hAnsi="Arial" w:cs="Arial"/>
-          <w:color w:val="000000" w:themeColor="text1"/>
-          <w:sz w:val="24"/>
-          <w:szCs w:val="24"/>
-        </w:rPr>
-        <w:t>Github</w:t>
-      </w:r>
-      <w:proofErr w:type="spellEnd"/>
-      <w:r>
-        <w:rPr>
-          <w:rFonts w:ascii="Arial" w:eastAsia="Times New Roman" w:hAnsi="Arial" w:cs="Arial"/>
-          <w:color w:val="000000" w:themeColor="text1"/>
-          <w:sz w:val="24"/>
-          <w:szCs w:val="24"/>
-        </w:rPr>
-        <w:t xml:space="preserve"> Desktop and make an account asap.</w:t>
+          <w:color w:val="000000" w:themeColor="text1"/>
+          <w:sz w:val="24"/>
+          <w:szCs w:val="24"/>
+        </w:rPr>
+        <w:t>Download Github Desktop and make an account asap.</w:t>
       </w:r>
     </w:p>
     <w:p>
@@ -2528,6 +2034,174 @@
           <w:szCs w:val="24"/>
         </w:rPr>
       </w:pPr>
+    </w:p>
+    <w:p>
+      <w:pPr>
+        <w:keepNext/>
+        <w:jc w:val="center"/>
+      </w:pPr>
+      <w:r>
+        <w:rPr>
+          <w:rFonts w:ascii="Arial" w:hAnsi="Arial" w:cs="Arial"/>
+          <w:b/>
+          <w:noProof/>
+          <w:color w:val="000000" w:themeColor="text1"/>
+          <w:sz w:val="24"/>
+          <w:szCs w:val="24"/>
+        </w:rPr>
+        <w:drawing>
+          <wp:inline distT="0" distB="0" distL="0" distR="0" wp14:anchorId="677B26DB" wp14:editId="5E1C81F1">
+            <wp:extent cx="5725321" cy="3048000"/>
+            <wp:effectExtent l="0" t="0" r="2540" b="0"/>
+            <wp:docPr id="928599715" name="Picture 1" descr="A screenshot of a computer&#10;&#10;AI-generated content may be incorrect."/>
+            <wp:cNvGraphicFramePr>
+              <a:graphicFrameLocks xmlns:a="http://schemas.openxmlformats.org/drawingml/2006/main" noChangeAspect="1"/>
+            </wp:cNvGraphicFramePr>
+            <a:graphic xmlns:a="http://schemas.openxmlformats.org/drawingml/2006/main">
+              <a:graphicData uri="http://schemas.openxmlformats.org/drawingml/2006/picture">
+                <pic:pic xmlns:pic="http://schemas.openxmlformats.org/drawingml/2006/picture">
+                  <pic:nvPicPr>
+                    <pic:cNvPr id="928599715" name="Picture 1" descr="A screenshot of a computer&#10;&#10;AI-generated content may be incorrect."/>
+                    <pic:cNvPicPr/>
+                  </pic:nvPicPr>
+                  <pic:blipFill>
+                    <a:blip r:embed="rId17"/>
+                    <a:stretch>
+                      <a:fillRect/>
+                    </a:stretch>
+                  </pic:blipFill>
+                  <pic:spPr>
+                    <a:xfrm>
+                      <a:off x="0" y="0"/>
+                      <a:ext cx="5749556" cy="3060902"/>
+                    </a:xfrm>
+                    <a:prstGeom prst="rect">
+                      <a:avLst/>
+                    </a:prstGeom>
+                  </pic:spPr>
+                </pic:pic>
+              </a:graphicData>
+            </a:graphic>
+          </wp:inline>
+        </w:drawing>
+      </w:r>
+    </w:p>
+    <w:p>
+      <w:pPr>
+        <w:pStyle w:val="Caption"/>
+        <w:jc w:val="center"/>
+        <w:rPr>
+          <w:rFonts w:ascii="Arial" w:hAnsi="Arial" w:cs="Arial"/>
+          <w:b/>
+          <w:i w:val="0"/>
+          <w:iCs w:val="0"/>
+          <w:color w:val="000000" w:themeColor="text1"/>
+          <w:sz w:val="28"/>
+          <w:szCs w:val="28"/>
+        </w:rPr>
+      </w:pPr>
+      <w:r>
+        <w:rPr>
+          <w:rFonts w:ascii="Arial" w:hAnsi="Arial" w:cs="Arial"/>
+          <w:bCs/>
+          <w:i w:val="0"/>
+          <w:iCs w:val="0"/>
+          <w:color w:val="000000" w:themeColor="text1"/>
+          <w:sz w:val="28"/>
+          <w:szCs w:val="28"/>
+        </w:rPr>
+        <w:fldChar w:fldCharType="begin"/>
+      </w:r>
+      <w:r>
+        <w:rPr>
+          <w:rFonts w:ascii="Arial" w:hAnsi="Arial" w:cs="Arial"/>
+          <w:bCs/>
+          <w:i w:val="0"/>
+          <w:iCs w:val="0"/>
+          <w:color w:val="000000" w:themeColor="text1"/>
+          <w:sz w:val="28"/>
+          <w:szCs w:val="28"/>
+        </w:rPr>
+        <w:instrText xml:space="preserve"> SEQ Figure \* ARABIC </w:instrText>
+      </w:r>
+      <w:r>
+        <w:rPr>
+          <w:rFonts w:ascii="Arial" w:hAnsi="Arial" w:cs="Arial"/>
+          <w:bCs/>
+          <w:i w:val="0"/>
+          <w:iCs w:val="0"/>
+          <w:color w:val="000000" w:themeColor="text1"/>
+          <w:sz w:val="28"/>
+          <w:szCs w:val="28"/>
+        </w:rPr>
+        <w:fldChar w:fldCharType="separate"/>
+      </w:r>
+      <w:r>
+        <w:rPr>
+          <w:rFonts w:ascii="Arial" w:hAnsi="Arial" w:cs="Arial"/>
+          <w:bCs/>
+          <w:i w:val="0"/>
+          <w:iCs w:val="0"/>
+          <w:noProof/>
+          <w:color w:val="000000" w:themeColor="text1"/>
+          <w:sz w:val="28"/>
+          <w:szCs w:val="28"/>
+        </w:rPr>
+        <w:t>1</w:t>
+      </w:r>
+      <w:r>
+        <w:rPr>
+          <w:rFonts w:ascii="Arial" w:hAnsi="Arial" w:cs="Arial"/>
+          <w:bCs/>
+          <w:i w:val="0"/>
+          <w:iCs w:val="0"/>
+          <w:color w:val="000000" w:themeColor="text1"/>
+          <w:sz w:val="28"/>
+          <w:szCs w:val="28"/>
+        </w:rPr>
+        <w:fldChar w:fldCharType="end"/>
+      </w:r>
+      <w:r>
+        <w:rPr>
+          <w:bCs/>
+          <w:i w:val="0"/>
+          <w:iCs w:val="0"/>
+          <w:color w:val="000000" w:themeColor="text1"/>
+          <w:sz w:val="28"/>
+          <w:szCs w:val="28"/>
+        </w:rPr>
+        <w:t>:</w:t>
+      </w:r>
+      <w:r>
+        <w:rPr>
+          <w:i w:val="0"/>
+          <w:iCs w:val="0"/>
+          <w:color w:val="000000" w:themeColor="text1"/>
+          <w:sz w:val="28"/>
+          <w:szCs w:val="28"/>
+        </w:rPr>
+        <w:t xml:space="preserve"> Download Github desktop, </w:t>
+      </w:r>
+      <w:r>
+        <w:rPr>
+          <w:i w:val="0"/>
+          <w:iCs w:val="0"/>
+          <w:color w:val="000000" w:themeColor="text1"/>
+          <w:sz w:val="28"/>
+          <w:szCs w:val="28"/>
+        </w:rPr>
+        <w:t xml:space="preserve">Go to the link above, </w:t>
+      </w:r>
+      <w:r>
+        <w:rPr>
+          <w:i w:val="0"/>
+          <w:iCs w:val="0"/>
+          <w:color w:val="000000" w:themeColor="text1"/>
+          <w:sz w:val="28"/>
+          <w:szCs w:val="28"/>
+        </w:rPr>
+        <w:t>and click "open with github desktop". It will automatically download the class repository locally. You must check this every week, and see if I have pushed any changes.</w:t>
+      </w:r>
     </w:p>
     <w:p>
       <w:pPr>
@@ -2921,25 +2595,7 @@
           <w:sz w:val="24"/>
           <w:szCs w:val="24"/>
         </w:rPr>
-        <w:t xml:space="preserve">Demonstrate the ability to create programs in </w:t>
-      </w:r>
-      <w:proofErr w:type="spellStart"/>
-      <w:r>
-        <w:rPr>
-          <w:rFonts w:ascii="Arial" w:hAnsi="Arial" w:cs="Arial"/>
-          <w:sz w:val="24"/>
-          <w:szCs w:val="24"/>
-        </w:rPr>
-        <w:t>SuperCollider</w:t>
-      </w:r>
-      <w:proofErr w:type="spellEnd"/>
-      <w:r>
-        <w:rPr>
-          <w:rFonts w:ascii="Arial" w:hAnsi="Arial" w:cs="Arial"/>
-          <w:sz w:val="24"/>
-          <w:szCs w:val="24"/>
-        </w:rPr>
-        <w:t>, Python, Processing and C++ in the production of compositions an</w:t>
+        <w:t>Demonstrate the ability to create programs in SuperCollider, Python, Processing and C++ in the production of compositions an</w:t>
       </w:r>
       <w:r>
         <w:rPr>
@@ -2980,25 +2636,7 @@
           <w:sz w:val="24"/>
           <w:szCs w:val="24"/>
         </w:rPr>
-        <w:t xml:space="preserve">Understand the fundamentals of computer programming languages for music and be able to implement them to build original Audio Unit &amp; </w:t>
-      </w:r>
-      <w:proofErr w:type="spellStart"/>
-      <w:r>
-        <w:rPr>
-          <w:rFonts w:ascii="Arial" w:hAnsi="Arial" w:cs="Arial"/>
-          <w:sz w:val="24"/>
-          <w:szCs w:val="24"/>
-        </w:rPr>
-        <w:t>VSTplugins</w:t>
-      </w:r>
-      <w:proofErr w:type="spellEnd"/>
-      <w:r>
-        <w:rPr>
-          <w:rFonts w:ascii="Arial" w:hAnsi="Arial" w:cs="Arial"/>
-          <w:sz w:val="24"/>
-          <w:szCs w:val="24"/>
-        </w:rPr>
-        <w:t xml:space="preserve"> (Projects)</w:t>
+        <w:t>Understand the fundamentals of computer programming languages for music and be able to implement them to build original Audio Unit &amp; VSTplugins (Projects)</w:t>
       </w:r>
     </w:p>
     <w:p>
@@ -3702,18 +3340,8 @@
           <w:sz w:val="24"/>
           <w:szCs w:val="24"/>
         </w:rPr>
-        <w:t xml:space="preserve">catch </w:t>
-      </w:r>
-      <w:proofErr w:type="gramStart"/>
-      <w:r>
-        <w:rPr>
-          <w:color w:val="000000" w:themeColor="text1"/>
-          <w:sz w:val="24"/>
-          <w:szCs w:val="24"/>
-        </w:rPr>
-        <w:t>up!—</w:t>
-      </w:r>
-      <w:proofErr w:type="gramEnd"/>
+        <w:t>catch up!—</w:t>
+      </w:r>
       <w:r>
         <w:rPr>
           <w:color w:val="000000" w:themeColor="text1"/>
@@ -3870,25 +3498,7 @@
           <w:sz w:val="24"/>
           <w:szCs w:val="24"/>
         </w:rPr>
-        <w:t xml:space="preserve">, or an </w:t>
-      </w:r>
-      <w:proofErr w:type="spellStart"/>
-      <w:r>
-        <w:rPr>
-          <w:color w:val="000000" w:themeColor="text1"/>
-          <w:sz w:val="24"/>
-          <w:szCs w:val="24"/>
-        </w:rPr>
-        <w:t>instrumet</w:t>
-      </w:r>
-      <w:proofErr w:type="spellEnd"/>
-      <w:r>
-        <w:rPr>
-          <w:color w:val="000000" w:themeColor="text1"/>
-          <w:sz w:val="24"/>
-          <w:szCs w:val="24"/>
-        </w:rPr>
-        <w:t>,</w:t>
+        <w:t>, or an instrumet,</w:t>
       </w:r>
       <w:r>
         <w:rPr>
@@ -3985,25 +3595,7 @@
           <w:sz w:val="24"/>
           <w:szCs w:val="24"/>
         </w:rPr>
-        <w:t xml:space="preserve">It should be appropriately cited, referenced. You should not just link to </w:t>
-      </w:r>
-      <w:proofErr w:type="spellStart"/>
-      <w:r>
-        <w:rPr>
-          <w:color w:val="000000" w:themeColor="text1"/>
-          <w:sz w:val="24"/>
-          <w:szCs w:val="24"/>
-        </w:rPr>
-        <w:t>Youtube</w:t>
-      </w:r>
-      <w:proofErr w:type="spellEnd"/>
-      <w:r>
-        <w:rPr>
-          <w:color w:val="000000" w:themeColor="text1"/>
-          <w:sz w:val="24"/>
-          <w:szCs w:val="24"/>
-        </w:rPr>
-        <w:t xml:space="preserve"> videos and let the video do the talking.</w:t>
+        <w:t>It should be appropriately cited, referenced. You should not just link to Youtube videos and let the video do the talking.</w:t>
       </w:r>
     </w:p>
     <w:p>
@@ -4387,43 +3979,7 @@
           <w:sz w:val="24"/>
           <w:szCs w:val="24"/>
         </w:rPr>
-        <w:t xml:space="preserve">The use of Machine Learning tools such as ChatGPT and Claude are permitted, generally. In some </w:t>
-      </w:r>
-      <w:proofErr w:type="gramStart"/>
-      <w:r>
-        <w:rPr>
-          <w:rFonts w:ascii="Arial" w:hAnsi="Arial" w:cs="Arial"/>
-          <w:sz w:val="24"/>
-          <w:szCs w:val="24"/>
-        </w:rPr>
-        <w:t>cases</w:t>
-      </w:r>
-      <w:proofErr w:type="gramEnd"/>
-      <w:r>
-        <w:rPr>
-          <w:rFonts w:ascii="Arial" w:hAnsi="Arial" w:cs="Arial"/>
-          <w:sz w:val="24"/>
-          <w:szCs w:val="24"/>
-        </w:rPr>
-        <w:t xml:space="preserve"> we will explore them deliberately. In some </w:t>
-      </w:r>
-      <w:proofErr w:type="gramStart"/>
-      <w:r>
-        <w:rPr>
-          <w:rFonts w:ascii="Arial" w:hAnsi="Arial" w:cs="Arial"/>
-          <w:sz w:val="24"/>
-          <w:szCs w:val="24"/>
-        </w:rPr>
-        <w:t>instances</w:t>
-      </w:r>
-      <w:proofErr w:type="gramEnd"/>
-      <w:r>
-        <w:rPr>
-          <w:rFonts w:ascii="Arial" w:hAnsi="Arial" w:cs="Arial"/>
-          <w:sz w:val="24"/>
-          <w:szCs w:val="24"/>
-        </w:rPr>
-        <w:t xml:space="preserve"> you will be discouraged from using these tools. AI represents a sea change for humanity. It also represents a paradigm shift for pedagogy in digital literacy.  </w:t>
+        <w:t xml:space="preserve">The use of Machine Learning tools such as ChatGPT and Claude are permitted, generally. In some cases we will explore them deliberately. In some instances you will be discouraged from using these tools. AI represents a sea change for humanity. It also represents a paradigm shift for pedagogy in digital literacy.  </w:t>
       </w:r>
     </w:p>
     <w:p>
@@ -4688,27 +4244,7 @@
           <w:sz w:val="24"/>
           <w:szCs w:val="24"/>
         </w:rPr>
-        <w:t xml:space="preserve">As a faculty member, I am also required by our </w:t>
-      </w:r>
-      <w:proofErr w:type="gramStart"/>
-      <w:r>
-        <w:rPr>
-          <w:rFonts w:ascii="Arial" w:hAnsi="Arial" w:cs="Arial"/>
-          <w:color w:val="141414"/>
-          <w:sz w:val="24"/>
-          <w:szCs w:val="24"/>
-        </w:rPr>
-        <w:t>College</w:t>
-      </w:r>
-      <w:proofErr w:type="gramEnd"/>
-      <w:r>
-        <w:rPr>
-          <w:rFonts w:ascii="Arial" w:hAnsi="Arial" w:cs="Arial"/>
-          <w:color w:val="141414"/>
-          <w:sz w:val="24"/>
-          <w:szCs w:val="24"/>
-        </w:rPr>
-        <w:t xml:space="preserve"> to report incidents of sexual misconduct and thus cannot guarantee confidentiality, but I will respect your privacy and only share the information with those who have a duty to respond. Should I become aware of an incident involving sexual misconduct, I must provide our Title IX Coordinator with relevant details such as the names of those involved in the incident. </w:t>
+        <w:t xml:space="preserve">As a faculty member, I am also required by our College to report incidents of sexual misconduct and thus cannot guarantee confidentiality, but I will respect your privacy and only share the information with those who have a duty to respond. Should I become aware of an incident involving sexual misconduct, I must provide our Title IX Coordinator with relevant details such as the names of those involved in the incident. </w:t>
       </w:r>
     </w:p>
     <w:p>
@@ -4801,7 +4337,16 @@
           <w:sz w:val="24"/>
           <w:szCs w:val="24"/>
         </w:rPr>
-        <w:t>8/27</w:t>
+        <w:t>8/2</w:t>
+      </w:r>
+      <w:r>
+        <w:rPr>
+          <w:i/>
+          <w:color w:val="000000" w:themeColor="text1"/>
+          <w:sz w:val="24"/>
+          <w:szCs w:val="24"/>
+        </w:rPr>
+        <w:t>6</w:t>
       </w:r>
     </w:p>
     <w:p>
@@ -4890,25 +4435,7 @@
           <w:b/>
           <w:bCs/>
         </w:rPr>
-        <w:t xml:space="preserve">Introduction to the </w:t>
-      </w:r>
-      <w:proofErr w:type="spellStart"/>
-      <w:r>
-        <w:rPr>
-          <w:rFonts w:ascii="Arial" w:hAnsi="Arial" w:cs="Arial"/>
-          <w:b/>
-          <w:bCs/>
-        </w:rPr>
-        <w:t>SuperCollider</w:t>
-      </w:r>
-      <w:proofErr w:type="spellEnd"/>
-      <w:r>
-        <w:rPr>
-          <w:rFonts w:ascii="Arial" w:hAnsi="Arial" w:cs="Arial"/>
-          <w:b/>
-          <w:bCs/>
-        </w:rPr>
-        <w:t xml:space="preserve"> 3 </w:t>
+        <w:t xml:space="preserve">Introduction to the SuperCollider 3 </w:t>
       </w:r>
       <w:r>
         <w:rPr>
@@ -4993,7 +4520,7 @@
           <w:szCs w:val="24"/>
         </w:rPr>
       </w:pPr>
-      <w:hyperlink r:id="rId21" w:history="1">
+      <w:hyperlink r:id="rId18" w:history="1">
         <w:r>
           <w:rPr>
             <w:rStyle w:val="Hyperlink"/>
@@ -5058,7 +4585,7 @@
           <w:szCs w:val="24"/>
         </w:rPr>
       </w:pPr>
-      <w:hyperlink r:id="rId22" w:history="1">
+      <w:hyperlink r:id="rId19" w:history="1">
         <w:r>
           <w:rPr>
             <w:rStyle w:val="Hyperlink"/>
@@ -5225,7 +4752,7 @@
         </w:rPr>
         <w:t xml:space="preserve"> Go to </w:t>
       </w:r>
-      <w:hyperlink r:id="rId23" w:history="1">
+      <w:hyperlink r:id="rId20" w:history="1">
         <w:r>
           <w:rPr>
             <w:rStyle w:val="Hyperlink"/>
@@ -5328,7 +4855,6 @@
         </w:rPr>
         <w:t xml:space="preserve">ubmit it on </w:t>
       </w:r>
-      <w:proofErr w:type="spellStart"/>
       <w:r>
         <w:rPr>
           <w:rFonts w:ascii="Arial" w:hAnsi="Arial" w:cs="Arial"/>
@@ -5337,7 +4863,6 @@
         </w:rPr>
         <w:t>github</w:t>
       </w:r>
-      <w:proofErr w:type="spellEnd"/>
       <w:r>
         <w:rPr>
           <w:rFonts w:ascii="Arial" w:hAnsi="Arial" w:cs="Arial"/>
@@ -5402,45 +4927,9 @@
           <w:sz w:val="24"/>
           <w:szCs w:val="24"/>
         </w:rPr>
-        <w:t xml:space="preserve">Live Coding in </w:t>
-      </w:r>
-      <w:proofErr w:type="spellStart"/>
-      <w:r>
-        <w:rPr>
-          <w:color w:val="000000" w:themeColor="text1"/>
-          <w:sz w:val="24"/>
-          <w:szCs w:val="24"/>
-        </w:rPr>
-        <w:t>SuperCollider</w:t>
-      </w:r>
-      <w:proofErr w:type="spellEnd"/>
-      <w:r>
-        <w:rPr>
-          <w:color w:val="000000" w:themeColor="text1"/>
-          <w:sz w:val="24"/>
-          <w:szCs w:val="24"/>
-        </w:rPr>
-        <w:t xml:space="preserve">: a Tutorial with Eli </w:t>
-      </w:r>
-      <w:proofErr w:type="spellStart"/>
-      <w:r>
-        <w:rPr>
-          <w:color w:val="000000" w:themeColor="text1"/>
-          <w:sz w:val="24"/>
-          <w:szCs w:val="24"/>
-        </w:rPr>
-        <w:t>Fieldsteel</w:t>
-      </w:r>
-      <w:proofErr w:type="spellEnd"/>
-      <w:r>
-        <w:rPr>
-          <w:color w:val="000000" w:themeColor="text1"/>
-          <w:sz w:val="24"/>
-          <w:szCs w:val="24"/>
-        </w:rPr>
-        <w:t xml:space="preserve"> </w:t>
-      </w:r>
-      <w:hyperlink r:id="rId24" w:history="1">
+        <w:t xml:space="preserve">Live Coding in SuperCollider: a Tutorial with Eli Fieldsteel </w:t>
+      </w:r>
+      <w:hyperlink r:id="rId21" w:history="1">
         <w:r>
           <w:rPr>
             <w:rStyle w:val="Hyperlink"/>
@@ -5460,7 +4949,7 @@
           <w:szCs w:val="24"/>
         </w:rPr>
       </w:pPr>
-      <w:hyperlink r:id="rId25" w:history="1">
+      <w:hyperlink r:id="rId22" w:history="1">
         <w:r>
           <w:rPr>
             <w:rStyle w:val="Hyperlink"/>
@@ -5552,7 +5041,7 @@
           <w:sz w:val="24"/>
           <w:szCs w:val="24"/>
         </w:rPr>
-        <w:t>3</w:t>
+        <w:t>2</w:t>
       </w:r>
     </w:p>
     <w:p>
@@ -5615,65 +5104,34 @@
         </w:rPr>
         <w:t xml:space="preserve">Learning </w:t>
       </w:r>
-      <w:proofErr w:type="spellStart"/>
-      <w:r>
-        <w:rPr>
-          <w:iCs/>
-          <w:color w:val="000000" w:themeColor="text1"/>
-          <w:sz w:val="24"/>
-          <w:szCs w:val="24"/>
-        </w:rPr>
-        <w:t>NodeProxy</w:t>
-      </w:r>
-      <w:proofErr w:type="spellEnd"/>
-      <w:r>
-        <w:rPr>
-          <w:iCs/>
-          <w:color w:val="000000" w:themeColor="text1"/>
-          <w:sz w:val="24"/>
-          <w:szCs w:val="24"/>
-        </w:rPr>
-        <w:t>—The simplest and most direct way to recycle and utilize code in instruments, live, in Supercollider.</w:t>
-      </w:r>
-    </w:p>
-    <w:p>
-      <w:pPr>
-        <w:pStyle w:val="Normal1"/>
-        <w:rPr>
-          <w:iCs/>
-          <w:color w:val="000000" w:themeColor="text1"/>
-          <w:sz w:val="24"/>
-          <w:szCs w:val="24"/>
-        </w:rPr>
-      </w:pPr>
-      <w:r>
-        <w:rPr>
-          <w:iCs/>
-          <w:color w:val="000000" w:themeColor="text1"/>
-          <w:sz w:val="24"/>
-          <w:szCs w:val="24"/>
-        </w:rPr>
-        <w:t xml:space="preserve">Learning </w:t>
-      </w:r>
-      <w:proofErr w:type="spellStart"/>
-      <w:r>
-        <w:rPr>
-          <w:iCs/>
-          <w:color w:val="000000" w:themeColor="text1"/>
-          <w:sz w:val="24"/>
-          <w:szCs w:val="24"/>
-        </w:rPr>
-        <w:t>Synthdef</w:t>
-      </w:r>
-      <w:proofErr w:type="spellEnd"/>
-      <w:r>
-        <w:rPr>
-          <w:iCs/>
-          <w:color w:val="000000" w:themeColor="text1"/>
-          <w:sz w:val="24"/>
-          <w:szCs w:val="24"/>
-        </w:rPr>
-        <w:t>—the standard way to program synths for global programming concepts in SC</w:t>
+      <w:r>
+        <w:rPr>
+          <w:iCs/>
+          <w:color w:val="000000" w:themeColor="text1"/>
+          <w:sz w:val="24"/>
+          <w:szCs w:val="24"/>
+        </w:rPr>
+        <w:t>NodeProxy—The simplest and most direct way to recycle and utilize code in instruments, live, in Supercollider.</w:t>
+      </w:r>
+    </w:p>
+    <w:p>
+      <w:pPr>
+        <w:pStyle w:val="Normal1"/>
+        <w:rPr>
+          <w:iCs/>
+          <w:color w:val="000000" w:themeColor="text1"/>
+          <w:sz w:val="24"/>
+          <w:szCs w:val="24"/>
+        </w:rPr>
+      </w:pPr>
+      <w:r>
+        <w:rPr>
+          <w:iCs/>
+          <w:color w:val="000000" w:themeColor="text1"/>
+          <w:sz w:val="24"/>
+          <w:szCs w:val="24"/>
+        </w:rPr>
+        <w:t>Learning Synthdef—the standard way to program synths for global programming concepts in SC</w:t>
       </w:r>
     </w:p>
     <w:p>
@@ -5770,39 +5228,17 @@
           <w:sz w:val="24"/>
           <w:szCs w:val="24"/>
         </w:rPr>
-        <w:t xml:space="preserve">Prepare 3 synthesis tools in Supercollider that work with </w:t>
-      </w:r>
-      <w:proofErr w:type="spellStart"/>
-      <w:r>
-        <w:rPr>
-          <w:iCs/>
-          <w:color w:val="000000" w:themeColor="text1"/>
-          <w:sz w:val="24"/>
-          <w:szCs w:val="24"/>
-        </w:rPr>
-        <w:t>NodeProxy</w:t>
-      </w:r>
-      <w:proofErr w:type="spellEnd"/>
-      <w:r>
-        <w:rPr>
-          <w:iCs/>
-          <w:color w:val="000000" w:themeColor="text1"/>
-          <w:sz w:val="24"/>
-          <w:szCs w:val="24"/>
-        </w:rPr>
-        <w:t xml:space="preserve"> OR </w:t>
-      </w:r>
-      <w:proofErr w:type="spellStart"/>
-      <w:r>
-        <w:rPr>
-          <w:iCs/>
-          <w:color w:val="000000" w:themeColor="text1"/>
-          <w:sz w:val="24"/>
-          <w:szCs w:val="24"/>
-        </w:rPr>
-        <w:t>synthdef</w:t>
-      </w:r>
-      <w:proofErr w:type="spellEnd"/>
+        <w:t>Prepare 3 synthesis tools in Supercollider that work with NodeProxy</w:t>
+      </w:r>
+      <w:r>
+        <w:rPr>
+          <w:iCs/>
+          <w:color w:val="000000" w:themeColor="text1"/>
+          <w:sz w:val="24"/>
+          <w:szCs w:val="24"/>
+        </w:rPr>
+        <w:t xml:space="preserve"> OR synthdef</w:t>
+      </w:r>
       <w:r>
         <w:rPr>
           <w:iCs/>
@@ -5846,19 +5282,8 @@
           <w:sz w:val="24"/>
           <w:szCs w:val="24"/>
         </w:rPr>
-        <w:t xml:space="preserve"> </w:t>
-      </w:r>
-      <w:proofErr w:type="spellStart"/>
-      <w:r>
-        <w:rPr>
-          <w:iCs/>
-          <w:color w:val="000000" w:themeColor="text1"/>
-          <w:sz w:val="24"/>
-          <w:szCs w:val="24"/>
-        </w:rPr>
-        <w:t>gui</w:t>
-      </w:r>
-      <w:proofErr w:type="spellEnd"/>
+        <w:t xml:space="preserve"> gui</w:t>
+      </w:r>
       <w:r>
         <w:rPr>
           <w:iCs/>
@@ -6014,16 +5439,7 @@
           <w:sz w:val="24"/>
           <w:szCs w:val="24"/>
         </w:rPr>
-        <w:t>1</w:t>
-      </w:r>
-      <w:r>
-        <w:rPr>
-          <w:i/>
-          <w:color w:val="000000" w:themeColor="text1"/>
-          <w:sz w:val="24"/>
-          <w:szCs w:val="24"/>
-        </w:rPr>
-        <w:t>0</w:t>
+        <w:t>9</w:t>
       </w:r>
     </w:p>
     <w:p>
@@ -6098,21 +5514,8 @@
           <w:sz w:val="24"/>
           <w:szCs w:val="24"/>
         </w:rPr>
-        <w:t xml:space="preserve">Introduction to Max </w:t>
-      </w:r>
-      <w:proofErr w:type="spellStart"/>
-      <w:r>
-        <w:rPr>
-          <w:b/>
-          <w:bCs/>
-          <w:iCs/>
-          <w:color w:val="000000" w:themeColor="text1"/>
-          <w:sz w:val="24"/>
-          <w:szCs w:val="24"/>
-        </w:rPr>
-        <w:t>Msp</w:t>
-      </w:r>
-      <w:proofErr w:type="spellEnd"/>
+        <w:t>Introduction to Max Msp</w:t>
+      </w:r>
     </w:p>
     <w:p>
       <w:pPr>
@@ -6222,7 +5625,7 @@
                     </pic:cNvPicPr>
                   </pic:nvPicPr>
                   <pic:blipFill>
-                    <a:blip r:embed="rId26">
+                    <a:blip r:embed="rId23">
                       <a:extLst>
                         <a:ext uri="{28A0092B-C50C-407E-A947-70E740481C1C}">
                           <a14:useLocalDpi xmlns:a14="http://schemas.microsoft.com/office/drawing/2010/main" val="0"/>
@@ -6276,23 +5679,7 @@
           <w:sz w:val="24"/>
           <w:szCs w:val="24"/>
         </w:rPr>
-        <w:t xml:space="preserve">David Behrman is a composer and artist active since the 1960s. Over the years he has made sound and multimedia installations for gallery spaces as well as musical compositions for performance in concerts. Most of his pieces feature flexible structures and the use of technology in personal ways; compositions rely on interactive real-time relationships with imaginative performers. Together with Robert Ashley, Alvin Lucier and Gordon Mumma, Behrman founded the Sonic Arts Union in 1966. He had a long association with the Merce Cunningham Dance Company as composer and performer, created music for several of the Company’s repertory pieces, and was a member of the Company’s Music Committee during its last years. He was a fellow at the American Academy in Berlin in 2016. Audio recordings of his works are on the XI, Lovely Music, Pogus, New World, WERGO, Black Truffle Records and Alga </w:t>
-      </w:r>
-      <w:proofErr w:type="spellStart"/>
-      <w:r>
-        <w:rPr>
-          <w:sz w:val="24"/>
-          <w:szCs w:val="24"/>
-        </w:rPr>
-        <w:t>Marghen</w:t>
-      </w:r>
-      <w:proofErr w:type="spellEnd"/>
-      <w:r>
-        <w:rPr>
-          <w:sz w:val="24"/>
-          <w:szCs w:val="24"/>
-        </w:rPr>
-        <w:t xml:space="preserve"> labels. </w:t>
+        <w:t xml:space="preserve">David Behrman is a composer and artist active since the 1960s. Over the years he has made sound and multimedia installations for gallery spaces as well as musical compositions for performance in concerts. Most of his pieces feature flexible structures and the use of technology in personal ways; compositions rely on interactive real-time relationships with imaginative performers. Together with Robert Ashley, Alvin Lucier and Gordon Mumma, Behrman founded the Sonic Arts Union in 1966. He had a long association with the Merce Cunningham Dance Company as composer and performer, created music for several of the Company’s repertory pieces, and was a member of the Company’s Music Committee during its last years. He was a fellow at the American Academy in Berlin in 2016. Audio recordings of his works are on the XI, Lovely Music, Pogus, New World, WERGO, Black Truffle Records and Alga Marghen labels. </w:t>
       </w:r>
       <w:r>
         <w:rPr>
@@ -6369,27 +5756,7 @@
           <w:sz w:val="24"/>
           <w:szCs w:val="24"/>
         </w:rPr>
-        <w:t xml:space="preserve">and </w:t>
-      </w:r>
-      <w:proofErr w:type="spellStart"/>
-      <w:r>
-        <w:rPr>
-          <w:iCs/>
-          <w:color w:val="000000" w:themeColor="text1"/>
-          <w:sz w:val="24"/>
-          <w:szCs w:val="24"/>
-        </w:rPr>
-        <w:t>Leapday</w:t>
-      </w:r>
-      <w:proofErr w:type="spellEnd"/>
-      <w:r>
-        <w:rPr>
-          <w:iCs/>
-          <w:color w:val="000000" w:themeColor="text1"/>
-          <w:sz w:val="24"/>
-          <w:szCs w:val="24"/>
-        </w:rPr>
-        <w:t xml:space="preserve"> Night</w:t>
+        <w:t>and Leapday Night</w:t>
       </w:r>
     </w:p>
     <w:p>
@@ -6598,7 +5965,7 @@
           <w:sz w:val="24"/>
           <w:szCs w:val="24"/>
         </w:rPr>
-        <w:t>7</w:t>
+        <w:t>6</w:t>
       </w:r>
     </w:p>
     <w:p>
@@ -6921,29 +6288,7 @@
           <w:sz w:val="24"/>
           <w:szCs w:val="24"/>
         </w:rPr>
-        <w:t xml:space="preserve">No HW, but if you’re behind schedule office hours. Or write an </w:t>
-      </w:r>
-      <w:proofErr w:type="spellStart"/>
-      <w:r>
-        <w:rPr>
-          <w:rFonts w:ascii="Arial" w:hAnsi="Arial" w:cs="Arial"/>
-          <w:iCs/>
-          <w:color w:val="000000" w:themeColor="text1"/>
-          <w:sz w:val="24"/>
-          <w:szCs w:val="24"/>
-        </w:rPr>
-        <w:t>NodeProxy</w:t>
-      </w:r>
-      <w:proofErr w:type="spellEnd"/>
-      <w:r>
-        <w:rPr>
-          <w:rFonts w:ascii="Arial" w:hAnsi="Arial" w:cs="Arial"/>
-          <w:iCs/>
-          <w:color w:val="000000" w:themeColor="text1"/>
-          <w:sz w:val="24"/>
-          <w:szCs w:val="24"/>
-        </w:rPr>
-        <w:t xml:space="preserve"> instrument from Floating Point Errors or Crows with arguments that can be controlled.</w:t>
+        <w:t>No HW, but if you’re behind schedule office hours. Or write an NodeProxy instrument from Floating Point Errors or Crows with arguments that can be controlled.</w:t>
       </w:r>
     </w:p>
     <w:p>
@@ -6994,7 +6339,16 @@
           <w:sz w:val="24"/>
           <w:szCs w:val="24"/>
         </w:rPr>
-        <w:t>9/24</w:t>
+        <w:t>9/2</w:t>
+      </w:r>
+      <w:r>
+        <w:rPr>
+          <w:i/>
+          <w:color w:val="000000" w:themeColor="text1"/>
+          <w:sz w:val="24"/>
+          <w:szCs w:val="24"/>
+        </w:rPr>
+        <w:t>3</w:t>
       </w:r>
     </w:p>
     <w:p>
@@ -7009,282 +6363,6 @@
           <w:szCs w:val="24"/>
         </w:rPr>
       </w:pPr>
-    </w:p>
-    <w:p>
-      <w:pPr>
-        <w:pStyle w:val="Normal1"/>
-        <w:rPr>
-          <w:iCs/>
-          <w:color w:val="000000" w:themeColor="text1"/>
-          <w:sz w:val="24"/>
-          <w:szCs w:val="24"/>
-        </w:rPr>
-      </w:pPr>
-      <w:r>
-        <w:rPr>
-          <w:iCs/>
-          <w:color w:val="000000" w:themeColor="text1"/>
-          <w:sz w:val="24"/>
-          <w:szCs w:val="24"/>
-        </w:rPr>
-        <w:t xml:space="preserve">Field Trip to NYC for David </w:t>
-      </w:r>
-      <w:r>
-        <w:rPr>
-          <w:iCs/>
-          <w:color w:val="000000" w:themeColor="text1"/>
-          <w:sz w:val="24"/>
-          <w:szCs w:val="24"/>
-        </w:rPr>
-        <w:t>Behrman’s Concert</w:t>
-      </w:r>
-    </w:p>
-    <w:p>
-      <w:pPr>
-        <w:pStyle w:val="Normal1"/>
-        <w:spacing w:line="240" w:lineRule="auto"/>
-        <w:rPr>
-          <w:bCs/>
-          <w:color w:val="000000" w:themeColor="text1"/>
-          <w:sz w:val="24"/>
-          <w:szCs w:val="24"/>
-        </w:rPr>
-      </w:pPr>
-      <w:r>
-        <w:rPr>
-          <w:bCs/>
-          <w:color w:val="000000" w:themeColor="text1"/>
-          <w:sz w:val="24"/>
-          <w:szCs w:val="24"/>
-        </w:rPr>
-        <w:t>Issue Project Room</w:t>
-      </w:r>
-    </w:p>
-    <w:p>
-      <w:pPr>
-        <w:pStyle w:val="Normal1"/>
-        <w:rPr>
-          <w:iCs/>
-          <w:color w:val="000000" w:themeColor="text1"/>
-          <w:sz w:val="24"/>
-          <w:szCs w:val="24"/>
-        </w:rPr>
-      </w:pPr>
-    </w:p>
-    <w:p>
-      <w:pPr>
-        <w:pStyle w:val="Normal1"/>
-        <w:rPr>
-          <w:iCs/>
-          <w:color w:val="000000" w:themeColor="text1"/>
-          <w:sz w:val="24"/>
-          <w:szCs w:val="24"/>
-        </w:rPr>
-      </w:pPr>
-      <w:hyperlink r:id="rId27" w:history="1">
-        <w:r>
-          <w:rPr>
-            <w:rStyle w:val="Hyperlink"/>
-            <w:iCs/>
-            <w:sz w:val="24"/>
-            <w:szCs w:val="24"/>
-          </w:rPr>
-          <w:t>https://issueprojectroom.org/event/open-space-fast-david-behrman-fast-forward</w:t>
-        </w:r>
-      </w:hyperlink>
-    </w:p>
-    <w:p>
-      <w:pPr>
-        <w:pStyle w:val="Normal1"/>
-        <w:rPr>
-          <w:iCs/>
-          <w:color w:val="000000" w:themeColor="text1"/>
-          <w:sz w:val="24"/>
-          <w:szCs w:val="24"/>
-        </w:rPr>
-      </w:pPr>
-      <w:r>
-        <w:rPr>
-          <w:rStyle w:val="Strong"/>
-          <w:sz w:val="24"/>
-          <w:szCs w:val="24"/>
-        </w:rPr>
-        <w:t>Wednesday, September 24th at 8pm</w:t>
-      </w:r>
-      <w:r>
-        <w:rPr>
-          <w:sz w:val="24"/>
-          <w:szCs w:val="24"/>
-        </w:rPr>
-        <w:t xml:space="preserve">, as part of Celebrating David Behrman—a Fall series honoring the groundbreaking composer and 2025 ISSUE Gala honoree—ISSUE Project Room presents an evening of performances that illuminate Behrman’s enduring legacy of collaboration, technological innovation, and influence across generations of experimental music. The program features two works: </w:t>
-      </w:r>
-      <w:proofErr w:type="spellStart"/>
-      <w:r>
-        <w:rPr>
-          <w:rStyle w:val="Emphasis"/>
-          <w:sz w:val="24"/>
-          <w:szCs w:val="24"/>
-        </w:rPr>
-        <w:t>Runthrough</w:t>
-      </w:r>
-      <w:proofErr w:type="spellEnd"/>
-      <w:r>
-        <w:rPr>
-          <w:sz w:val="24"/>
-          <w:szCs w:val="24"/>
-        </w:rPr>
-        <w:t xml:space="preserve"> (1967–), originally developed with the Sonic Arts Union and performed on this occasion by friends of ISSUE, </w:t>
-      </w:r>
-      <w:r>
-        <w:rPr>
-          <w:rStyle w:val="Strong"/>
-          <w:sz w:val="24"/>
-          <w:szCs w:val="24"/>
-        </w:rPr>
-        <w:t>Frankie Mann</w:t>
-      </w:r>
-      <w:r>
-        <w:rPr>
-          <w:sz w:val="24"/>
-          <w:szCs w:val="24"/>
-        </w:rPr>
-        <w:t xml:space="preserve"> with </w:t>
-      </w:r>
-      <w:r>
-        <w:rPr>
-          <w:rStyle w:val="Strong"/>
-          <w:sz w:val="24"/>
-          <w:szCs w:val="24"/>
-        </w:rPr>
-        <w:t>Daniel Fishkin</w:t>
-      </w:r>
-      <w:r>
-        <w:rPr>
-          <w:sz w:val="24"/>
-          <w:szCs w:val="24"/>
-        </w:rPr>
-        <w:t xml:space="preserve"> &amp; </w:t>
-      </w:r>
-      <w:r>
-        <w:rPr>
-          <w:rStyle w:val="Strong"/>
-          <w:sz w:val="24"/>
-          <w:szCs w:val="24"/>
-        </w:rPr>
-        <w:t>Cleek Schrey</w:t>
-      </w:r>
-      <w:r>
-        <w:rPr>
-          <w:sz w:val="24"/>
-          <w:szCs w:val="24"/>
-        </w:rPr>
-        <w:t xml:space="preserve">; and </w:t>
-      </w:r>
-      <w:r>
-        <w:rPr>
-          <w:rStyle w:val="Emphasis"/>
-          <w:sz w:val="24"/>
-          <w:szCs w:val="24"/>
-        </w:rPr>
-        <w:t>Open Space with Fast</w:t>
-      </w:r>
-      <w:r>
-        <w:rPr>
-          <w:sz w:val="24"/>
-          <w:szCs w:val="24"/>
-        </w:rPr>
-        <w:t xml:space="preserve"> (2020–), a richly textural collaboration between </w:t>
-      </w:r>
-      <w:r>
-        <w:rPr>
-          <w:rStyle w:val="Strong"/>
-          <w:sz w:val="24"/>
-          <w:szCs w:val="24"/>
-        </w:rPr>
-        <w:t>David Behrman</w:t>
-      </w:r>
-      <w:r>
-        <w:rPr>
-          <w:sz w:val="24"/>
-          <w:szCs w:val="24"/>
-        </w:rPr>
-        <w:t xml:space="preserve"> and artistic partner </w:t>
-      </w:r>
-      <w:r>
-        <w:rPr>
-          <w:rStyle w:val="Strong"/>
-          <w:sz w:val="24"/>
-          <w:szCs w:val="24"/>
-        </w:rPr>
-        <w:t>Fast Forward</w:t>
-      </w:r>
-      <w:r>
-        <w:rPr>
-          <w:sz w:val="24"/>
-          <w:szCs w:val="24"/>
-        </w:rPr>
-        <w:t>.</w:t>
-      </w:r>
-    </w:p>
-    <w:p>
-      <w:pPr>
-        <w:pStyle w:val="Normal1"/>
-        <w:rPr>
-          <w:iCs/>
-          <w:color w:val="000000" w:themeColor="text1"/>
-          <w:sz w:val="24"/>
-          <w:szCs w:val="24"/>
-        </w:rPr>
-      </w:pPr>
-    </w:p>
-    <w:p>
-      <w:pPr>
-        <w:pStyle w:val="Normal1"/>
-        <w:rPr>
-          <w:iCs/>
-          <w:color w:val="000000" w:themeColor="text1"/>
-          <w:sz w:val="24"/>
-          <w:szCs w:val="24"/>
-        </w:rPr>
-      </w:pPr>
-      <w:r>
-        <w:rPr>
-          <w:iCs/>
-          <w:color w:val="000000" w:themeColor="text1"/>
-          <w:sz w:val="24"/>
-          <w:szCs w:val="24"/>
-        </w:rPr>
-        <w:t>Etude 5</w:t>
-      </w:r>
-      <w:r>
-        <w:rPr>
-          <w:iCs/>
-          <w:color w:val="000000" w:themeColor="text1"/>
-          <w:sz w:val="24"/>
-          <w:szCs w:val="24"/>
-        </w:rPr>
-        <w:t>:</w:t>
-      </w:r>
-    </w:p>
-    <w:p>
-      <w:pPr>
-        <w:pStyle w:val="Normal1"/>
-        <w:rPr>
-          <w:iCs/>
-          <w:color w:val="000000" w:themeColor="text1"/>
-          <w:sz w:val="24"/>
-          <w:szCs w:val="24"/>
-        </w:rPr>
-      </w:pPr>
-      <w:r>
-        <w:rPr>
-          <w:iCs/>
-          <w:color w:val="000000" w:themeColor="text1"/>
-          <w:sz w:val="24"/>
-          <w:szCs w:val="24"/>
-        </w:rPr>
-        <w:t>Write 1 page concert report.</w:t>
-      </w:r>
     </w:p>
     <w:p>
       <w:pPr>
@@ -7338,41 +6416,40 @@
           <w:sz w:val="24"/>
           <w:szCs w:val="24"/>
         </w:rPr>
-        <w:lastRenderedPageBreak/>
-        <w:t>Class 6 Wednesday 10/</w:t>
-      </w:r>
-      <w:r>
-        <w:rPr>
-          <w:i/>
-          <w:color w:val="000000" w:themeColor="text1"/>
-          <w:sz w:val="24"/>
-          <w:szCs w:val="24"/>
-        </w:rPr>
-        <w:t>1</w:t>
-      </w:r>
-    </w:p>
-    <w:p>
-      <w:pPr>
-        <w:pStyle w:val="Normal1"/>
-        <w:rPr>
-          <w:i/>
-          <w:color w:val="000000" w:themeColor="text1"/>
-          <w:sz w:val="24"/>
-          <w:szCs w:val="24"/>
-        </w:rPr>
-      </w:pPr>
-    </w:p>
-    <w:p>
-      <w:pPr>
-        <w:pStyle w:val="Normal1"/>
-        <w:rPr>
-          <w:iCs/>
-          <w:color w:val="000000" w:themeColor="text1"/>
-          <w:sz w:val="24"/>
-          <w:szCs w:val="24"/>
-        </w:rPr>
-      </w:pPr>
-      <w:hyperlink r:id="rId28" w:anchor="4AAAA+kUzNNDSKLGzM68pqQFSZpraJkC+GpBpaAwRAAA" w:history="1">
+        <w:t xml:space="preserve">Class 6 Wednesday </w:t>
+      </w:r>
+      <w:r>
+        <w:rPr>
+          <w:i/>
+          <w:color w:val="000000" w:themeColor="text1"/>
+          <w:sz w:val="24"/>
+          <w:szCs w:val="24"/>
+        </w:rPr>
+        <w:t>9/30</w:t>
+      </w:r>
+    </w:p>
+    <w:p>
+      <w:pPr>
+        <w:pStyle w:val="Normal1"/>
+        <w:rPr>
+          <w:i/>
+          <w:color w:val="000000" w:themeColor="text1"/>
+          <w:sz w:val="24"/>
+          <w:szCs w:val="24"/>
+        </w:rPr>
+      </w:pPr>
+    </w:p>
+    <w:p>
+      <w:pPr>
+        <w:pStyle w:val="Normal1"/>
+        <w:rPr>
+          <w:iCs/>
+          <w:color w:val="000000" w:themeColor="text1"/>
+          <w:sz w:val="24"/>
+          <w:szCs w:val="24"/>
+        </w:rPr>
+      </w:pPr>
+      <w:hyperlink r:id="rId24" w:anchor="4AAAA+kUzNNDSKLGzM68pqQFSZpraJkC+GpBpaAwRAAA" w:history="1">
         <w:r>
           <w:rPr>
             <w:rStyle w:val="Hyperlink"/>
@@ -7394,25 +6471,14 @@
           <w:szCs w:val="24"/>
         </w:rPr>
       </w:pPr>
-      <w:proofErr w:type="spellStart"/>
-      <w:r>
-        <w:rPr>
-          <w:iCs/>
-          <w:color w:val="000000" w:themeColor="text1"/>
-          <w:sz w:val="24"/>
-          <w:szCs w:val="24"/>
-        </w:rPr>
-        <w:t>bytebeat</w:t>
-      </w:r>
-      <w:proofErr w:type="spellEnd"/>
-      <w:r>
-        <w:rPr>
-          <w:iCs/>
-          <w:color w:val="000000" w:themeColor="text1"/>
-          <w:sz w:val="24"/>
-          <w:szCs w:val="24"/>
-        </w:rPr>
-        <w:t xml:space="preserve"> composer</w:t>
+      <w:r>
+        <w:rPr>
+          <w:iCs/>
+          <w:color w:val="000000" w:themeColor="text1"/>
+          <w:sz w:val="24"/>
+          <w:szCs w:val="24"/>
+        </w:rPr>
+        <w:t>bytebeat composer</w:t>
       </w:r>
     </w:p>
     <w:p>
@@ -7489,42 +6555,20 @@
           <w:szCs w:val="24"/>
           <w:u w:val="single"/>
         </w:rPr>
-        <w:t xml:space="preserve">Transcribe these measures into supercollider code for </w:t>
-      </w:r>
-      <w:proofErr w:type="gramStart"/>
-      <w:r>
-        <w:rPr>
-          <w:iCs/>
-          <w:color w:val="000000" w:themeColor="text1"/>
-          <w:sz w:val="24"/>
-          <w:szCs w:val="24"/>
-          <w:u w:val="single"/>
-        </w:rPr>
-        <w:t>In</w:t>
-      </w:r>
-      <w:proofErr w:type="gramEnd"/>
-      <w:r>
-        <w:rPr>
-          <w:iCs/>
-          <w:color w:val="000000" w:themeColor="text1"/>
-          <w:sz w:val="24"/>
-          <w:szCs w:val="24"/>
-          <w:u w:val="single"/>
-        </w:rPr>
-        <w:t xml:space="preserve"> C, make sure you follow the exact format.</w:t>
-      </w:r>
-    </w:p>
-    <w:p>
-      <w:pPr>
-        <w:pStyle w:val="Normal1"/>
-        <w:rPr>
-          <w:iCs/>
-          <w:color w:val="000000" w:themeColor="text1"/>
-          <w:sz w:val="24"/>
-          <w:szCs w:val="24"/>
-        </w:rPr>
-      </w:pPr>
-      <w:hyperlink r:id="rId29" w:history="1">
+        <w:t>Transcribe these measures into supercollider code for In C, make sure you follow the exact format.</w:t>
+      </w:r>
+    </w:p>
+    <w:p>
+      <w:pPr>
+        <w:pStyle w:val="Normal1"/>
+        <w:rPr>
+          <w:iCs/>
+          <w:color w:val="000000" w:themeColor="text1"/>
+          <w:sz w:val="24"/>
+          <w:szCs w:val="24"/>
+        </w:rPr>
+      </w:pPr>
+      <w:hyperlink r:id="rId25" w:history="1">
         <w:r>
           <w:rPr>
             <w:rStyle w:val="Hyperlink"/>
@@ -7532,25 +6576,7 @@
             <w:sz w:val="24"/>
             <w:szCs w:val="24"/>
           </w:rPr>
-          <w:t>https://teropa.in</w:t>
-        </w:r>
-        <w:r>
-          <w:rPr>
-            <w:rStyle w:val="Hyperlink"/>
-            <w:iCs/>
-            <w:sz w:val="24"/>
-            <w:szCs w:val="24"/>
-          </w:rPr>
-          <w:t>f</w:t>
-        </w:r>
-        <w:r>
-          <w:rPr>
-            <w:rStyle w:val="Hyperlink"/>
-            <w:iCs/>
-            <w:sz w:val="24"/>
-            <w:szCs w:val="24"/>
-          </w:rPr>
-          <w:t>o/blog/2017/01/23/terry-rileys-in-c.html</w:t>
+          <w:t>https://teropa.info/blog/2017/01/23/terry-rileys-in-c.html</w:t>
         </w:r>
       </w:hyperlink>
     </w:p>
@@ -7689,6 +6715,7 @@
           <w:sz w:val="24"/>
           <w:szCs w:val="24"/>
         </w:rPr>
+        <w:lastRenderedPageBreak/>
         <w:t>Joh</w:t>
       </w:r>
       <w:r>
@@ -7795,87 +6822,14 @@
           <w:szCs w:val="24"/>
         </w:rPr>
       </w:pPr>
-      <w:proofErr w:type="spellStart"/>
-      <w:proofErr w:type="gramStart"/>
-      <w:r>
-        <w:rPr>
-          <w:iCs/>
-          <w:color w:val="000000" w:themeColor="text1"/>
-          <w:sz w:val="24"/>
-          <w:szCs w:val="24"/>
-        </w:rPr>
-        <w:t>Its</w:t>
-      </w:r>
-      <w:proofErr w:type="spellEnd"/>
-      <w:proofErr w:type="gramEnd"/>
-      <w:r>
-        <w:rPr>
-          <w:iCs/>
-          <w:color w:val="000000" w:themeColor="text1"/>
-          <w:sz w:val="24"/>
-          <w:szCs w:val="24"/>
-        </w:rPr>
-        <w:t xml:space="preserve"> up to you. You can use stuff from </w:t>
-      </w:r>
-      <w:proofErr w:type="spellStart"/>
-      <w:r>
-        <w:rPr>
-          <w:iCs/>
-          <w:color w:val="000000" w:themeColor="text1"/>
-          <w:sz w:val="24"/>
-          <w:szCs w:val="24"/>
-        </w:rPr>
-        <w:t>thre</w:t>
-      </w:r>
-      <w:proofErr w:type="spellEnd"/>
-      <w:r>
-        <w:rPr>
-          <w:iCs/>
-          <w:color w:val="000000" w:themeColor="text1"/>
-          <w:sz w:val="24"/>
-          <w:szCs w:val="24"/>
-        </w:rPr>
-        <w:t xml:space="preserve"> SCLORK </w:t>
-      </w:r>
-      <w:proofErr w:type="spellStart"/>
-      <w:r>
-        <w:rPr>
-          <w:iCs/>
-          <w:color w:val="000000" w:themeColor="text1"/>
-          <w:sz w:val="24"/>
-          <w:szCs w:val="24"/>
-        </w:rPr>
-        <w:t>respository</w:t>
-      </w:r>
-      <w:proofErr w:type="spellEnd"/>
-      <w:r>
-        <w:rPr>
-          <w:iCs/>
-          <w:color w:val="000000" w:themeColor="text1"/>
-          <w:sz w:val="24"/>
-          <w:szCs w:val="24"/>
-        </w:rPr>
-        <w:t xml:space="preserve"> and you can design your own </w:t>
-      </w:r>
-      <w:proofErr w:type="spellStart"/>
-      <w:r>
-        <w:rPr>
-          <w:iCs/>
-          <w:color w:val="000000" w:themeColor="text1"/>
-          <w:sz w:val="24"/>
-          <w:szCs w:val="24"/>
-        </w:rPr>
-        <w:t>synthdefs</w:t>
-      </w:r>
-      <w:proofErr w:type="spellEnd"/>
-      <w:r>
-        <w:rPr>
-          <w:iCs/>
-          <w:color w:val="000000" w:themeColor="text1"/>
-          <w:sz w:val="24"/>
-          <w:szCs w:val="24"/>
-        </w:rPr>
-        <w:t>. And you can hack on effects like filters and reverbs.</w:t>
+      <w:r>
+        <w:rPr>
+          <w:iCs/>
+          <w:color w:val="000000" w:themeColor="text1"/>
+          <w:sz w:val="24"/>
+          <w:szCs w:val="24"/>
+        </w:rPr>
+        <w:t>Its up to you. You can use stuff from thre SCLORK respository and you can design your own synthdefs. And you can hack on effects like filters and reverbs.</w:t>
       </w:r>
     </w:p>
     <w:p>
@@ -7937,7 +6891,7 @@
           <w:sz w:val="24"/>
           <w:szCs w:val="24"/>
         </w:rPr>
-        <w:t>8</w:t>
+        <w:t>7</w:t>
       </w:r>
     </w:p>
     <w:p>
@@ -8007,10 +6961,12 @@
           <w:sz w:val="24"/>
           <w:szCs w:val="24"/>
         </w:rPr>
-        <w:t xml:space="preserve">Introduction to </w:t>
-      </w:r>
-      <w:proofErr w:type="spellStart"/>
-      <w:r>
+        <w:t>Introduction to Playbuf</w:t>
+      </w:r>
+    </w:p>
+    <w:p>
+      <w:pPr>
+        <w:pStyle w:val="Normal1"/>
         <w:rPr>
           <w:b/>
           <w:bCs/>
@@ -8019,13 +6975,8 @@
           <w:sz w:val="24"/>
           <w:szCs w:val="24"/>
         </w:rPr>
-        <w:t>Playbuf</w:t>
-      </w:r>
-      <w:proofErr w:type="spellEnd"/>
-    </w:p>
-    <w:p>
-      <w:pPr>
-        <w:pStyle w:val="Normal1"/>
+      </w:pPr>
+      <w:r>
         <w:rPr>
           <w:b/>
           <w:bCs/>
@@ -8034,8 +6985,12 @@
           <w:sz w:val="24"/>
           <w:szCs w:val="24"/>
         </w:rPr>
-      </w:pPr>
-      <w:r>
+        <w:t>Introduction to Granular Synthesis</w:t>
+      </w:r>
+    </w:p>
+    <w:p>
+      <w:pPr>
+        <w:pStyle w:val="Normal1"/>
         <w:rPr>
           <w:b/>
           <w:bCs/>
@@ -8044,12 +6999,8 @@
           <w:sz w:val="24"/>
           <w:szCs w:val="24"/>
         </w:rPr>
-        <w:t>Introduction to Granular Synthesis</w:t>
-      </w:r>
-    </w:p>
-    <w:p>
-      <w:pPr>
-        <w:pStyle w:val="Normal1"/>
+      </w:pPr>
+      <w:r>
         <w:rPr>
           <w:b/>
           <w:bCs/>
@@ -8058,44 +7009,8 @@
           <w:sz w:val="24"/>
           <w:szCs w:val="24"/>
         </w:rPr>
-      </w:pPr>
-      <w:proofErr w:type="spellStart"/>
-      <w:r>
-        <w:rPr>
-          <w:b/>
-          <w:bCs/>
-          <w:iCs/>
-          <w:color w:val="000000" w:themeColor="text1"/>
-          <w:sz w:val="24"/>
-          <w:szCs w:val="24"/>
-        </w:rPr>
-        <w:t>Introduciton</w:t>
-      </w:r>
-      <w:proofErr w:type="spellEnd"/>
-      <w:r>
-        <w:rPr>
-          <w:b/>
-          <w:bCs/>
-          <w:iCs/>
-          <w:color w:val="000000" w:themeColor="text1"/>
-          <w:sz w:val="24"/>
-          <w:szCs w:val="24"/>
-        </w:rPr>
-        <w:t xml:space="preserve"> to 2</w:t>
-      </w:r>
-      <w:proofErr w:type="gramStart"/>
-      <w:r>
-        <w:rPr>
-          <w:b/>
-          <w:bCs/>
-          <w:iCs/>
-          <w:color w:val="000000" w:themeColor="text1"/>
-          <w:sz w:val="24"/>
-          <w:szCs w:val="24"/>
-        </w:rPr>
-        <w:t>d.wave</w:t>
-      </w:r>
-      <w:proofErr w:type="gramEnd"/>
+        <w:t>Introduciton to 2d.wave</w:t>
+      </w:r>
     </w:p>
     <w:p>
       <w:pPr>
@@ -8182,128 +7097,7 @@
           <w:sz w:val="24"/>
           <w:szCs w:val="24"/>
         </w:rPr>
-        <w:lastRenderedPageBreak/>
-        <w:t xml:space="preserve">Incorporate a sampler into your favorite </w:t>
-      </w:r>
-      <w:proofErr w:type="spellStart"/>
-      <w:r>
-        <w:rPr>
-          <w:iCs/>
-          <w:color w:val="000000" w:themeColor="text1"/>
-          <w:sz w:val="24"/>
-          <w:szCs w:val="24"/>
-        </w:rPr>
-        <w:t>Synthdef</w:t>
-      </w:r>
-      <w:proofErr w:type="spellEnd"/>
-      <w:r>
-        <w:rPr>
-          <w:iCs/>
-          <w:color w:val="000000" w:themeColor="text1"/>
-          <w:sz w:val="24"/>
-          <w:szCs w:val="24"/>
-        </w:rPr>
-        <w:t xml:space="preserve"> or </w:t>
-      </w:r>
-      <w:proofErr w:type="spellStart"/>
-      <w:r>
-        <w:rPr>
-          <w:iCs/>
-          <w:color w:val="000000" w:themeColor="text1"/>
-          <w:sz w:val="24"/>
-          <w:szCs w:val="24"/>
-        </w:rPr>
-        <w:t>Nodeproxy</w:t>
-      </w:r>
-      <w:proofErr w:type="spellEnd"/>
-      <w:r>
-        <w:rPr>
-          <w:iCs/>
-          <w:color w:val="000000" w:themeColor="text1"/>
-          <w:sz w:val="24"/>
-          <w:szCs w:val="24"/>
-        </w:rPr>
-        <w:t xml:space="preserve"> tools thus far. Remove synthesis engine and replace it with </w:t>
-      </w:r>
-      <w:proofErr w:type="spellStart"/>
-      <w:r>
-        <w:rPr>
-          <w:iCs/>
-          <w:color w:val="000000" w:themeColor="text1"/>
-          <w:sz w:val="24"/>
-          <w:szCs w:val="24"/>
-        </w:rPr>
-        <w:t>Playbuf</w:t>
-      </w:r>
-      <w:proofErr w:type="spellEnd"/>
-      <w:r>
-        <w:rPr>
-          <w:iCs/>
-          <w:color w:val="000000" w:themeColor="text1"/>
-          <w:sz w:val="24"/>
-          <w:szCs w:val="24"/>
-        </w:rPr>
-        <w:t xml:space="preserve">, </w:t>
-      </w:r>
-      <w:proofErr w:type="spellStart"/>
-      <w:r>
-        <w:rPr>
-          <w:iCs/>
-          <w:color w:val="000000" w:themeColor="text1"/>
-          <w:sz w:val="24"/>
-          <w:szCs w:val="24"/>
-        </w:rPr>
-        <w:t>BufRd</w:t>
-      </w:r>
-      <w:proofErr w:type="spellEnd"/>
-      <w:r>
-        <w:rPr>
-          <w:iCs/>
-          <w:color w:val="000000" w:themeColor="text1"/>
-          <w:sz w:val="24"/>
-          <w:szCs w:val="24"/>
-        </w:rPr>
-        <w:t xml:space="preserve">, or </w:t>
-      </w:r>
-      <w:proofErr w:type="spellStart"/>
-      <w:r>
-        <w:rPr>
-          <w:iCs/>
-          <w:color w:val="000000" w:themeColor="text1"/>
-          <w:sz w:val="24"/>
-          <w:szCs w:val="24"/>
-        </w:rPr>
-        <w:t>Grainbuf</w:t>
-      </w:r>
-      <w:proofErr w:type="spellEnd"/>
-      <w:r>
-        <w:rPr>
-          <w:iCs/>
-          <w:color w:val="000000" w:themeColor="text1"/>
-          <w:sz w:val="24"/>
-          <w:szCs w:val="24"/>
-        </w:rPr>
-        <w:t>. You can “</w:t>
-      </w:r>
-      <w:proofErr w:type="spellStart"/>
-      <w:r>
-        <w:rPr>
-          <w:iCs/>
-          <w:color w:val="000000" w:themeColor="text1"/>
-          <w:sz w:val="24"/>
-          <w:szCs w:val="24"/>
-        </w:rPr>
-        <w:t>vibecode</w:t>
-      </w:r>
-      <w:proofErr w:type="spellEnd"/>
-      <w:r>
-        <w:rPr>
-          <w:iCs/>
-          <w:color w:val="000000" w:themeColor="text1"/>
-          <w:sz w:val="24"/>
-          <w:szCs w:val="24"/>
-        </w:rPr>
-        <w:t>.” The point is to get it to work somehow.</w:t>
+        <w:t>Incorporate a sampler into your favorite Synthdef or Nodeproxy tools thus far. Remove synthesis engine and replace it with Playbuf, BufRd, or Grainbuf. You can “vibecode.” The point is to get it to work somehow.</w:t>
       </w:r>
     </w:p>
     <w:p>
@@ -8474,7 +7268,16 @@
           <w:sz w:val="24"/>
           <w:szCs w:val="24"/>
         </w:rPr>
-        <w:t>15</w:t>
+        <w:t>1</w:t>
+      </w:r>
+      <w:r>
+        <w:rPr>
+          <w:i/>
+          <w:color w:val="000000" w:themeColor="text1"/>
+          <w:sz w:val="24"/>
+          <w:szCs w:val="24"/>
+        </w:rPr>
+        <w:t>4</w:t>
       </w:r>
     </w:p>
     <w:p>
@@ -8626,7 +7429,7 @@
           <w:szCs w:val="24"/>
         </w:rPr>
       </w:pPr>
-      <w:hyperlink r:id="rId30" w:history="1">
+      <w:hyperlink r:id="rId26" w:history="1">
         <w:r>
           <w:rPr>
             <w:rStyle w:val="Hyperlink"/>
@@ -8690,27 +7493,7 @@
           <w:sz w:val="24"/>
           <w:szCs w:val="24"/>
         </w:rPr>
-        <w:t xml:space="preserve">Upload and change your own code to flying fish sampler sketch. But first you need to prepare your sample, first by saving a 0.5 second wav file as an </w:t>
-      </w:r>
-      <w:proofErr w:type="gramStart"/>
-      <w:r>
-        <w:rPr>
-          <w:iCs/>
-          <w:color w:val="000000" w:themeColor="text1"/>
-          <w:sz w:val="24"/>
-          <w:szCs w:val="24"/>
-        </w:rPr>
-        <w:t>8 bit</w:t>
-      </w:r>
-      <w:proofErr w:type="gramEnd"/>
-      <w:r>
-        <w:rPr>
-          <w:iCs/>
-          <w:color w:val="000000" w:themeColor="text1"/>
-          <w:sz w:val="24"/>
-          <w:szCs w:val="24"/>
-        </w:rPr>
-        <w:t xml:space="preserve"> raw file, and then using the python script to encode your own digital array from that small sample. It needs to be 0.5 seconds, otherwise it will crash.</w:t>
+        <w:t>Upload and change your own code to flying fish sampler sketch. But first you need to prepare your sample, first by saving a 0.5 second wav file as an 8 bit raw file, and then using the python script to encode your own digital array from that small sample. It needs to be 0.5 seconds, otherwise it will crash.</w:t>
       </w:r>
     </w:p>
     <w:p>
@@ -8808,7 +7591,16 @@
           <w:sz w:val="24"/>
           <w:szCs w:val="24"/>
         </w:rPr>
-        <w:t>22</w:t>
+        <w:t>2</w:t>
+      </w:r>
+      <w:r>
+        <w:rPr>
+          <w:i/>
+          <w:color w:val="000000" w:themeColor="text1"/>
+          <w:sz w:val="24"/>
+          <w:szCs w:val="24"/>
+        </w:rPr>
+        <w:t>1</w:t>
       </w:r>
     </w:p>
     <w:p>
@@ -8911,31 +7703,20 @@
           <w:sz w:val="24"/>
           <w:szCs w:val="24"/>
         </w:rPr>
-        <w:t xml:space="preserve">Daisy </w:t>
-      </w:r>
-      <w:proofErr w:type="spellStart"/>
-      <w:r>
-        <w:rPr>
-          <w:i/>
-          <w:color w:val="000000" w:themeColor="text1"/>
-          <w:sz w:val="24"/>
-          <w:szCs w:val="24"/>
-        </w:rPr>
-        <w:t>ElectroSmith</w:t>
-      </w:r>
-      <w:proofErr w:type="spellEnd"/>
-    </w:p>
-    <w:p>
-      <w:pPr>
-        <w:pStyle w:val="Normal1"/>
-        <w:rPr>
-          <w:i/>
-          <w:color w:val="000000" w:themeColor="text1"/>
-          <w:sz w:val="24"/>
-          <w:szCs w:val="24"/>
-        </w:rPr>
-      </w:pPr>
-      <w:hyperlink r:id="rId31" w:history="1">
+        <w:t>Daisy ElectroSmith</w:t>
+      </w:r>
+    </w:p>
+    <w:p>
+      <w:pPr>
+        <w:pStyle w:val="Normal1"/>
+        <w:rPr>
+          <w:i/>
+          <w:color w:val="000000" w:themeColor="text1"/>
+          <w:sz w:val="24"/>
+          <w:szCs w:val="24"/>
+        </w:rPr>
+      </w:pPr>
+      <w:hyperlink r:id="rId27" w:history="1">
         <w:r>
           <w:rPr>
             <w:rStyle w:val="Hyperlink"/>
@@ -8984,28 +7765,7 @@
           <w:sz w:val="24"/>
           <w:szCs w:val="24"/>
         </w:rPr>
-        <w:lastRenderedPageBreak/>
-        <w:t xml:space="preserve">Exploration of Daisy </w:t>
-      </w:r>
-      <w:proofErr w:type="spellStart"/>
-      <w:r>
-        <w:rPr>
-          <w:i/>
-          <w:color w:val="000000" w:themeColor="text1"/>
-          <w:sz w:val="24"/>
-          <w:szCs w:val="24"/>
-        </w:rPr>
-        <w:t>Electrosmith</w:t>
-      </w:r>
-      <w:proofErr w:type="spellEnd"/>
-      <w:r>
-        <w:rPr>
-          <w:i/>
-          <w:color w:val="000000" w:themeColor="text1"/>
-          <w:sz w:val="24"/>
-          <w:szCs w:val="24"/>
-        </w:rPr>
-        <w:t xml:space="preserve"> and </w:t>
+        <w:t xml:space="preserve">Exploration of Daisy Electrosmith and </w:t>
       </w:r>
     </w:p>
     <w:p>
@@ -9064,7 +7824,7 @@
                     </pic:cNvPicPr>
                   </pic:nvPicPr>
                   <pic:blipFill>
-                    <a:blip r:embed="rId32">
+                    <a:blip r:embed="rId28">
                       <a:extLst>
                         <a:ext uri="{28A0092B-C50C-407E-A947-70E740481C1C}">
                           <a14:useLocalDpi xmlns:a14="http://schemas.microsoft.com/office/drawing/2010/main" val="0"/>
@@ -9120,7 +7880,7 @@
                     </pic:cNvPicPr>
                   </pic:nvPicPr>
                   <pic:blipFill>
-                    <a:blip r:embed="rId33">
+                    <a:blip r:embed="rId29">
                       <a:extLst>
                         <a:ext uri="{28A0092B-C50C-407E-A947-70E740481C1C}">
                           <a14:useLocalDpi xmlns:a14="http://schemas.microsoft.com/office/drawing/2010/main" val="0"/>
@@ -9205,25 +7965,14 @@
         </w:rPr>
         <w:t xml:space="preserve">Get some sounds working on your </w:t>
       </w:r>
-      <w:proofErr w:type="spellStart"/>
-      <w:r>
-        <w:rPr>
-          <w:i/>
-          <w:color w:val="000000" w:themeColor="text1"/>
-          <w:sz w:val="24"/>
-          <w:szCs w:val="24"/>
-        </w:rPr>
-        <w:t>electrosmith</w:t>
-      </w:r>
-      <w:proofErr w:type="spellEnd"/>
-      <w:r>
-        <w:rPr>
-          <w:i/>
-          <w:color w:val="000000" w:themeColor="text1"/>
-          <w:sz w:val="24"/>
-          <w:szCs w:val="24"/>
-        </w:rPr>
-        <w:t xml:space="preserve"> </w:t>
+      <w:r>
+        <w:rPr>
+          <w:i/>
+          <w:color w:val="000000" w:themeColor="text1"/>
+          <w:sz w:val="24"/>
+          <w:szCs w:val="24"/>
+        </w:rPr>
+        <w:t xml:space="preserve">electrosmith </w:t>
       </w:r>
       <w:r>
         <w:rPr>
@@ -9274,6 +8023,7 @@
           <w:sz w:val="24"/>
           <w:szCs w:val="24"/>
         </w:rPr>
+        <w:lastRenderedPageBreak/>
         <w:t xml:space="preserve">Class 10 Wednesday </w:t>
       </w:r>
       <w:r>
@@ -9283,7 +8033,16 @@
           <w:sz w:val="24"/>
           <w:szCs w:val="24"/>
         </w:rPr>
-        <w:t>10/29</w:t>
+        <w:t>10/2</w:t>
+      </w:r>
+      <w:r>
+        <w:rPr>
+          <w:i/>
+          <w:color w:val="000000" w:themeColor="text1"/>
+          <w:sz w:val="24"/>
+          <w:szCs w:val="24"/>
+        </w:rPr>
+        <w:t>8</w:t>
       </w:r>
     </w:p>
     <w:p>
@@ -9439,7 +8198,7 @@
           <w:sz w:val="24"/>
           <w:szCs w:val="24"/>
         </w:rPr>
-        <w:t>5</w:t>
+        <w:t>4</w:t>
       </w:r>
     </w:p>
     <w:p>
@@ -9489,7 +8248,7 @@
           <w:szCs w:val="24"/>
         </w:rPr>
       </w:pPr>
-      <w:hyperlink r:id="rId34" w:history="1">
+      <w:hyperlink r:id="rId30" w:history="1">
         <w:r>
           <w:rPr>
             <w:rStyle w:val="Hyperlink"/>
@@ -9520,27 +8279,7 @@
           <w:sz w:val="24"/>
           <w:szCs w:val="24"/>
         </w:rPr>
-        <w:t>The Fluid Corpus Manipulation project (</w:t>
-      </w:r>
-      <w:proofErr w:type="spellStart"/>
-      <w:r>
-        <w:rPr>
-          <w:iCs/>
-          <w:color w:val="000000" w:themeColor="text1"/>
-          <w:sz w:val="24"/>
-          <w:szCs w:val="24"/>
-        </w:rPr>
-        <w:t>FluCoMa</w:t>
-      </w:r>
-      <w:proofErr w:type="spellEnd"/>
-      <w:r>
-        <w:rPr>
-          <w:iCs/>
-          <w:color w:val="000000" w:themeColor="text1"/>
-          <w:sz w:val="24"/>
-          <w:szCs w:val="24"/>
-        </w:rPr>
-        <w:t>) instigates new musical ways of exploiting ever-growing banks of so</w:t>
+        <w:t>The Fluid Corpus Manipulation project (FluCoMa) instigates new musical ways of exploiting ever-growing banks of so</w:t>
       </w:r>
       <w:r>
         <w:rPr>
@@ -9589,37 +8328,7 @@
           <w:sz w:val="24"/>
           <w:szCs w:val="24"/>
         </w:rPr>
-        <w:t xml:space="preserve">These potent algorithms are currently partially available in closed bespoke software, or in laboratories, but not at a suitable level of modularity within the main coding environments used by the creative researchers, namely Max, Pd and </w:t>
-      </w:r>
-      <w:proofErr w:type="spellStart"/>
-      <w:r>
-        <w:rPr>
-          <w:iCs/>
-          <w:color w:val="000000" w:themeColor="text1"/>
-          <w:sz w:val="24"/>
-          <w:szCs w:val="24"/>
-        </w:rPr>
-        <w:t>SuperCollider</w:t>
-      </w:r>
-      <w:proofErr w:type="spellEnd"/>
-      <w:r>
-        <w:rPr>
-          <w:iCs/>
-          <w:color w:val="000000" w:themeColor="text1"/>
-          <w:sz w:val="24"/>
-          <w:szCs w:val="24"/>
-        </w:rPr>
-        <w:t xml:space="preserve">, to allow groundbreaking sonic research into a rich unexploited area: the manipulation of large sound corpora. Indeed, with access to, genesis of, and storage of large sound </w:t>
-      </w:r>
-      <w:r>
-        <w:rPr>
-          <w:iCs/>
-          <w:color w:val="000000" w:themeColor="text1"/>
-          <w:sz w:val="24"/>
-          <w:szCs w:val="24"/>
-        </w:rPr>
-        <w:lastRenderedPageBreak/>
-        <w:t>banks now commonplace, novel ways of abstracting and manipulating them are needed to mine their inherent potential.</w:t>
+        <w:t>These potent algorithms are currently partially available in closed bespoke software, or in laboratories, but not at a suitable level of modularity within the main coding environments used by the creative researchers, namely Max, Pd and SuperCollider, to allow groundbreaking sonic research into a rich unexploited area: the manipulation of large sound corpora. Indeed, with access to, genesis of, and storage of large sound banks now commonplace, novel ways of abstracting and manipulating them are needed to mine their inherent potential.</w:t>
       </w:r>
       <w:r>
         <w:rPr>
@@ -9670,7 +8379,16 @@
           <w:sz w:val="24"/>
           <w:szCs w:val="24"/>
         </w:rPr>
-        <w:t>12</w:t>
+        <w:t>1</w:t>
+      </w:r>
+      <w:r>
+        <w:rPr>
+          <w:i/>
+          <w:color w:val="000000" w:themeColor="text1"/>
+          <w:sz w:val="24"/>
+          <w:szCs w:val="24"/>
+        </w:rPr>
+        <w:t>1</w:t>
       </w:r>
     </w:p>
     <w:p>
@@ -9820,7 +8538,16 @@
           <w:sz w:val="24"/>
           <w:szCs w:val="24"/>
         </w:rPr>
-        <w:t>11/19</w:t>
+        <w:t>11/1</w:t>
+      </w:r>
+      <w:r>
+        <w:rPr>
+          <w:i/>
+          <w:color w:val="000000" w:themeColor="text1"/>
+          <w:sz w:val="24"/>
+          <w:szCs w:val="24"/>
+        </w:rPr>
+        <w:t>8</w:t>
       </w:r>
     </w:p>
     <w:p>
@@ -9891,7 +8618,43 @@
           <w:sz w:val="24"/>
           <w:szCs w:val="24"/>
         </w:rPr>
-        <w:t xml:space="preserve"> 11/26–11/30 NO CLASS</w:t>
+        <w:t xml:space="preserve"> 11/2</w:t>
+      </w:r>
+      <w:r>
+        <w:rPr>
+          <w:i/>
+          <w:color w:val="000000" w:themeColor="text1"/>
+          <w:sz w:val="24"/>
+          <w:szCs w:val="24"/>
+        </w:rPr>
+        <w:t>5</w:t>
+      </w:r>
+      <w:r>
+        <w:rPr>
+          <w:i/>
+          <w:color w:val="000000" w:themeColor="text1"/>
+          <w:sz w:val="24"/>
+          <w:szCs w:val="24"/>
+        </w:rPr>
+        <w:t>–11/</w:t>
+      </w:r>
+      <w:r>
+        <w:rPr>
+          <w:i/>
+          <w:color w:val="000000" w:themeColor="text1"/>
+          <w:sz w:val="24"/>
+          <w:szCs w:val="24"/>
+        </w:rPr>
+        <w:t>29</w:t>
+      </w:r>
+      <w:r>
+        <w:rPr>
+          <w:i/>
+          <w:color w:val="000000" w:themeColor="text1"/>
+          <w:sz w:val="24"/>
+          <w:szCs w:val="24"/>
+        </w:rPr>
+        <w:t xml:space="preserve"> NO CLASS</w:t>
       </w:r>
     </w:p>
     <w:p>
@@ -9944,6 +8707,7 @@
           <w:sz w:val="24"/>
           <w:szCs w:val="24"/>
         </w:rPr>
+        <w:lastRenderedPageBreak/>
         <w:t>Class 1</w:t>
       </w:r>
       <w:r>
@@ -9989,7 +8753,7 @@
           <w:sz w:val="24"/>
           <w:szCs w:val="24"/>
         </w:rPr>
-        <w:t>3</w:t>
+        <w:t>2</w:t>
       </w:r>
     </w:p>
     <w:p>
@@ -10075,16 +8839,7 @@
           <w:sz w:val="24"/>
           <w:szCs w:val="24"/>
         </w:rPr>
-        <w:t>10</w:t>
-      </w:r>
-      <w:r>
-        <w:rPr>
-          <w:i/>
-          <w:color w:val="000000" w:themeColor="text1"/>
-          <w:sz w:val="24"/>
-          <w:szCs w:val="24"/>
-        </w:rPr>
-        <w:t xml:space="preserve"> </w:t>
+        <w:t>9</w:t>
       </w:r>
     </w:p>
     <w:p>
@@ -10132,12 +8887,12 @@
       </w:pPr>
     </w:p>
     <w:sectPr>
-      <w:headerReference w:type="even" r:id="rId35"/>
-      <w:headerReference w:type="default" r:id="rId36"/>
-      <w:footerReference w:type="even" r:id="rId37"/>
-      <w:footerReference w:type="default" r:id="rId38"/>
-      <w:headerReference w:type="first" r:id="rId39"/>
-      <w:footerReference w:type="first" r:id="rId40"/>
+      <w:headerReference w:type="even" r:id="rId31"/>
+      <w:headerReference w:type="default" r:id="rId32"/>
+      <w:footerReference w:type="even" r:id="rId33"/>
+      <w:footerReference w:type="default" r:id="rId34"/>
+      <w:headerReference w:type="first" r:id="rId35"/>
+      <w:footerReference w:type="first" r:id="rId36"/>
       <w:type w:val="continuous"/>
       <w:pgSz w:w="12240" w:h="15840"/>
       <w:pgMar w:top="1440" w:right="1440" w:bottom="1440" w:left="1440" w:header="720" w:footer="720" w:gutter="0"/>
@@ -15427,6 +14182,25 @@
       <w:bCs/>
     </w:rPr>
   </w:style>
+  <w:style w:type="paragraph" w:styleId="Caption">
+    <w:name w:val="caption"/>
+    <w:basedOn w:val="Normal"/>
+    <w:next w:val="Normal"/>
+    <w:uiPriority w:val="35"/>
+    <w:unhideWhenUsed/>
+    <w:qFormat/>
+    <w:rsid w:val="00374F41"/>
+    <w:pPr>
+      <w:spacing w:after="200" w:line="240" w:lineRule="auto"/>
+    </w:pPr>
+    <w:rPr>
+      <w:i/>
+      <w:iCs/>
+      <w:color w:val="1F497D" w:themeColor="text2"/>
+      <w:sz w:val="18"/>
+      <w:szCs w:val="18"/>
+    </w:rPr>
+  </w:style>
 </w:styles>
 </file>
 

</xml_diff>

<commit_message>
added notes from class
</commit_message>
<xml_diff>
--- a/Ramapo620-50_syllabus1.1docx.docx
+++ b/Ramapo620-50_syllabus1.1docx.docx
@@ -9,17 +9,13 @@
           <w:rFonts w:ascii="Arial" w:hAnsi="Arial" w:cs="Arial"/>
           <w:b/>
           <w:color w:val="000000" w:themeColor="text1"/>
-          <w:sz w:val="24"/>
-          <w:szCs w:val="24"/>
-        </w:rPr>
-      </w:pPr>
-      <w:r>
-        <w:rPr>
-          <w:rFonts w:ascii="Arial" w:hAnsi="Arial" w:cs="Arial"/>
-          <w:b/>
-          <w:color w:val="000000" w:themeColor="text1"/>
-          <w:sz w:val="24"/>
-          <w:szCs w:val="24"/>
+        </w:rPr>
+      </w:pPr>
+      <w:r>
+        <w:rPr>
+          <w:rFonts w:ascii="Arial" w:hAnsi="Arial" w:cs="Arial"/>
+          <w:b/>
+          <w:color w:val="000000" w:themeColor="text1"/>
         </w:rPr>
         <w:t>Ramapo College of New Jersey</w:t>
       </w:r>
@@ -29,16 +25,12 @@
         <w:rPr>
           <w:rFonts w:ascii="Arial" w:hAnsi="Arial" w:cs="Arial"/>
           <w:color w:val="000000" w:themeColor="text1"/>
-          <w:sz w:val="24"/>
-          <w:szCs w:val="24"/>
-        </w:rPr>
-      </w:pPr>
-      <w:r>
-        <w:rPr>
-          <w:rFonts w:ascii="Arial" w:hAnsi="Arial" w:cs="Arial"/>
-          <w:color w:val="000000" w:themeColor="text1"/>
-          <w:sz w:val="24"/>
-          <w:szCs w:val="24"/>
+        </w:rPr>
+      </w:pPr>
+      <w:r>
+        <w:rPr>
+          <w:rFonts w:ascii="Arial" w:hAnsi="Arial" w:cs="Arial"/>
+          <w:color w:val="000000" w:themeColor="text1"/>
         </w:rPr>
         <w:t>School of Contemporary Arts</w:t>
       </w:r>
@@ -48,16 +40,12 @@
         <w:rPr>
           <w:rFonts w:ascii="Arial" w:hAnsi="Arial" w:cs="Arial"/>
           <w:color w:val="000000" w:themeColor="text1"/>
-          <w:sz w:val="24"/>
-          <w:szCs w:val="24"/>
-        </w:rPr>
-      </w:pPr>
-      <w:r>
-        <w:rPr>
-          <w:rFonts w:ascii="Arial" w:hAnsi="Arial" w:cs="Arial"/>
-          <w:color w:val="000000" w:themeColor="text1"/>
-          <w:sz w:val="24"/>
-          <w:szCs w:val="24"/>
+        </w:rPr>
+      </w:pPr>
+      <w:r>
+        <w:rPr>
+          <w:rFonts w:ascii="Arial" w:hAnsi="Arial" w:cs="Arial"/>
+          <w:color w:val="000000" w:themeColor="text1"/>
         </w:rPr>
         <w:t>MUSI 6</w:t>
       </w:r>
@@ -65,8 +53,6 @@
         <w:rPr>
           <w:rFonts w:ascii="Arial" w:hAnsi="Arial" w:cs="Arial"/>
           <w:color w:val="000000" w:themeColor="text1"/>
-          <w:sz w:val="24"/>
-          <w:szCs w:val="24"/>
         </w:rPr>
         <w:t>5</w:t>
       </w:r>
@@ -74,8 +60,6 @@
         <w:rPr>
           <w:rFonts w:ascii="Arial" w:hAnsi="Arial" w:cs="Arial"/>
           <w:color w:val="000000" w:themeColor="text1"/>
-          <w:sz w:val="24"/>
-          <w:szCs w:val="24"/>
         </w:rPr>
         <w:t xml:space="preserve">0 - </w:t>
       </w:r>
@@ -84,8 +68,6 @@
         <w:rPr>
           <w:rFonts w:ascii="Arial" w:hAnsi="Arial" w:cs="Arial"/>
           <w:color w:val="000000" w:themeColor="text1"/>
-          <w:sz w:val="24"/>
-          <w:szCs w:val="24"/>
         </w:rPr>
         <w:t>2</w:t>
       </w:r>
@@ -93,8 +75,6 @@
         <w:rPr>
           <w:rFonts w:ascii="Arial" w:hAnsi="Arial" w:cs="Arial"/>
           <w:color w:val="000000" w:themeColor="text1"/>
-          <w:sz w:val="24"/>
-          <w:szCs w:val="24"/>
         </w:rPr>
         <w:t>0 :</w:t>
       </w:r>
@@ -103,8 +83,6 @@
         <w:rPr>
           <w:rFonts w:ascii="Arial" w:hAnsi="Arial" w:cs="Arial"/>
           <w:color w:val="000000" w:themeColor="text1"/>
-          <w:sz w:val="24"/>
-          <w:szCs w:val="24"/>
         </w:rPr>
         <w:t xml:space="preserve"> </w:t>
       </w:r>
@@ -112,8 +90,6 @@
         <w:rPr>
           <w:rFonts w:ascii="Arial" w:hAnsi="Arial" w:cs="Arial"/>
           <w:color w:val="000000" w:themeColor="text1"/>
-          <w:sz w:val="24"/>
-          <w:szCs w:val="24"/>
         </w:rPr>
         <w:t>Creative Musical Coding</w:t>
       </w:r>
@@ -123,16 +99,12 @@
         <w:rPr>
           <w:rFonts w:ascii="Arial" w:hAnsi="Arial" w:cs="Arial"/>
           <w:color w:val="000000" w:themeColor="text1"/>
-          <w:sz w:val="24"/>
-          <w:szCs w:val="24"/>
-        </w:rPr>
-      </w:pPr>
-      <w:r>
-        <w:rPr>
-          <w:rFonts w:ascii="Arial" w:hAnsi="Arial" w:cs="Arial"/>
-          <w:color w:val="000000" w:themeColor="text1"/>
-          <w:sz w:val="24"/>
-          <w:szCs w:val="24"/>
+        </w:rPr>
+      </w:pPr>
+      <w:r>
+        <w:rPr>
+          <w:rFonts w:ascii="Arial" w:hAnsi="Arial" w:cs="Arial"/>
+          <w:color w:val="000000" w:themeColor="text1"/>
         </w:rPr>
         <w:t>Fall</w:t>
       </w:r>
@@ -140,8 +112,6 @@
         <w:rPr>
           <w:rFonts w:ascii="Arial" w:hAnsi="Arial" w:cs="Arial"/>
           <w:color w:val="000000" w:themeColor="text1"/>
-          <w:sz w:val="24"/>
-          <w:szCs w:val="24"/>
         </w:rPr>
         <w:t xml:space="preserve"> 202</w:t>
       </w:r>
@@ -149,8 +119,6 @@
         <w:rPr>
           <w:rFonts w:ascii="Arial" w:hAnsi="Arial" w:cs="Arial"/>
           <w:color w:val="000000" w:themeColor="text1"/>
-          <w:sz w:val="24"/>
-          <w:szCs w:val="24"/>
         </w:rPr>
         <w:t>6</w:t>
       </w:r>
@@ -158,42 +126,34 @@
     <w:p>
       <w:pPr>
         <w:rPr>
-          <w:rFonts w:ascii="Arial" w:eastAsia="Times New Roman" w:hAnsi="Arial" w:cs="Arial"/>
-          <w:i/>
-          <w:iCs/>
-          <w:color w:val="000000" w:themeColor="text1"/>
-          <w:sz w:val="24"/>
-          <w:szCs w:val="24"/>
-        </w:rPr>
-      </w:pPr>
-    </w:p>
-    <w:p>
-      <w:r>
-        <w:rPr>
-          <w:rFonts w:ascii="Arial" w:eastAsia="Times New Roman" w:hAnsi="Arial" w:cs="Arial"/>
-          <w:i/>
-          <w:iCs/>
-          <w:color w:val="000000" w:themeColor="text1"/>
-          <w:sz w:val="24"/>
-          <w:szCs w:val="24"/>
+          <w:rFonts w:ascii="Arial" w:hAnsi="Arial" w:cs="Arial"/>
+          <w:i/>
+          <w:iCs/>
+          <w:color w:val="000000" w:themeColor="text1"/>
+        </w:rPr>
+      </w:pPr>
+    </w:p>
+    <w:p>
+      <w:r>
+        <w:rPr>
+          <w:rFonts w:ascii="Arial" w:hAnsi="Arial" w:cs="Arial"/>
+          <w:i/>
+          <w:iCs/>
+          <w:color w:val="000000" w:themeColor="text1"/>
         </w:rPr>
         <w:t>Course Repository</w:t>
       </w:r>
       <w:r>
         <w:rPr>
-          <w:rFonts w:ascii="Arial" w:eastAsia="Times New Roman" w:hAnsi="Arial" w:cs="Arial"/>
-          <w:color w:val="000000" w:themeColor="text1"/>
-          <w:sz w:val="24"/>
-          <w:szCs w:val="24"/>
+          <w:rFonts w:ascii="Arial" w:hAnsi="Arial" w:cs="Arial"/>
+          <w:color w:val="000000" w:themeColor="text1"/>
         </w:rPr>
         <w:t>:</w:t>
       </w:r>
       <w:r>
         <w:rPr>
-          <w:rFonts w:ascii="Arial" w:eastAsia="Times New Roman" w:hAnsi="Arial" w:cs="Arial"/>
-          <w:color w:val="000000" w:themeColor="text1"/>
-          <w:sz w:val="24"/>
-          <w:szCs w:val="24"/>
+          <w:rFonts w:ascii="Arial" w:hAnsi="Arial" w:cs="Arial"/>
+          <w:color w:val="000000" w:themeColor="text1"/>
         </w:rPr>
         <w:tab/>
       </w:r>
@@ -201,9 +161,7 @@
         <w:r>
           <w:rPr>
             <w:rStyle w:val="Hyperlink"/>
-            <w:rFonts w:ascii="Arial" w:eastAsia="Times New Roman" w:hAnsi="Arial" w:cs="Arial"/>
-            <w:sz w:val="24"/>
-            <w:szCs w:val="24"/>
+            <w:rFonts w:ascii="Arial" w:hAnsi="Arial" w:cs="Arial"/>
           </w:rPr>
           <w:t>https://github.com/dfict/MUSI-650-20</w:t>
         </w:r>
@@ -214,8 +172,6 @@
         <w:rPr>
           <w:rFonts w:ascii="Arial" w:hAnsi="Arial" w:cs="Arial"/>
           <w:color w:val="000000" w:themeColor="text1"/>
-          <w:sz w:val="24"/>
-          <w:szCs w:val="24"/>
         </w:rPr>
       </w:pPr>
     </w:p>
@@ -225,8 +181,6 @@
           <w:rFonts w:ascii="Arial" w:hAnsi="Arial" w:cs="Arial"/>
           <w:bCs/>
           <w:color w:val="000000" w:themeColor="text1"/>
-          <w:sz w:val="24"/>
-          <w:szCs w:val="24"/>
         </w:rPr>
       </w:pPr>
       <w:r>
@@ -234,8 +188,6 @@
           <w:rFonts w:ascii="Arial" w:hAnsi="Arial" w:cs="Arial"/>
           <w:bCs/>
           <w:color w:val="000000" w:themeColor="text1"/>
-          <w:sz w:val="24"/>
-          <w:szCs w:val="24"/>
         </w:rPr>
         <w:t>Daniel Fishkin</w:t>
       </w:r>
@@ -244,8 +196,6 @@
           <w:rFonts w:ascii="Arial" w:hAnsi="Arial" w:cs="Arial"/>
           <w:bCs/>
           <w:color w:val="000000" w:themeColor="text1"/>
-          <w:sz w:val="24"/>
-          <w:szCs w:val="24"/>
         </w:rPr>
         <w:t xml:space="preserve"> </w:t>
       </w:r>
@@ -254,15 +204,11 @@
       <w:pPr>
         <w:rPr>
           <w:rFonts w:ascii="Arial" w:hAnsi="Arial" w:cs="Arial"/>
-          <w:sz w:val="24"/>
-          <w:szCs w:val="24"/>
-        </w:rPr>
-      </w:pPr>
-      <w:r>
-        <w:rPr>
-          <w:rFonts w:ascii="Arial" w:hAnsi="Arial" w:cs="Arial"/>
-          <w:sz w:val="24"/>
-          <w:szCs w:val="24"/>
+        </w:rPr>
+      </w:pPr>
+      <w:r>
+        <w:rPr>
+          <w:rFonts w:ascii="Arial" w:hAnsi="Arial" w:cs="Arial"/>
         </w:rPr>
         <w:t xml:space="preserve">Assistant Professor of Music (Production) </w:t>
       </w:r>
@@ -271,15 +217,11 @@
       <w:pPr>
         <w:rPr>
           <w:rFonts w:ascii="Arial" w:hAnsi="Arial" w:cs="Arial"/>
-          <w:sz w:val="24"/>
-          <w:szCs w:val="24"/>
-        </w:rPr>
-      </w:pPr>
-      <w:r>
-        <w:rPr>
-          <w:rFonts w:ascii="Arial" w:hAnsi="Arial" w:cs="Arial"/>
-          <w:sz w:val="24"/>
-          <w:szCs w:val="24"/>
+        </w:rPr>
+      </w:pPr>
+      <w:r>
+        <w:rPr>
+          <w:rFonts w:ascii="Arial" w:hAnsi="Arial" w:cs="Arial"/>
         </w:rPr>
         <w:t>Office: H-108</w:t>
       </w:r>
@@ -288,31 +230,23 @@
       <w:pPr>
         <w:rPr>
           <w:rFonts w:ascii="Arial" w:hAnsi="Arial" w:cs="Arial"/>
-          <w:sz w:val="24"/>
-          <w:szCs w:val="24"/>
-        </w:rPr>
-      </w:pPr>
-      <w:r>
-        <w:rPr>
-          <w:rFonts w:ascii="Arial" w:hAnsi="Arial" w:cs="Arial"/>
-          <w:sz w:val="24"/>
-          <w:szCs w:val="24"/>
+        </w:rPr>
+      </w:pPr>
+      <w:r>
+        <w:rPr>
+          <w:rFonts w:ascii="Arial" w:hAnsi="Arial" w:cs="Arial"/>
         </w:rPr>
         <w:t xml:space="preserve">Phone: </w:t>
       </w:r>
       <w:r>
         <w:rPr>
           <w:rFonts w:ascii="Arial" w:hAnsi="Arial" w:cs="Arial"/>
-          <w:sz w:val="24"/>
-          <w:szCs w:val="24"/>
         </w:rPr>
         <w:t xml:space="preserve">(201-684) </w:t>
       </w:r>
       <w:r>
         <w:rPr>
           <w:rFonts w:ascii="Arial" w:hAnsi="Arial" w:cs="Arial"/>
-          <w:sz w:val="24"/>
-          <w:szCs w:val="24"/>
         </w:rPr>
         <w:t>x7233</w:t>
       </w:r>
@@ -321,15 +255,11 @@
       <w:pPr>
         <w:rPr>
           <w:rFonts w:ascii="Arial" w:hAnsi="Arial" w:cs="Arial"/>
-          <w:sz w:val="24"/>
-          <w:szCs w:val="24"/>
-        </w:rPr>
-      </w:pPr>
-      <w:r>
-        <w:rPr>
-          <w:rFonts w:ascii="Arial" w:hAnsi="Arial" w:cs="Arial"/>
-          <w:sz w:val="24"/>
-          <w:szCs w:val="24"/>
+        </w:rPr>
+      </w:pPr>
+      <w:r>
+        <w:rPr>
+          <w:rFonts w:ascii="Arial" w:hAnsi="Arial" w:cs="Arial"/>
         </w:rPr>
         <w:t xml:space="preserve">Email: dfishkin@ramapo.edu </w:t>
       </w:r>
@@ -338,15 +268,11 @@
       <w:pPr>
         <w:rPr>
           <w:rFonts w:ascii="Arial" w:hAnsi="Arial" w:cs="Arial"/>
-          <w:sz w:val="24"/>
-          <w:szCs w:val="24"/>
-        </w:rPr>
-      </w:pPr>
-      <w:r>
-        <w:rPr>
-          <w:rFonts w:ascii="Arial" w:hAnsi="Arial" w:cs="Arial"/>
-          <w:sz w:val="24"/>
-          <w:szCs w:val="24"/>
+        </w:rPr>
+      </w:pPr>
+      <w:r>
+        <w:rPr>
+          <w:rFonts w:ascii="Arial" w:hAnsi="Arial" w:cs="Arial"/>
         </w:rPr>
         <w:t>Office Hours: Wednesday (by appointment) Thursday 1–3:30pm</w:t>
       </w:r>
@@ -355,8 +281,6 @@
       <w:pPr>
         <w:rPr>
           <w:rFonts w:ascii="Arial" w:hAnsi="Arial" w:cs="Arial"/>
-          <w:sz w:val="24"/>
-          <w:szCs w:val="24"/>
         </w:rPr>
       </w:pPr>
     </w:p>
@@ -366,8 +290,6 @@
           <w:rFonts w:ascii="Arial" w:hAnsi="Arial" w:cs="Arial"/>
           <w:bCs/>
           <w:color w:val="000000" w:themeColor="text1"/>
-          <w:sz w:val="24"/>
-          <w:szCs w:val="24"/>
           <w:u w:val="single"/>
         </w:rPr>
       </w:pPr>
@@ -376,8 +298,6 @@
           <w:rFonts w:ascii="Arial" w:hAnsi="Arial" w:cs="Arial"/>
           <w:bCs/>
           <w:color w:val="000000" w:themeColor="text1"/>
-          <w:sz w:val="24"/>
-          <w:szCs w:val="24"/>
           <w:u w:val="single"/>
         </w:rPr>
         <w:t>SYLLABUS IS SUBJECT TO REVISION DURING THE SEMESTER</w:t>
@@ -389,39 +309,30 @@
           <w:rFonts w:ascii="Arial" w:hAnsi="Arial" w:cs="Arial"/>
           <w:b/>
           <w:color w:val="000000" w:themeColor="text1"/>
-          <w:sz w:val="24"/>
-          <w:szCs w:val="24"/>
-        </w:rPr>
-      </w:pPr>
-      <w:r>
-        <w:rPr>
-          <w:rFonts w:ascii="Arial" w:hAnsi="Arial" w:cs="Arial"/>
-          <w:b/>
-          <w:color w:val="000000" w:themeColor="text1"/>
-          <w:sz w:val="24"/>
-          <w:szCs w:val="24"/>
+        </w:rPr>
+      </w:pPr>
+      <w:r>
+        <w:rPr>
+          <w:rFonts w:ascii="Arial" w:hAnsi="Arial" w:cs="Arial"/>
+          <w:b/>
+          <w:color w:val="000000" w:themeColor="text1"/>
         </w:rPr>
         <w:tab/>
       </w:r>
     </w:p>
     <w:p>
       <w:pPr>
-        <w:spacing w:line="240" w:lineRule="auto"/>
         <w:ind w:left="2160" w:hanging="2160"/>
         <w:rPr>
-          <w:rFonts w:ascii="Arial" w:eastAsia="Times New Roman" w:hAnsi="Arial" w:cs="Arial"/>
-          <w:color w:val="000000" w:themeColor="text1"/>
-          <w:sz w:val="24"/>
-          <w:szCs w:val="24"/>
-        </w:rPr>
-      </w:pPr>
-      <w:r>
-        <w:rPr>
-          <w:rFonts w:ascii="Arial" w:hAnsi="Arial" w:cs="Arial"/>
-          <w:iCs/>
-          <w:color w:val="000000" w:themeColor="text1"/>
-          <w:sz w:val="24"/>
-          <w:szCs w:val="24"/>
+          <w:rFonts w:ascii="Arial" w:hAnsi="Arial" w:cs="Arial"/>
+          <w:color w:val="000000" w:themeColor="text1"/>
+        </w:rPr>
+      </w:pPr>
+      <w:r>
+        <w:rPr>
+          <w:rFonts w:ascii="Arial" w:hAnsi="Arial" w:cs="Arial"/>
+          <w:iCs/>
+          <w:color w:val="000000" w:themeColor="text1"/>
         </w:rPr>
         <w:t>Course Description</w:t>
       </w:r>
@@ -430,8 +341,6 @@
           <w:rFonts w:ascii="Arial" w:hAnsi="Arial" w:cs="Arial"/>
           <w:iCs/>
           <w:color w:val="000000" w:themeColor="text1"/>
-          <w:sz w:val="24"/>
-          <w:szCs w:val="24"/>
         </w:rPr>
         <w:t>:</w:t>
       </w:r>
@@ -440,125 +349,97 @@
           <w:rFonts w:ascii="Arial" w:hAnsi="Arial" w:cs="Arial"/>
           <w:i/>
           <w:color w:val="000000" w:themeColor="text1"/>
-          <w:sz w:val="24"/>
-          <w:szCs w:val="24"/>
         </w:rPr>
         <w:tab/>
       </w:r>
       <w:r>
         <w:rPr>
-          <w:rFonts w:ascii="Arial" w:eastAsia="Times New Roman" w:hAnsi="Arial" w:cs="Arial"/>
-          <w:color w:val="000000" w:themeColor="text1"/>
-          <w:sz w:val="24"/>
-          <w:szCs w:val="24"/>
+          <w:rFonts w:ascii="Arial" w:hAnsi="Arial" w:cs="Arial"/>
+          <w:color w:val="000000" w:themeColor="text1"/>
         </w:rPr>
         <w:t xml:space="preserve">This course provides a foundational introduction to music programming languages. </w:t>
       </w:r>
       <w:proofErr w:type="spellStart"/>
       <w:r>
         <w:rPr>
-          <w:rFonts w:ascii="Arial" w:eastAsia="Times New Roman" w:hAnsi="Arial" w:cs="Arial"/>
-          <w:color w:val="000000" w:themeColor="text1"/>
-          <w:sz w:val="24"/>
-          <w:szCs w:val="24"/>
+          <w:rFonts w:ascii="Arial" w:hAnsi="Arial" w:cs="Arial"/>
+          <w:color w:val="000000" w:themeColor="text1"/>
         </w:rPr>
         <w:t>SuperCollider</w:t>
       </w:r>
       <w:proofErr w:type="spellEnd"/>
       <w:r>
         <w:rPr>
-          <w:rFonts w:ascii="Arial" w:eastAsia="Times New Roman" w:hAnsi="Arial" w:cs="Arial"/>
-          <w:color w:val="000000" w:themeColor="text1"/>
-          <w:sz w:val="24"/>
-          <w:szCs w:val="24"/>
+          <w:rFonts w:ascii="Arial" w:hAnsi="Arial" w:cs="Arial"/>
+          <w:color w:val="000000" w:themeColor="text1"/>
         </w:rPr>
         <w:t xml:space="preserve">, </w:t>
       </w:r>
       <w:r>
         <w:rPr>
-          <w:rFonts w:ascii="Arial" w:eastAsia="Times New Roman" w:hAnsi="Arial" w:cs="Arial"/>
-          <w:color w:val="000000" w:themeColor="text1"/>
-          <w:sz w:val="24"/>
-          <w:szCs w:val="24"/>
+          <w:rFonts w:ascii="Arial" w:hAnsi="Arial" w:cs="Arial"/>
+          <w:color w:val="000000" w:themeColor="text1"/>
         </w:rPr>
         <w:t>Max, Arduino</w:t>
       </w:r>
       <w:r>
         <w:rPr>
-          <w:rFonts w:ascii="Arial" w:eastAsia="Times New Roman" w:hAnsi="Arial" w:cs="Arial"/>
-          <w:color w:val="000000" w:themeColor="text1"/>
-          <w:sz w:val="24"/>
-          <w:szCs w:val="24"/>
+          <w:rFonts w:ascii="Arial" w:hAnsi="Arial" w:cs="Arial"/>
+          <w:color w:val="000000" w:themeColor="text1"/>
         </w:rPr>
         <w:t xml:space="preserve">, </w:t>
       </w:r>
       <w:r>
         <w:rPr>
-          <w:rFonts w:ascii="Arial" w:eastAsia="Times New Roman" w:hAnsi="Arial" w:cs="Arial"/>
-          <w:color w:val="000000" w:themeColor="text1"/>
-          <w:sz w:val="24"/>
-          <w:szCs w:val="24"/>
+          <w:rFonts w:ascii="Arial" w:hAnsi="Arial" w:cs="Arial"/>
+          <w:color w:val="000000" w:themeColor="text1"/>
         </w:rPr>
         <w:t>p5js</w:t>
       </w:r>
       <w:r>
         <w:rPr>
-          <w:rFonts w:ascii="Arial" w:eastAsia="Times New Roman" w:hAnsi="Arial" w:cs="Arial"/>
-          <w:color w:val="000000" w:themeColor="text1"/>
-          <w:sz w:val="24"/>
-          <w:szCs w:val="24"/>
+          <w:rFonts w:ascii="Arial" w:hAnsi="Arial" w:cs="Arial"/>
+          <w:color w:val="000000" w:themeColor="text1"/>
         </w:rPr>
         <w:t xml:space="preserve"> and </w:t>
       </w:r>
       <w:r>
         <w:rPr>
-          <w:rFonts w:ascii="Arial" w:eastAsia="Times New Roman" w:hAnsi="Arial" w:cs="Arial"/>
-          <w:color w:val="000000" w:themeColor="text1"/>
-          <w:sz w:val="24"/>
-          <w:szCs w:val="24"/>
+          <w:rFonts w:ascii="Arial" w:hAnsi="Arial" w:cs="Arial"/>
+          <w:color w:val="000000" w:themeColor="text1"/>
         </w:rPr>
         <w:t>straight C</w:t>
       </w:r>
       <w:r>
         <w:rPr>
-          <w:rFonts w:ascii="Arial" w:eastAsia="Times New Roman" w:hAnsi="Arial" w:cs="Arial"/>
-          <w:color w:val="000000" w:themeColor="text1"/>
-          <w:sz w:val="24"/>
-          <w:szCs w:val="24"/>
+          <w:rFonts w:ascii="Arial" w:hAnsi="Arial" w:cs="Arial"/>
+          <w:color w:val="000000" w:themeColor="text1"/>
         </w:rPr>
         <w:t xml:space="preserve"> will be explored through hands-on and creative applications. Students will gain experience with interactive visual art, audio/music signal processing, and machine learning. </w:t>
       </w:r>
     </w:p>
     <w:p>
       <w:pPr>
-        <w:spacing w:line="240" w:lineRule="auto"/>
         <w:ind w:left="2160"/>
         <w:rPr>
-          <w:rFonts w:ascii="Arial" w:eastAsia="Times New Roman" w:hAnsi="Arial" w:cs="Arial"/>
-          <w:color w:val="000000" w:themeColor="text1"/>
-          <w:sz w:val="24"/>
-          <w:szCs w:val="24"/>
-        </w:rPr>
-      </w:pPr>
-    </w:p>
-    <w:p>
-      <w:pPr>
-        <w:spacing w:line="240" w:lineRule="auto"/>
+          <w:rFonts w:ascii="Arial" w:hAnsi="Arial" w:cs="Arial"/>
+          <w:color w:val="000000" w:themeColor="text1"/>
+        </w:rPr>
+      </w:pPr>
+    </w:p>
+    <w:p>
+      <w:pPr>
         <w:ind w:left="2160"/>
         <w:rPr>
           <w:rFonts w:ascii="Arial" w:hAnsi="Arial" w:cs="Arial"/>
           <w:i/>
           <w:color w:val="000000" w:themeColor="text1"/>
-          <w:sz w:val="24"/>
-          <w:szCs w:val="24"/>
-        </w:rPr>
-      </w:pPr>
-      <w:r>
-        <w:rPr>
-          <w:rFonts w:ascii="Arial" w:eastAsia="Times New Roman" w:hAnsi="Arial" w:cs="Arial"/>
-          <w:color w:val="000000" w:themeColor="text1"/>
-          <w:sz w:val="24"/>
-          <w:szCs w:val="24"/>
+        </w:rPr>
+      </w:pPr>
+      <w:r>
+        <w:rPr>
+          <w:rFonts w:ascii="Arial" w:hAnsi="Arial" w:cs="Arial"/>
+          <w:color w:val="000000" w:themeColor="text1"/>
         </w:rPr>
         <w:t>This course does not provide a thorough introduction to any single computing language. Rather, it expects an encourages a humanistic approach translating higher level concepts of art to lower and very low levels of applications specific to your intent.</w:t>
       </w:r>
@@ -568,26 +449,20 @@
         <w:rPr>
           <w:rFonts w:ascii="Arial" w:hAnsi="Arial" w:cs="Arial"/>
           <w:color w:val="000000" w:themeColor="text1"/>
-          <w:sz w:val="24"/>
-          <w:szCs w:val="24"/>
-        </w:rPr>
-      </w:pPr>
-    </w:p>
-    <w:p>
-      <w:pPr>
-        <w:rPr>
-          <w:rFonts w:ascii="Arial" w:hAnsi="Arial" w:cs="Arial"/>
-          <w:color w:val="000000" w:themeColor="text1"/>
-          <w:sz w:val="24"/>
-          <w:szCs w:val="24"/>
-        </w:rPr>
-      </w:pPr>
-      <w:r>
-        <w:rPr>
-          <w:rFonts w:ascii="Arial" w:hAnsi="Arial" w:cs="Arial"/>
-          <w:color w:val="000000" w:themeColor="text1"/>
-          <w:sz w:val="24"/>
-          <w:szCs w:val="24"/>
+        </w:rPr>
+      </w:pPr>
+    </w:p>
+    <w:p>
+      <w:pPr>
+        <w:rPr>
+          <w:rFonts w:ascii="Arial" w:hAnsi="Arial" w:cs="Arial"/>
+          <w:color w:val="000000" w:themeColor="text1"/>
+        </w:rPr>
+      </w:pPr>
+      <w:r>
+        <w:rPr>
+          <w:rFonts w:ascii="Arial" w:hAnsi="Arial" w:cs="Arial"/>
+          <w:color w:val="000000" w:themeColor="text1"/>
         </w:rPr>
         <w:t xml:space="preserve">Course Instructor: </w:t>
       </w:r>
@@ -595,8 +470,6 @@
         <w:rPr>
           <w:rFonts w:ascii="Arial" w:hAnsi="Arial" w:cs="Arial"/>
           <w:color w:val="000000" w:themeColor="text1"/>
-          <w:sz w:val="24"/>
-          <w:szCs w:val="24"/>
         </w:rPr>
         <w:tab/>
         <w:t>Daniel Fishkin</w:t>
@@ -607,8 +480,6 @@
         <w:rPr>
           <w:rFonts w:ascii="Arial" w:hAnsi="Arial" w:cs="Arial"/>
           <w:color w:val="000000" w:themeColor="text1"/>
-          <w:sz w:val="24"/>
-          <w:szCs w:val="24"/>
         </w:rPr>
       </w:pPr>
     </w:p>
@@ -620,17 +491,13 @@
         <w:rPr>
           <w:rFonts w:ascii="Arial" w:hAnsi="Arial" w:cs="Arial"/>
           <w:color w:val="000000" w:themeColor="text1"/>
-          <w:sz w:val="24"/>
-          <w:szCs w:val="24"/>
-        </w:rPr>
-      </w:pPr>
-      <w:r>
-        <w:rPr>
-          <w:rFonts w:ascii="Arial" w:hAnsi="Arial" w:cs="Arial"/>
-          <w:i/>
-          <w:color w:val="000000" w:themeColor="text1"/>
-          <w:sz w:val="24"/>
-          <w:szCs w:val="24"/>
+        </w:rPr>
+      </w:pPr>
+      <w:r>
+        <w:rPr>
+          <w:rFonts w:ascii="Arial" w:hAnsi="Arial" w:cs="Arial"/>
+          <w:i/>
+          <w:color w:val="000000" w:themeColor="text1"/>
         </w:rPr>
         <w:t>Lecture</w:t>
       </w:r>
@@ -639,8 +506,6 @@
           <w:rFonts w:ascii="Arial" w:hAnsi="Arial" w:cs="Arial"/>
           <w:i/>
           <w:color w:val="000000" w:themeColor="text1"/>
-          <w:sz w:val="24"/>
-          <w:szCs w:val="24"/>
         </w:rPr>
         <w:t xml:space="preserve"> Time</w:t>
       </w:r>
@@ -649,8 +514,6 @@
           <w:rFonts w:ascii="Arial" w:hAnsi="Arial" w:cs="Arial"/>
           <w:i/>
           <w:color w:val="000000" w:themeColor="text1"/>
-          <w:sz w:val="24"/>
-          <w:szCs w:val="24"/>
         </w:rPr>
         <w:t>:</w:t>
       </w:r>
@@ -658,8 +521,6 @@
         <w:rPr>
           <w:rFonts w:ascii="Arial" w:hAnsi="Arial" w:cs="Arial"/>
           <w:color w:val="000000" w:themeColor="text1"/>
-          <w:sz w:val="24"/>
-          <w:szCs w:val="24"/>
         </w:rPr>
         <w:tab/>
       </w:r>
@@ -667,8 +528,6 @@
         <w:rPr>
           <w:rFonts w:ascii="Arial" w:hAnsi="Arial" w:cs="Arial"/>
           <w:color w:val="000000" w:themeColor="text1"/>
-          <w:sz w:val="24"/>
-          <w:szCs w:val="24"/>
         </w:rPr>
         <w:t>Wednesdays</w:t>
       </w:r>
@@ -676,8 +535,6 @@
         <w:rPr>
           <w:rFonts w:ascii="Arial" w:hAnsi="Arial" w:cs="Arial"/>
           <w:color w:val="000000" w:themeColor="text1"/>
-          <w:sz w:val="24"/>
-          <w:szCs w:val="24"/>
         </w:rPr>
         <w:t>, 6:05 pm — 9:35 pm</w:t>
       </w:r>
@@ -690,8 +547,6 @@
         <w:rPr>
           <w:rFonts w:ascii="Arial" w:hAnsi="Arial" w:cs="Arial"/>
           <w:color w:val="000000" w:themeColor="text1"/>
-          <w:sz w:val="24"/>
-          <w:szCs w:val="24"/>
         </w:rPr>
       </w:pPr>
     </w:p>
@@ -703,17 +558,13 @@
         <w:rPr>
           <w:rFonts w:ascii="Arial" w:hAnsi="Arial" w:cs="Arial"/>
           <w:color w:val="000000" w:themeColor="text1"/>
-          <w:sz w:val="24"/>
-          <w:szCs w:val="24"/>
-        </w:rPr>
-      </w:pPr>
-      <w:r>
-        <w:rPr>
-          <w:rFonts w:ascii="Arial" w:hAnsi="Arial" w:cs="Arial"/>
-          <w:i/>
-          <w:color w:val="000000" w:themeColor="text1"/>
-          <w:sz w:val="24"/>
-          <w:szCs w:val="24"/>
+        </w:rPr>
+      </w:pPr>
+      <w:r>
+        <w:rPr>
+          <w:rFonts w:ascii="Arial" w:hAnsi="Arial" w:cs="Arial"/>
+          <w:i/>
+          <w:color w:val="000000" w:themeColor="text1"/>
         </w:rPr>
         <w:t>Lecture Location:</w:t>
       </w:r>
@@ -721,8 +572,6 @@
         <w:rPr>
           <w:rFonts w:ascii="Arial" w:hAnsi="Arial" w:cs="Arial"/>
           <w:color w:val="000000" w:themeColor="text1"/>
-          <w:sz w:val="24"/>
-          <w:szCs w:val="24"/>
         </w:rPr>
         <w:tab/>
       </w:r>
@@ -730,24 +579,18 @@
         <w:rPr>
           <w:rFonts w:ascii="Arial" w:hAnsi="Arial" w:cs="Arial"/>
           <w:color w:val="000000" w:themeColor="text1"/>
-          <w:sz w:val="24"/>
-          <w:szCs w:val="24"/>
         </w:rPr>
         <w:t xml:space="preserve">Electronic Music Lab, </w:t>
       </w:r>
       <w:r>
         <w:rPr>
           <w:rFonts w:ascii="Arial" w:hAnsi="Arial" w:cs="Arial"/>
-          <w:sz w:val="24"/>
-          <w:szCs w:val="24"/>
         </w:rPr>
         <w:t>H-Wing 204</w:t>
       </w:r>
       <w:r>
         <w:rPr>
           <w:rFonts w:ascii="Arial" w:hAnsi="Arial" w:cs="Arial"/>
-          <w:sz w:val="24"/>
-          <w:szCs w:val="24"/>
         </w:rPr>
         <w:t xml:space="preserve"> or remote.</w:t>
       </w:r>
@@ -760,8 +603,6 @@
         <w:rPr>
           <w:rFonts w:ascii="Arial" w:hAnsi="Arial" w:cs="Arial"/>
           <w:color w:val="000000" w:themeColor="text1"/>
-          <w:sz w:val="24"/>
-          <w:szCs w:val="24"/>
         </w:rPr>
       </w:pPr>
     </w:p>
@@ -773,17 +614,13 @@
         <w:rPr>
           <w:rFonts w:ascii="Arial" w:hAnsi="Arial" w:cs="Arial"/>
           <w:color w:val="000000" w:themeColor="text1"/>
-          <w:sz w:val="24"/>
-          <w:szCs w:val="24"/>
-        </w:rPr>
-      </w:pPr>
-      <w:r>
-        <w:rPr>
-          <w:rFonts w:ascii="Arial" w:hAnsi="Arial" w:cs="Arial"/>
-          <w:i/>
-          <w:color w:val="000000" w:themeColor="text1"/>
-          <w:sz w:val="24"/>
-          <w:szCs w:val="24"/>
+        </w:rPr>
+      </w:pPr>
+      <w:r>
+        <w:rPr>
+          <w:rFonts w:ascii="Arial" w:hAnsi="Arial" w:cs="Arial"/>
+          <w:i/>
+          <w:color w:val="000000" w:themeColor="text1"/>
         </w:rPr>
         <w:t>Instructor:</w:t>
       </w:r>
@@ -791,8 +628,6 @@
         <w:rPr>
           <w:rFonts w:ascii="Arial" w:hAnsi="Arial" w:cs="Arial"/>
           <w:color w:val="000000" w:themeColor="text1"/>
-          <w:sz w:val="24"/>
-          <w:szCs w:val="24"/>
         </w:rPr>
         <w:t xml:space="preserve"> </w:t>
       </w:r>
@@ -800,8 +635,6 @@
         <w:rPr>
           <w:rFonts w:ascii="Arial" w:hAnsi="Arial" w:cs="Arial"/>
           <w:color w:val="000000" w:themeColor="text1"/>
-          <w:sz w:val="24"/>
-          <w:szCs w:val="24"/>
         </w:rPr>
         <w:tab/>
       </w:r>
@@ -809,8 +642,6 @@
         <w:rPr>
           <w:rFonts w:ascii="Arial" w:hAnsi="Arial" w:cs="Arial"/>
           <w:color w:val="000000" w:themeColor="text1"/>
-          <w:sz w:val="24"/>
-          <w:szCs w:val="24"/>
         </w:rPr>
         <w:t>Daniel Fishkin</w:t>
       </w:r>
@@ -823,17 +654,13 @@
         <w:rPr>
           <w:rFonts w:ascii="Arial" w:hAnsi="Arial" w:cs="Arial"/>
           <w:color w:val="000000" w:themeColor="text1"/>
-          <w:sz w:val="24"/>
-          <w:szCs w:val="24"/>
-        </w:rPr>
-      </w:pPr>
-      <w:r>
-        <w:rPr>
-          <w:rFonts w:ascii="Arial" w:hAnsi="Arial" w:cs="Arial"/>
-          <w:i/>
-          <w:color w:val="000000" w:themeColor="text1"/>
-          <w:sz w:val="24"/>
-          <w:szCs w:val="24"/>
+        </w:rPr>
+      </w:pPr>
+      <w:r>
+        <w:rPr>
+          <w:rFonts w:ascii="Arial" w:hAnsi="Arial" w:cs="Arial"/>
+          <w:i/>
+          <w:color w:val="000000" w:themeColor="text1"/>
         </w:rPr>
         <w:t>Office Hours:</w:t>
       </w:r>
@@ -841,8 +668,6 @@
         <w:rPr>
           <w:rFonts w:ascii="Arial" w:hAnsi="Arial" w:cs="Arial"/>
           <w:color w:val="000000" w:themeColor="text1"/>
-          <w:sz w:val="24"/>
-          <w:szCs w:val="24"/>
         </w:rPr>
         <w:t xml:space="preserve">  </w:t>
       </w:r>
@@ -850,8 +675,6 @@
         <w:rPr>
           <w:rFonts w:ascii="Arial" w:hAnsi="Arial" w:cs="Arial"/>
           <w:color w:val="000000" w:themeColor="text1"/>
-          <w:sz w:val="24"/>
-          <w:szCs w:val="24"/>
         </w:rPr>
         <w:tab/>
       </w:r>
@@ -860,8 +683,6 @@
           <w:rFonts w:ascii="Arial" w:hAnsi="Arial" w:cs="Arial"/>
           <w:b/>
           <w:color w:val="000000" w:themeColor="text1"/>
-          <w:sz w:val="24"/>
-          <w:szCs w:val="24"/>
         </w:rPr>
         <w:t xml:space="preserve">by appointment </w:t>
       </w:r>
@@ -870,8 +691,6 @@
           <w:rFonts w:ascii="Arial" w:hAnsi="Arial" w:cs="Arial"/>
           <w:b/>
           <w:color w:val="000000" w:themeColor="text1"/>
-          <w:sz w:val="24"/>
-          <w:szCs w:val="24"/>
         </w:rPr>
         <w:t>(IRL or Remote)</w:t>
       </w:r>
@@ -885,17 +704,13 @@
           <w:rStyle w:val="Hyperlink"/>
           <w:rFonts w:ascii="Arial" w:hAnsi="Arial" w:cs="Arial"/>
           <w:color w:val="000000" w:themeColor="text1"/>
-          <w:sz w:val="24"/>
-          <w:szCs w:val="24"/>
-        </w:rPr>
-      </w:pPr>
-      <w:r>
-        <w:rPr>
-          <w:rFonts w:ascii="Arial" w:hAnsi="Arial" w:cs="Arial"/>
-          <w:i/>
-          <w:color w:val="000000" w:themeColor="text1"/>
-          <w:sz w:val="24"/>
-          <w:szCs w:val="24"/>
+        </w:rPr>
+      </w:pPr>
+      <w:r>
+        <w:rPr>
+          <w:rFonts w:ascii="Arial" w:hAnsi="Arial" w:cs="Arial"/>
+          <w:i/>
+          <w:color w:val="000000" w:themeColor="text1"/>
         </w:rPr>
         <w:t>E-mail:</w:t>
       </w:r>
@@ -903,8 +718,6 @@
         <w:rPr>
           <w:rFonts w:ascii="Arial" w:hAnsi="Arial" w:cs="Arial"/>
           <w:color w:val="000000" w:themeColor="text1"/>
-          <w:sz w:val="24"/>
-          <w:szCs w:val="24"/>
         </w:rPr>
         <w:t xml:space="preserve">  </w:t>
       </w:r>
@@ -912,8 +725,6 @@
         <w:rPr>
           <w:rFonts w:ascii="Arial" w:hAnsi="Arial" w:cs="Arial"/>
           <w:color w:val="000000" w:themeColor="text1"/>
-          <w:sz w:val="24"/>
-          <w:szCs w:val="24"/>
         </w:rPr>
         <w:tab/>
       </w:r>
@@ -923,8 +734,6 @@
             <w:rStyle w:val="Hyperlink"/>
             <w:rFonts w:ascii="Arial" w:hAnsi="Arial" w:cs="Arial"/>
             <w:color w:val="000000" w:themeColor="text1"/>
-            <w:sz w:val="24"/>
-            <w:szCs w:val="24"/>
           </w:rPr>
           <w:t>daniel.fiction@gmail.com</w:t>
         </w:r>
@@ -939,8 +748,6 @@
           <w:rStyle w:val="Hyperlink"/>
           <w:rFonts w:ascii="Arial" w:hAnsi="Arial" w:cs="Arial"/>
           <w:color w:val="000000" w:themeColor="text1"/>
-          <w:sz w:val="24"/>
-          <w:szCs w:val="24"/>
         </w:rPr>
       </w:pPr>
       <w:r>
@@ -948,8 +755,6 @@
           <w:rStyle w:val="Hyperlink"/>
           <w:rFonts w:ascii="Arial" w:hAnsi="Arial" w:cs="Arial"/>
           <w:color w:val="000000" w:themeColor="text1"/>
-          <w:sz w:val="24"/>
-          <w:szCs w:val="24"/>
           <w:u w:val="none"/>
         </w:rPr>
         <w:tab/>
@@ -959,8 +764,6 @@
           <w:rStyle w:val="Hyperlink"/>
           <w:rFonts w:ascii="Arial" w:hAnsi="Arial" w:cs="Arial"/>
           <w:color w:val="000000" w:themeColor="text1"/>
-          <w:sz w:val="24"/>
-          <w:szCs w:val="24"/>
         </w:rPr>
         <w:t>dfishkin@ramapo.edu</w:t>
       </w:r>
@@ -973,8 +776,6 @@
           <w:i/>
           <w:iCs/>
           <w:color w:val="000000" w:themeColor="text1"/>
-          <w:sz w:val="24"/>
-          <w:szCs w:val="24"/>
         </w:rPr>
       </w:pPr>
     </w:p>
@@ -984,8 +785,6 @@
         <w:spacing w:line="480" w:lineRule="auto"/>
         <w:rPr>
           <w:bCs/>
-          <w:i/>
-          <w:iCs/>
           <w:color w:val="000000" w:themeColor="text1"/>
           <w:sz w:val="24"/>
           <w:szCs w:val="24"/>
@@ -1049,7 +848,6 @@
           <w:i/>
           <w:color w:val="000000" w:themeColor="text1"/>
         </w:rPr>
-        <w:lastRenderedPageBreak/>
         <w:t>T</w:t>
       </w:r>
       <w:r>
@@ -1135,34 +933,28 @@
     </w:p>
     <w:p>
       <w:pPr>
-        <w:spacing w:line="240" w:lineRule="auto"/>
         <w:ind w:left="2160"/>
         <w:rPr>
-          <w:rFonts w:ascii="Arial" w:eastAsia="Times New Roman" w:hAnsi="Arial" w:cs="Arial"/>
-          <w:i/>
-          <w:iCs/>
-          <w:color w:val="000000" w:themeColor="text1"/>
-          <w:sz w:val="24"/>
-          <w:szCs w:val="24"/>
-        </w:rPr>
-      </w:pPr>
-      <w:r>
-        <w:rPr>
-          <w:rFonts w:ascii="Arial" w:eastAsia="Times New Roman" w:hAnsi="Arial" w:cs="Arial"/>
-          <w:color w:val="000000" w:themeColor="text1"/>
-          <w:sz w:val="24"/>
-          <w:szCs w:val="24"/>
-        </w:rPr>
+          <w:rFonts w:ascii="Arial" w:hAnsi="Arial" w:cs="Arial"/>
+          <w:i/>
+          <w:iCs/>
+          <w:color w:val="000000" w:themeColor="text1"/>
+        </w:rPr>
+      </w:pPr>
+      <w:r>
+        <w:rPr>
+          <w:rFonts w:ascii="Arial" w:hAnsi="Arial" w:cs="Arial"/>
+          <w:color w:val="000000" w:themeColor="text1"/>
+        </w:rPr>
+        <w:lastRenderedPageBreak/>
         <w:t xml:space="preserve">Shiffman, Daniel. </w:t>
       </w:r>
       <w:r>
         <w:rPr>
-          <w:rFonts w:ascii="Arial" w:eastAsia="Times New Roman" w:hAnsi="Arial" w:cs="Arial"/>
-          <w:i/>
-          <w:iCs/>
-          <w:color w:val="000000" w:themeColor="text1"/>
-          <w:sz w:val="24"/>
-          <w:szCs w:val="24"/>
+          <w:rFonts w:ascii="Arial" w:hAnsi="Arial" w:cs="Arial"/>
+          <w:i/>
+          <w:iCs/>
+          <w:color w:val="000000" w:themeColor="text1"/>
         </w:rPr>
         <w:t>The Nature of Code. Creative Commons. 2012. 0985930802</w:t>
       </w:r>
@@ -1186,49 +978,39 @@
         <w:ind w:left="2880" w:hanging="2880"/>
         <w:rPr>
           <w:rFonts w:ascii="Arial" w:hAnsi="Arial" w:cs="Arial"/>
-          <w:sz w:val="24"/>
-          <w:szCs w:val="24"/>
-        </w:rPr>
-      </w:pPr>
-      <w:r>
-        <w:rPr>
-          <w:rFonts w:ascii="Arial" w:eastAsia="Times New Roman" w:hAnsi="Arial" w:cs="Arial"/>
+        </w:rPr>
+      </w:pPr>
+      <w:r>
+        <w:rPr>
+          <w:rFonts w:ascii="Arial" w:hAnsi="Arial" w:cs="Arial"/>
           <w:color w:val="000000"/>
-          <w:sz w:val="24"/>
-          <w:szCs w:val="24"/>
         </w:rPr>
         <w:t>Software</w:t>
       </w:r>
       <w:r>
         <w:rPr>
-          <w:rFonts w:ascii="Arial" w:eastAsia="Times New Roman" w:hAnsi="Arial" w:cs="Arial"/>
+          <w:rFonts w:ascii="Arial" w:hAnsi="Arial" w:cs="Arial"/>
           <w:b/>
           <w:bCs/>
           <w:color w:val="000000"/>
-          <w:sz w:val="24"/>
-          <w:szCs w:val="24"/>
         </w:rPr>
         <w:t xml:space="preserve"> </w:t>
       </w:r>
       <w:r>
         <w:rPr>
-          <w:rFonts w:ascii="Arial" w:eastAsia="Times New Roman" w:hAnsi="Arial" w:cs="Arial"/>
+          <w:rFonts w:ascii="Arial" w:hAnsi="Arial" w:cs="Arial"/>
           <w:b/>
           <w:bCs/>
           <w:color w:val="000000"/>
-          <w:sz w:val="24"/>
-          <w:szCs w:val="24"/>
         </w:rPr>
         <w:tab/>
       </w:r>
       <w:r>
         <w:rPr>
-          <w:rFonts w:ascii="Arial" w:eastAsia="Times New Roman" w:hAnsi="Arial" w:cs="Arial"/>
+          <w:rFonts w:ascii="Arial" w:hAnsi="Arial" w:cs="Arial"/>
           <w:b/>
           <w:bCs/>
           <w:color w:val="000000"/>
-          <w:sz w:val="24"/>
-          <w:szCs w:val="24"/>
         </w:rPr>
         <w:t>Max</w:t>
       </w:r>
@@ -1237,19 +1019,15 @@
       <w:pPr>
         <w:ind w:left="1440" w:firstLine="720"/>
         <w:rPr>
-          <w:rFonts w:ascii="Arial" w:eastAsia="Times New Roman" w:hAnsi="Arial" w:cs="Arial"/>
+          <w:rFonts w:ascii="Arial" w:hAnsi="Arial" w:cs="Arial"/>
           <w:color w:val="000000"/>
-          <w:sz w:val="24"/>
-          <w:szCs w:val="24"/>
         </w:rPr>
       </w:pPr>
       <w:hyperlink r:id="rId11" w:history="1">
         <w:r>
           <w:rPr>
             <w:rStyle w:val="Hyperlink"/>
-            <w:rFonts w:ascii="Arial" w:eastAsia="Times New Roman" w:hAnsi="Arial" w:cs="Arial"/>
-            <w:sz w:val="24"/>
-            <w:szCs w:val="24"/>
+            <w:rFonts w:ascii="Arial" w:hAnsi="Arial" w:cs="Arial"/>
           </w:rPr>
           <w:t>https://cycling74.com/</w:t>
         </w:r>
@@ -1259,18 +1037,14 @@
       <w:pPr>
         <w:ind w:left="2160"/>
         <w:rPr>
-          <w:rFonts w:ascii="Arial" w:eastAsia="Times New Roman" w:hAnsi="Arial" w:cs="Arial"/>
+          <w:rFonts w:ascii="Arial" w:hAnsi="Arial" w:cs="Arial"/>
           <w:color w:val="000000"/>
-          <w:sz w:val="24"/>
-          <w:szCs w:val="24"/>
-        </w:rPr>
-      </w:pPr>
-      <w:r>
-        <w:rPr>
-          <w:rFonts w:ascii="Arial" w:eastAsia="Times New Roman" w:hAnsi="Arial" w:cs="Arial"/>
+        </w:rPr>
+      </w:pPr>
+      <w:r>
+        <w:rPr>
+          <w:rFonts w:ascii="Arial" w:hAnsi="Arial" w:cs="Arial"/>
           <w:color w:val="000000"/>
-          <w:sz w:val="24"/>
-          <w:szCs w:val="24"/>
         </w:rPr>
         <w:t>Max is an object-oriented programming language that makes easy prototyping of sound environments/instruments accessible without needing to learn to code on levels like JS or C. It is a type of coding language in its own way, but the coding is done primarily with virtual representations of wires. It’s very fun and many of my class demos will get you excited about what’s possible—download it and see what you can get working off the bat! </w:t>
       </w:r>
@@ -1279,22 +1053,18 @@
       <w:pPr>
         <w:ind w:left="2160"/>
         <w:rPr>
-          <w:rFonts w:ascii="Arial" w:eastAsia="Times New Roman" w:hAnsi="Arial" w:cs="Arial"/>
+          <w:rFonts w:ascii="Arial" w:hAnsi="Arial" w:cs="Arial"/>
           <w:i/>
           <w:iCs/>
           <w:color w:val="000000"/>
-          <w:sz w:val="24"/>
-          <w:szCs w:val="24"/>
-        </w:rPr>
-      </w:pPr>
-      <w:r>
-        <w:rPr>
-          <w:rFonts w:ascii="Arial" w:eastAsia="Times New Roman" w:hAnsi="Arial" w:cs="Arial"/>
+        </w:rPr>
+      </w:pPr>
+      <w:r>
+        <w:rPr>
+          <w:rFonts w:ascii="Arial" w:hAnsi="Arial" w:cs="Arial"/>
           <w:i/>
           <w:iCs/>
           <w:color w:val="000000"/>
-          <w:sz w:val="24"/>
-          <w:szCs w:val="24"/>
         </w:rPr>
         <w:t>Note: you can try Max for free for 30 days, and thereafter you’ll need to purchase it, or sign up for a monthly or yearly student subscription. It is affordable. Conn College has Max on every machine in the computer lab!</w:t>
       </w:r>
@@ -1303,57 +1073,47 @@
       <w:pPr>
         <w:ind w:left="2160"/>
         <w:rPr>
-          <w:rFonts w:ascii="Arial" w:eastAsia="Times New Roman" w:hAnsi="Arial" w:cs="Arial"/>
+          <w:rFonts w:ascii="Arial" w:hAnsi="Arial" w:cs="Arial"/>
           <w:b/>
           <w:iCs/>
           <w:color w:val="000000"/>
-          <w:sz w:val="24"/>
-          <w:szCs w:val="24"/>
-        </w:rPr>
-      </w:pPr>
-      <w:r>
-        <w:rPr>
-          <w:rFonts w:ascii="Arial" w:eastAsia="Times New Roman" w:hAnsi="Arial" w:cs="Arial"/>
+        </w:rPr>
+      </w:pPr>
+      <w:r>
+        <w:rPr>
+          <w:rFonts w:ascii="Arial" w:hAnsi="Arial" w:cs="Arial"/>
           <w:b/>
           <w:iCs/>
           <w:color w:val="000000"/>
-          <w:sz w:val="24"/>
-          <w:szCs w:val="24"/>
         </w:rPr>
         <w:t xml:space="preserve">Max comes with an extensive body of educational materials, tutorials, help files, and project examples that can easily be copy/pasted into your own sketches. </w:t>
       </w:r>
       <w:r>
         <w:rPr>
-          <w:rFonts w:ascii="Arial" w:eastAsia="Times New Roman" w:hAnsi="Arial" w:cs="Arial"/>
+          <w:rFonts w:ascii="Arial" w:hAnsi="Arial" w:cs="Arial"/>
           <w:iCs/>
           <w:color w:val="000000"/>
-          <w:sz w:val="24"/>
-          <w:szCs w:val="24"/>
           <w:u w:val="single"/>
         </w:rPr>
-        <w:t>Students will be expected to read and study Max / MSP tutorials on their own and learn the syntax of the software throughout the course of the semester!</w:t>
+        <w:t xml:space="preserve">Students will be expected to read and study Max / MSP tutorials on their own </w:t>
       </w:r>
     </w:p>
     <w:p>
       <w:pPr>
         <w:ind w:left="2160"/>
         <w:rPr>
-          <w:rFonts w:ascii="Arial" w:eastAsia="Times New Roman" w:hAnsi="Arial" w:cs="Arial"/>
+          <w:rFonts w:ascii="Arial" w:hAnsi="Arial" w:cs="Arial"/>
           <w:b/>
           <w:iCs/>
           <w:color w:val="000000"/>
-          <w:sz w:val="24"/>
-          <w:szCs w:val="24"/>
-        </w:rPr>
-      </w:pPr>
-      <w:r>
-        <w:rPr>
-          <w:rFonts w:ascii="Arial" w:eastAsia="Times New Roman" w:hAnsi="Arial" w:cs="Arial"/>
+        </w:rPr>
+      </w:pPr>
+      <w:r>
+        <w:rPr>
+          <w:rFonts w:ascii="Arial" w:hAnsi="Arial" w:cs="Arial"/>
           <w:b/>
           <w:iCs/>
           <w:color w:val="000000"/>
-          <w:sz w:val="24"/>
-          <w:szCs w:val="24"/>
         </w:rPr>
         <w:t>Enter the MAX file browser and search:</w:t>
       </w:r>
@@ -1362,35 +1122,29 @@
       <w:pPr>
         <w:ind w:left="2160"/>
         <w:rPr>
-          <w:rFonts w:ascii="Arial" w:eastAsia="Times New Roman" w:hAnsi="Arial" w:cs="Arial"/>
+          <w:rFonts w:ascii="Arial" w:hAnsi="Arial" w:cs="Arial"/>
           <w:b/>
           <w:iCs/>
           <w:color w:val="000000"/>
-          <w:sz w:val="24"/>
-          <w:szCs w:val="24"/>
         </w:rPr>
       </w:pPr>
       <w:proofErr w:type="spellStart"/>
       <w:r>
         <w:rPr>
-          <w:rFonts w:ascii="Arial" w:eastAsia="Times New Roman" w:hAnsi="Arial" w:cs="Arial"/>
+          <w:rFonts w:ascii="Arial" w:hAnsi="Arial" w:cs="Arial"/>
           <w:b/>
           <w:iCs/>
           <w:color w:val="000000"/>
-          <w:sz w:val="24"/>
-          <w:szCs w:val="24"/>
         </w:rPr>
         <w:t>collection:"Tutorials</w:t>
       </w:r>
       <w:proofErr w:type="spellEnd"/>
       <w:r>
         <w:rPr>
-          <w:rFonts w:ascii="Arial" w:eastAsia="Times New Roman" w:hAnsi="Arial" w:cs="Arial"/>
+          <w:rFonts w:ascii="Arial" w:hAnsi="Arial" w:cs="Arial"/>
           <w:b/>
           <w:iCs/>
           <w:color w:val="000000"/>
-          <w:sz w:val="24"/>
-          <w:szCs w:val="24"/>
         </w:rPr>
         <w:t>/Max Tutorials@cycling74"</w:t>
       </w:r>
@@ -1399,35 +1153,29 @@
       <w:pPr>
         <w:ind w:left="2160"/>
         <w:rPr>
-          <w:rFonts w:ascii="Arial" w:eastAsia="Times New Roman" w:hAnsi="Arial" w:cs="Arial"/>
+          <w:rFonts w:ascii="Arial" w:hAnsi="Arial" w:cs="Arial"/>
           <w:b/>
           <w:iCs/>
           <w:color w:val="000000"/>
-          <w:sz w:val="24"/>
-          <w:szCs w:val="24"/>
         </w:rPr>
       </w:pPr>
       <w:proofErr w:type="spellStart"/>
       <w:r>
         <w:rPr>
-          <w:rFonts w:ascii="Arial" w:eastAsia="Times New Roman" w:hAnsi="Arial" w:cs="Arial"/>
+          <w:rFonts w:ascii="Arial" w:hAnsi="Arial" w:cs="Arial"/>
           <w:b/>
           <w:iCs/>
           <w:color w:val="000000"/>
-          <w:sz w:val="24"/>
-          <w:szCs w:val="24"/>
         </w:rPr>
         <w:t>collection:"Tutorials</w:t>
       </w:r>
       <w:proofErr w:type="spellEnd"/>
       <w:r>
         <w:rPr>
-          <w:rFonts w:ascii="Arial" w:eastAsia="Times New Roman" w:hAnsi="Arial" w:cs="Arial"/>
+          <w:rFonts w:ascii="Arial" w:hAnsi="Arial" w:cs="Arial"/>
           <w:b/>
           <w:iCs/>
           <w:color w:val="000000"/>
-          <w:sz w:val="24"/>
-          <w:szCs w:val="24"/>
         </w:rPr>
         <w:t>/MSP Tutorials@cycling74"</w:t>
       </w:r>
@@ -1435,12 +1183,10 @@
     <w:p>
       <w:pPr>
         <w:rPr>
-          <w:rFonts w:ascii="Arial" w:eastAsia="Times New Roman" w:hAnsi="Arial" w:cs="Arial"/>
+          <w:rFonts w:ascii="Arial" w:hAnsi="Arial" w:cs="Arial"/>
           <w:b/>
           <w:bCs/>
           <w:color w:val="000000"/>
-          <w:sz w:val="24"/>
-          <w:szCs w:val="24"/>
         </w:rPr>
       </w:pPr>
     </w:p>
@@ -1448,22 +1194,18 @@
       <w:pPr>
         <w:ind w:left="1440" w:firstLine="720"/>
         <w:rPr>
-          <w:rFonts w:ascii="Arial" w:eastAsia="Times New Roman" w:hAnsi="Arial" w:cs="Arial"/>
+          <w:rFonts w:ascii="Arial" w:hAnsi="Arial" w:cs="Arial"/>
           <w:b/>
           <w:bCs/>
           <w:color w:val="000000"/>
-          <w:sz w:val="24"/>
-          <w:szCs w:val="24"/>
-        </w:rPr>
-      </w:pPr>
-      <w:r>
-        <w:rPr>
-          <w:rFonts w:ascii="Arial" w:eastAsia="Times New Roman" w:hAnsi="Arial" w:cs="Arial"/>
+        </w:rPr>
+      </w:pPr>
+      <w:r>
+        <w:rPr>
+          <w:rFonts w:ascii="Arial" w:hAnsi="Arial" w:cs="Arial"/>
           <w:b/>
           <w:bCs/>
           <w:color w:val="000000"/>
-          <w:sz w:val="24"/>
-          <w:szCs w:val="24"/>
         </w:rPr>
         <w:t>Supercollider</w:t>
       </w:r>
@@ -1472,21 +1214,17 @@
       <w:pPr>
         <w:ind w:left="1440" w:firstLine="720"/>
         <w:rPr>
-          <w:rFonts w:ascii="Arial" w:eastAsia="Times New Roman" w:hAnsi="Arial" w:cs="Arial"/>
+          <w:rFonts w:ascii="Arial" w:hAnsi="Arial" w:cs="Arial"/>
           <w:b/>
           <w:bCs/>
           <w:color w:val="000000"/>
-          <w:sz w:val="24"/>
-          <w:szCs w:val="24"/>
         </w:rPr>
       </w:pPr>
       <w:hyperlink r:id="rId12" w:history="1">
         <w:r>
           <w:rPr>
             <w:rStyle w:val="Hyperlink"/>
-            <w:rFonts w:ascii="Arial" w:eastAsia="Times New Roman" w:hAnsi="Arial" w:cs="Arial"/>
-            <w:sz w:val="24"/>
-            <w:szCs w:val="24"/>
+            <w:rFonts w:ascii="Arial" w:hAnsi="Arial" w:cs="Arial"/>
           </w:rPr>
           <w:t>https://supercollider.github.io/downloads.html</w:t>
         </w:r>
@@ -1496,18 +1234,14 @@
       <w:pPr>
         <w:ind w:left="2160" w:hanging="2070"/>
         <w:rPr>
-          <w:rFonts w:ascii="Arial" w:eastAsia="Times New Roman" w:hAnsi="Arial" w:cs="Arial"/>
+          <w:rFonts w:ascii="Arial" w:hAnsi="Arial" w:cs="Arial"/>
           <w:color w:val="000000"/>
-          <w:sz w:val="24"/>
-          <w:szCs w:val="24"/>
-        </w:rPr>
-      </w:pPr>
-      <w:r>
-        <w:rPr>
-          <w:rFonts w:ascii="Arial" w:eastAsia="Times New Roman" w:hAnsi="Arial" w:cs="Arial"/>
+        </w:rPr>
+      </w:pPr>
+      <w:r>
+        <w:rPr>
+          <w:rFonts w:ascii="Arial" w:hAnsi="Arial" w:cs="Arial"/>
           <w:color w:val="000000"/>
-          <w:sz w:val="24"/>
-          <w:szCs w:val="24"/>
         </w:rPr>
         <w:tab/>
         <w:t>Supercollider is a platform for audio synthesis and algorithmic composition, used by musicians, artists and researchers working with sound. It is code-based, completely free, light in size, and a little hard to work with.</w:t>
@@ -1516,27 +1250,21 @@
     <w:p>
       <w:pPr>
         <w:rPr>
-          <w:rFonts w:ascii="Arial" w:eastAsia="Times New Roman" w:hAnsi="Arial" w:cs="Arial"/>
+          <w:rFonts w:ascii="Arial" w:hAnsi="Arial" w:cs="Arial"/>
           <w:color w:val="000000"/>
-          <w:sz w:val="24"/>
-          <w:szCs w:val="24"/>
-        </w:rPr>
-      </w:pPr>
-      <w:r>
-        <w:rPr>
-          <w:rFonts w:ascii="Arial" w:eastAsia="Times New Roman" w:hAnsi="Arial" w:cs="Arial"/>
+        </w:rPr>
+      </w:pPr>
+      <w:r>
+        <w:rPr>
+          <w:rFonts w:ascii="Arial" w:hAnsi="Arial" w:cs="Arial"/>
           <w:color w:val="000000"/>
-          <w:sz w:val="24"/>
-          <w:szCs w:val="24"/>
         </w:rPr>
         <w:tab/>
       </w:r>
       <w:r>
         <w:rPr>
-          <w:rFonts w:ascii="Arial" w:eastAsia="Times New Roman" w:hAnsi="Arial" w:cs="Arial"/>
+          <w:rFonts w:ascii="Arial" w:hAnsi="Arial" w:cs="Arial"/>
           <w:color w:val="000000"/>
-          <w:sz w:val="24"/>
-          <w:szCs w:val="24"/>
         </w:rPr>
         <w:tab/>
       </w:r>
@@ -1545,20 +1273,16 @@
       <w:pPr>
         <w:ind w:left="1440" w:firstLine="720"/>
         <w:rPr>
-          <w:rFonts w:ascii="Arial" w:eastAsia="Times New Roman" w:hAnsi="Arial" w:cs="Arial"/>
+          <w:rFonts w:ascii="Arial" w:hAnsi="Arial" w:cs="Arial"/>
           <w:color w:val="000000"/>
-          <w:sz w:val="24"/>
-          <w:szCs w:val="24"/>
-        </w:rPr>
-      </w:pPr>
-      <w:r>
-        <w:rPr>
-          <w:rFonts w:ascii="Arial" w:eastAsia="Times New Roman" w:hAnsi="Arial" w:cs="Arial"/>
+        </w:rPr>
+      </w:pPr>
+      <w:r>
+        <w:rPr>
+          <w:rFonts w:ascii="Arial" w:hAnsi="Arial" w:cs="Arial"/>
           <w:b/>
           <w:bCs/>
           <w:color w:val="000000"/>
-          <w:sz w:val="24"/>
-          <w:szCs w:val="24"/>
         </w:rPr>
         <w:t>Spear</w:t>
       </w:r>
@@ -1567,19 +1291,15 @@
       <w:pPr>
         <w:ind w:left="1440" w:firstLine="720"/>
         <w:rPr>
-          <w:rFonts w:ascii="Arial" w:eastAsia="Times New Roman" w:hAnsi="Arial" w:cs="Arial"/>
+          <w:rFonts w:ascii="Arial" w:hAnsi="Arial" w:cs="Arial"/>
           <w:color w:val="000000"/>
-          <w:sz w:val="24"/>
-          <w:szCs w:val="24"/>
         </w:rPr>
       </w:pPr>
       <w:hyperlink r:id="rId13" w:history="1">
         <w:r>
           <w:rPr>
             <w:rStyle w:val="Hyperlink"/>
-            <w:rFonts w:ascii="Arial" w:eastAsia="Times New Roman" w:hAnsi="Arial" w:cs="Arial"/>
-            <w:sz w:val="24"/>
-            <w:szCs w:val="24"/>
+            <w:rFonts w:ascii="Arial" w:hAnsi="Arial" w:cs="Arial"/>
           </w:rPr>
           <w:t>https://www.klingbeil.com/spear/</w:t>
         </w:r>
@@ -1589,18 +1309,14 @@
       <w:pPr>
         <w:ind w:left="2160"/>
         <w:rPr>
-          <w:rFonts w:ascii="Arial" w:eastAsia="Times New Roman" w:hAnsi="Arial" w:cs="Arial"/>
+          <w:rFonts w:ascii="Arial" w:hAnsi="Arial" w:cs="Arial"/>
           <w:color w:val="000000"/>
-          <w:sz w:val="24"/>
-          <w:szCs w:val="24"/>
-        </w:rPr>
-      </w:pPr>
-      <w:r>
-        <w:rPr>
-          <w:rFonts w:ascii="Arial" w:eastAsia="Times New Roman" w:hAnsi="Arial" w:cs="Arial"/>
+        </w:rPr>
+      </w:pPr>
+      <w:r>
+        <w:rPr>
+          <w:rFonts w:ascii="Arial" w:hAnsi="Arial" w:cs="Arial"/>
           <w:color w:val="000000"/>
-          <w:sz w:val="24"/>
-          <w:szCs w:val="24"/>
         </w:rPr>
         <w:t>Spear performs Fourier Analysis in sound files. This is free software that allows you to turn recordings into individual sine waves and edit/select them.</w:t>
       </w:r>
@@ -1609,12 +1325,10 @@
       <w:pPr>
         <w:ind w:left="2160"/>
         <w:rPr>
-          <w:rFonts w:ascii="Arial" w:eastAsia="Times New Roman" w:hAnsi="Arial" w:cs="Arial"/>
+          <w:rFonts w:ascii="Arial" w:hAnsi="Arial" w:cs="Arial"/>
           <w:b/>
           <w:bCs/>
           <w:color w:val="000000"/>
-          <w:sz w:val="24"/>
-          <w:szCs w:val="24"/>
         </w:rPr>
       </w:pPr>
     </w:p>
@@ -1622,85 +1336,67 @@
       <w:pPr>
         <w:ind w:left="2160"/>
         <w:rPr>
-          <w:rFonts w:ascii="Arial" w:eastAsia="Times New Roman" w:hAnsi="Arial" w:cs="Arial"/>
+          <w:rFonts w:ascii="Arial" w:hAnsi="Arial" w:cs="Arial"/>
           <w:b/>
           <w:bCs/>
           <w:color w:val="000000"/>
-          <w:sz w:val="24"/>
-          <w:szCs w:val="24"/>
-        </w:rPr>
-      </w:pPr>
-      <w:r>
-        <w:rPr>
-          <w:rFonts w:ascii="Arial" w:eastAsia="Times New Roman" w:hAnsi="Arial" w:cs="Arial"/>
+        </w:rPr>
+      </w:pPr>
+      <w:r>
+        <w:rPr>
+          <w:rFonts w:ascii="Arial" w:hAnsi="Arial" w:cs="Arial"/>
           <w:b/>
           <w:bCs/>
           <w:color w:val="000000"/>
-          <w:sz w:val="24"/>
-          <w:szCs w:val="24"/>
         </w:rPr>
         <w:t>Python</w:t>
       </w:r>
     </w:p>
     <w:p>
       <w:pPr>
-        <w:spacing w:line="240" w:lineRule="auto"/>
         <w:ind w:left="2160"/>
         <w:rPr>
-          <w:rFonts w:ascii="Arial" w:eastAsia="Times New Roman" w:hAnsi="Arial" w:cs="Arial"/>
-          <w:color w:val="000000" w:themeColor="text1"/>
-          <w:sz w:val="24"/>
-          <w:szCs w:val="24"/>
-        </w:rPr>
-      </w:pPr>
-      <w:r>
-        <w:rPr>
-          <w:rFonts w:ascii="Arial" w:eastAsia="Times New Roman" w:hAnsi="Arial" w:cs="Arial"/>
-          <w:color w:val="000000" w:themeColor="text1"/>
-          <w:sz w:val="24"/>
-          <w:szCs w:val="24"/>
+          <w:rFonts w:ascii="Arial" w:hAnsi="Arial" w:cs="Arial"/>
+          <w:color w:val="000000" w:themeColor="text1"/>
+        </w:rPr>
+      </w:pPr>
+      <w:r>
+        <w:rPr>
+          <w:rFonts w:ascii="Arial" w:hAnsi="Arial" w:cs="Arial"/>
+          <w:color w:val="000000" w:themeColor="text1"/>
         </w:rPr>
         <w:t xml:space="preserve">Extremely powerful </w:t>
       </w:r>
       <w:proofErr w:type="gramStart"/>
       <w:r>
         <w:rPr>
-          <w:rFonts w:ascii="Arial" w:eastAsia="Times New Roman" w:hAnsi="Arial" w:cs="Arial"/>
-          <w:color w:val="000000" w:themeColor="text1"/>
-          <w:sz w:val="24"/>
-          <w:szCs w:val="24"/>
+          <w:rFonts w:ascii="Arial" w:hAnsi="Arial" w:cs="Arial"/>
+          <w:color w:val="000000" w:themeColor="text1"/>
         </w:rPr>
         <w:t>code based</w:t>
       </w:r>
       <w:proofErr w:type="gramEnd"/>
       <w:r>
         <w:rPr>
-          <w:rFonts w:ascii="Arial" w:eastAsia="Times New Roman" w:hAnsi="Arial" w:cs="Arial"/>
-          <w:color w:val="000000" w:themeColor="text1"/>
-          <w:sz w:val="24"/>
-          <w:szCs w:val="24"/>
+          <w:rFonts w:ascii="Arial" w:hAnsi="Arial" w:cs="Arial"/>
+          <w:color w:val="000000" w:themeColor="text1"/>
         </w:rPr>
         <w:t xml:space="preserve"> platform</w:t>
       </w:r>
     </w:p>
     <w:p>
       <w:pPr>
-        <w:spacing w:line="240" w:lineRule="auto"/>
         <w:ind w:left="2160"/>
         <w:rPr>
-          <w:rFonts w:ascii="Arial" w:eastAsia="Times New Roman" w:hAnsi="Arial" w:cs="Arial"/>
-          <w:color w:val="000000" w:themeColor="text1"/>
-          <w:sz w:val="24"/>
-          <w:szCs w:val="24"/>
+          <w:rFonts w:ascii="Arial" w:hAnsi="Arial" w:cs="Arial"/>
+          <w:color w:val="000000" w:themeColor="text1"/>
         </w:rPr>
       </w:pPr>
       <w:hyperlink r:id="rId14" w:history="1">
         <w:r>
           <w:rPr>
             <w:rStyle w:val="Hyperlink"/>
-            <w:rFonts w:ascii="Arial" w:eastAsia="Times New Roman" w:hAnsi="Arial" w:cs="Arial"/>
-            <w:sz w:val="24"/>
-            <w:szCs w:val="24"/>
+            <w:rFonts w:ascii="Arial" w:hAnsi="Arial" w:cs="Arial"/>
           </w:rPr>
           <w:t>https://www.python.org/downloads/</w:t>
         </w:r>
@@ -1708,45 +1404,35 @@
     </w:p>
     <w:p>
       <w:pPr>
-        <w:spacing w:line="240" w:lineRule="auto"/>
         <w:ind w:left="2160"/>
         <w:rPr>
-          <w:rFonts w:ascii="Arial" w:eastAsia="Times New Roman" w:hAnsi="Arial" w:cs="Arial"/>
+          <w:rFonts w:ascii="Arial" w:hAnsi="Arial" w:cs="Arial"/>
           <w:b/>
           <w:bCs/>
           <w:color w:val="000000" w:themeColor="text1"/>
-          <w:sz w:val="24"/>
-          <w:szCs w:val="24"/>
-        </w:rPr>
-      </w:pPr>
-      <w:r>
-        <w:rPr>
-          <w:rFonts w:ascii="Arial" w:eastAsia="Times New Roman" w:hAnsi="Arial" w:cs="Arial"/>
+        </w:rPr>
+      </w:pPr>
+      <w:r>
+        <w:rPr>
+          <w:rFonts w:ascii="Arial" w:hAnsi="Arial" w:cs="Arial"/>
           <w:b/>
           <w:bCs/>
           <w:color w:val="000000" w:themeColor="text1"/>
-          <w:sz w:val="24"/>
-          <w:szCs w:val="24"/>
         </w:rPr>
         <w:t>Arduino (Processing)</w:t>
       </w:r>
     </w:p>
     <w:p>
       <w:pPr>
-        <w:spacing w:line="240" w:lineRule="auto"/>
         <w:ind w:left="2160"/>
         <w:rPr>
-          <w:rFonts w:ascii="Arial" w:eastAsia="Times New Roman" w:hAnsi="Arial" w:cs="Arial"/>
-          <w:color w:val="000000" w:themeColor="text1"/>
-          <w:sz w:val="24"/>
-          <w:szCs w:val="24"/>
+          <w:rFonts w:ascii="Arial" w:hAnsi="Arial" w:cs="Arial"/>
+          <w:color w:val="000000" w:themeColor="text1"/>
         </w:rPr>
       </w:pPr>
       <w:r>
         <w:rPr>
           <w:noProof/>
-          <w:sz w:val="24"/>
-          <w:szCs w:val="24"/>
         </w:rPr>
         <w:drawing>
           <wp:anchor distT="0" distB="0" distL="114300" distR="114300" simplePos="0" relativeHeight="251658240" behindDoc="1" locked="0" layoutInCell="1" allowOverlap="1" wp14:anchorId="59600E00" wp14:editId="378FC7A6">
@@ -1816,81 +1502,63 @@
       </w:r>
       <w:r>
         <w:rPr>
-          <w:rFonts w:ascii="Arial" w:eastAsia="Times New Roman" w:hAnsi="Arial" w:cs="Arial"/>
-          <w:color w:val="000000" w:themeColor="text1"/>
-          <w:sz w:val="24"/>
-          <w:szCs w:val="24"/>
+          <w:rFonts w:ascii="Arial" w:hAnsi="Arial" w:cs="Arial"/>
+          <w:color w:val="000000" w:themeColor="text1"/>
         </w:rPr>
         <w:t>Hardware coding 101!</w:t>
       </w:r>
     </w:p>
     <w:p>
       <w:pPr>
-        <w:spacing w:line="240" w:lineRule="auto"/>
         <w:ind w:left="2160"/>
         <w:rPr>
-          <w:rFonts w:ascii="Arial" w:eastAsia="Times New Roman" w:hAnsi="Arial" w:cs="Arial"/>
-          <w:i/>
-          <w:iCs/>
-          <w:color w:val="000000" w:themeColor="text1"/>
-          <w:sz w:val="24"/>
-          <w:szCs w:val="24"/>
-        </w:rPr>
-      </w:pPr>
-    </w:p>
-    <w:p>
-      <w:pPr>
-        <w:spacing w:line="240" w:lineRule="auto"/>
-        <w:rPr>
-          <w:rFonts w:ascii="Arial" w:eastAsia="Times New Roman" w:hAnsi="Arial" w:cs="Arial"/>
-          <w:color w:val="000000" w:themeColor="text1"/>
-          <w:sz w:val="24"/>
-          <w:szCs w:val="24"/>
-        </w:rPr>
-      </w:pPr>
-      <w:r>
-        <w:rPr>
-          <w:rFonts w:ascii="Arial" w:eastAsia="Times New Roman" w:hAnsi="Arial" w:cs="Arial"/>
-          <w:color w:val="000000" w:themeColor="text1"/>
-          <w:sz w:val="24"/>
-          <w:szCs w:val="24"/>
+          <w:rFonts w:ascii="Arial" w:hAnsi="Arial" w:cs="Arial"/>
+          <w:i/>
+          <w:iCs/>
+          <w:color w:val="000000" w:themeColor="text1"/>
+        </w:rPr>
+      </w:pPr>
+    </w:p>
+    <w:p>
+      <w:pPr>
+        <w:rPr>
+          <w:rFonts w:ascii="Arial" w:hAnsi="Arial" w:cs="Arial"/>
+          <w:color w:val="000000" w:themeColor="text1"/>
+        </w:rPr>
+      </w:pPr>
+      <w:r>
+        <w:rPr>
+          <w:rFonts w:ascii="Arial" w:hAnsi="Arial" w:cs="Arial"/>
+          <w:color w:val="000000" w:themeColor="text1"/>
         </w:rPr>
         <w:t>Hardware:</w:t>
       </w:r>
       <w:r>
         <w:rPr>
-          <w:rFonts w:ascii="Arial" w:eastAsia="Times New Roman" w:hAnsi="Arial" w:cs="Arial"/>
-          <w:color w:val="000000" w:themeColor="text1"/>
-          <w:sz w:val="24"/>
-          <w:szCs w:val="24"/>
+          <w:rFonts w:ascii="Arial" w:hAnsi="Arial" w:cs="Arial"/>
+          <w:color w:val="000000" w:themeColor="text1"/>
         </w:rPr>
         <w:tab/>
       </w:r>
       <w:r>
         <w:rPr>
-          <w:rFonts w:ascii="Arial" w:eastAsia="Times New Roman" w:hAnsi="Arial" w:cs="Arial"/>
-          <w:color w:val="000000" w:themeColor="text1"/>
-          <w:sz w:val="24"/>
-          <w:szCs w:val="24"/>
+          <w:rFonts w:ascii="Arial" w:hAnsi="Arial" w:cs="Arial"/>
+          <w:color w:val="000000" w:themeColor="text1"/>
         </w:rPr>
         <w:tab/>
       </w:r>
       <w:r>
         <w:rPr>
-          <w:rFonts w:ascii="Arial" w:eastAsia="Times New Roman" w:hAnsi="Arial" w:cs="Arial"/>
-          <w:color w:val="000000" w:themeColor="text1"/>
-          <w:sz w:val="24"/>
-          <w:szCs w:val="24"/>
+          <w:rFonts w:ascii="Arial" w:hAnsi="Arial" w:cs="Arial"/>
+          <w:color w:val="000000" w:themeColor="text1"/>
         </w:rPr>
         <w:t xml:space="preserve">Daisy </w:t>
       </w:r>
       <w:proofErr w:type="spellStart"/>
       <w:r>
         <w:rPr>
-          <w:rFonts w:ascii="Arial" w:eastAsia="Times New Roman" w:hAnsi="Arial" w:cs="Arial"/>
-          <w:color w:val="000000" w:themeColor="text1"/>
-          <w:sz w:val="24"/>
-          <w:szCs w:val="24"/>
+          <w:rFonts w:ascii="Arial" w:hAnsi="Arial" w:cs="Arial"/>
+          <w:color w:val="000000" w:themeColor="text1"/>
         </w:rPr>
         <w:t>ElectroSmith</w:t>
       </w:r>
@@ -1898,22 +1566,17 @@
     </w:p>
     <w:p>
       <w:pPr>
-        <w:spacing w:line="240" w:lineRule="auto"/>
         <w:ind w:left="1440" w:firstLine="720"/>
         <w:rPr>
-          <w:rFonts w:ascii="Arial" w:eastAsia="Times New Roman" w:hAnsi="Arial" w:cs="Arial"/>
-          <w:color w:val="000000" w:themeColor="text1"/>
-          <w:sz w:val="24"/>
-          <w:szCs w:val="24"/>
+          <w:rFonts w:ascii="Arial" w:hAnsi="Arial" w:cs="Arial"/>
+          <w:color w:val="000000" w:themeColor="text1"/>
         </w:rPr>
       </w:pPr>
       <w:hyperlink r:id="rId16" w:history="1">
         <w:r>
           <w:rPr>
             <w:rStyle w:val="Hyperlink"/>
-            <w:rFonts w:ascii="Arial" w:eastAsia="Times New Roman" w:hAnsi="Arial" w:cs="Arial"/>
-            <w:sz w:val="24"/>
-            <w:szCs w:val="24"/>
+            <w:rFonts w:ascii="Arial" w:hAnsi="Arial" w:cs="Arial"/>
           </w:rPr>
           <w:t>https://electro-smith.com</w:t>
         </w:r>
@@ -1921,38 +1584,29 @@
     </w:p>
     <w:p>
       <w:pPr>
-        <w:spacing w:line="240" w:lineRule="auto"/>
-        <w:rPr>
-          <w:rFonts w:ascii="Arial" w:eastAsia="Times New Roman" w:hAnsi="Arial" w:cs="Arial"/>
-          <w:color w:val="000000" w:themeColor="text1"/>
-          <w:sz w:val="24"/>
-          <w:szCs w:val="24"/>
-        </w:rPr>
-      </w:pPr>
-      <w:r>
-        <w:rPr>
-          <w:rFonts w:ascii="Arial" w:eastAsia="Times New Roman" w:hAnsi="Arial" w:cs="Arial"/>
-          <w:color w:val="000000" w:themeColor="text1"/>
-          <w:sz w:val="24"/>
-          <w:szCs w:val="24"/>
+        <w:rPr>
+          <w:rFonts w:ascii="Arial" w:hAnsi="Arial" w:cs="Arial"/>
+          <w:color w:val="000000" w:themeColor="text1"/>
+        </w:rPr>
+      </w:pPr>
+      <w:r>
+        <w:rPr>
+          <w:rFonts w:ascii="Arial" w:hAnsi="Arial" w:cs="Arial"/>
+          <w:color w:val="000000" w:themeColor="text1"/>
         </w:rPr>
         <w:tab/>
       </w:r>
       <w:r>
         <w:rPr>
-          <w:rFonts w:ascii="Arial" w:eastAsia="Times New Roman" w:hAnsi="Arial" w:cs="Arial"/>
-          <w:color w:val="000000" w:themeColor="text1"/>
-          <w:sz w:val="24"/>
-          <w:szCs w:val="24"/>
+          <w:rFonts w:ascii="Arial" w:hAnsi="Arial" w:cs="Arial"/>
+          <w:color w:val="000000" w:themeColor="text1"/>
         </w:rPr>
         <w:tab/>
       </w:r>
       <w:r>
         <w:rPr>
-          <w:rFonts w:ascii="Arial" w:eastAsia="Times New Roman" w:hAnsi="Arial" w:cs="Arial"/>
-          <w:color w:val="000000" w:themeColor="text1"/>
-          <w:sz w:val="24"/>
-          <w:szCs w:val="24"/>
+          <w:rFonts w:ascii="Arial" w:hAnsi="Arial" w:cs="Arial"/>
+          <w:color w:val="000000" w:themeColor="text1"/>
         </w:rPr>
         <w:tab/>
         <w:t xml:space="preserve">Small low powered microcontroller </w:t>
@@ -1960,167 +1614,122 @@
     </w:p>
     <w:p>
       <w:pPr>
-        <w:spacing w:line="240" w:lineRule="auto"/>
         <w:ind w:left="2160" w:right="1350"/>
         <w:rPr>
-          <w:rFonts w:ascii="Arial" w:eastAsia="Times New Roman" w:hAnsi="Arial" w:cs="Arial"/>
-          <w:i/>
-          <w:iCs/>
-          <w:color w:val="000000" w:themeColor="text1"/>
-          <w:sz w:val="24"/>
-          <w:szCs w:val="24"/>
-        </w:rPr>
-      </w:pPr>
-      <w:r>
-        <w:rPr>
-          <w:rFonts w:ascii="Arial" w:eastAsia="Times New Roman" w:hAnsi="Arial" w:cs="Arial"/>
-          <w:i/>
-          <w:iCs/>
-          <w:color w:val="000000" w:themeColor="text1"/>
-          <w:sz w:val="24"/>
-          <w:szCs w:val="24"/>
-        </w:rPr>
+          <w:rFonts w:ascii="Arial" w:hAnsi="Arial" w:cs="Arial"/>
+          <w:i/>
+          <w:iCs/>
+          <w:color w:val="000000" w:themeColor="text1"/>
+        </w:rPr>
+      </w:pPr>
+      <w:r>
+        <w:rPr>
+          <w:rFonts w:ascii="Arial" w:hAnsi="Arial" w:cs="Arial"/>
+          <w:i/>
+          <w:iCs/>
+          <w:color w:val="000000" w:themeColor="text1"/>
+        </w:rPr>
+        <w:lastRenderedPageBreak/>
         <w:t xml:space="preserve">“Daisy is an embedded platform for music. It features everything you need for creating high fidelity audio hardware devices. Just plug in a USB cable and start making sound! Programming the Daisy is a breeze with support for </w:t>
       </w:r>
       <w:proofErr w:type="gramStart"/>
       <w:r>
         <w:rPr>
-          <w:rFonts w:ascii="Arial" w:eastAsia="Times New Roman" w:hAnsi="Arial" w:cs="Arial"/>
-          <w:i/>
-          <w:iCs/>
-          <w:color w:val="000000" w:themeColor="text1"/>
-          <w:sz w:val="24"/>
-          <w:szCs w:val="24"/>
+          <w:rFonts w:ascii="Arial" w:hAnsi="Arial" w:cs="Arial"/>
+          <w:i/>
+          <w:iCs/>
+          <w:color w:val="000000" w:themeColor="text1"/>
         </w:rPr>
         <w:t>a number of</w:t>
       </w:r>
       <w:proofErr w:type="gramEnd"/>
       <w:r>
         <w:rPr>
-          <w:rFonts w:ascii="Arial" w:eastAsia="Times New Roman" w:hAnsi="Arial" w:cs="Arial"/>
-          <w:i/>
-          <w:iCs/>
-          <w:color w:val="000000" w:themeColor="text1"/>
-          <w:sz w:val="24"/>
-          <w:szCs w:val="24"/>
+          <w:rFonts w:ascii="Arial" w:hAnsi="Arial" w:cs="Arial"/>
+          <w:i/>
+          <w:iCs/>
+          <w:color w:val="000000" w:themeColor="text1"/>
         </w:rPr>
         <w:t xml:space="preserve"> languages including C++, Arduino, and Max/MSP Gen~. To get started, simply upload an example program over USB, and start tweaking!”</w:t>
       </w:r>
     </w:p>
     <w:p>
       <w:pPr>
-        <w:spacing w:line="240" w:lineRule="auto"/>
         <w:ind w:left="2160"/>
         <w:rPr>
-          <w:rFonts w:ascii="Arial" w:eastAsia="Times New Roman" w:hAnsi="Arial" w:cs="Arial"/>
-          <w:i/>
-          <w:iCs/>
-          <w:color w:val="000000" w:themeColor="text1"/>
-          <w:sz w:val="24"/>
-          <w:szCs w:val="24"/>
-        </w:rPr>
-      </w:pPr>
-    </w:p>
-    <w:p>
-      <w:pPr>
-        <w:spacing w:line="240" w:lineRule="auto"/>
+          <w:rFonts w:ascii="Arial" w:hAnsi="Arial" w:cs="Arial"/>
+          <w:i/>
+          <w:iCs/>
+          <w:color w:val="000000" w:themeColor="text1"/>
+        </w:rPr>
+      </w:pPr>
+    </w:p>
+    <w:p>
+      <w:pPr>
         <w:ind w:left="2160"/>
         <w:rPr>
-          <w:rFonts w:ascii="Arial" w:eastAsia="Times New Roman" w:hAnsi="Arial" w:cs="Arial"/>
-          <w:i/>
-          <w:iCs/>
-          <w:color w:val="000000" w:themeColor="text1"/>
-          <w:sz w:val="24"/>
-          <w:szCs w:val="24"/>
-        </w:rPr>
-      </w:pPr>
-      <w:r>
-        <w:rPr>
-          <w:sz w:val="24"/>
-          <w:szCs w:val="24"/>
-        </w:rPr>
+          <w:rFonts w:ascii="Arial" w:hAnsi="Arial" w:cs="Arial"/>
+          <w:i/>
+          <w:iCs/>
+          <w:color w:val="000000" w:themeColor="text1"/>
+        </w:rPr>
+      </w:pPr>
+      <w:r>
         <w:fldChar w:fldCharType="begin"/>
       </w:r>
       <w:r>
-        <w:rPr>
-          <w:sz w:val="24"/>
-          <w:szCs w:val="24"/>
-        </w:rPr>
         <w:instrText xml:space="preserve"> INCLUDEPICTURE "https://electro-smith.com/cdn/shop/files/daisy-hero-1.png?v=1754593115&amp;width=800" \* MERGEFORMATINET </w:instrText>
       </w:r>
       <w:r>
-        <w:rPr>
-          <w:sz w:val="24"/>
-          <w:szCs w:val="24"/>
-        </w:rPr>
         <w:fldChar w:fldCharType="separate"/>
       </w:r>
       <w:r>
-        <w:rPr>
-          <w:sz w:val="24"/>
-          <w:szCs w:val="24"/>
-        </w:rPr>
         <w:fldChar w:fldCharType="end"/>
       </w:r>
     </w:p>
     <w:p>
       <w:pPr>
-        <w:spacing w:line="240" w:lineRule="auto"/>
-        <w:rPr>
-          <w:rFonts w:ascii="Arial" w:eastAsia="Times New Roman" w:hAnsi="Arial" w:cs="Arial"/>
-          <w:color w:val="000000" w:themeColor="text1"/>
-          <w:sz w:val="24"/>
-          <w:szCs w:val="24"/>
-        </w:rPr>
-      </w:pPr>
-    </w:p>
-    <w:p>
-      <w:pPr>
-        <w:spacing w:line="240" w:lineRule="auto"/>
-        <w:rPr>
-          <w:rFonts w:ascii="Arial" w:eastAsia="Times New Roman" w:hAnsi="Arial" w:cs="Arial"/>
-          <w:color w:val="000000" w:themeColor="text1"/>
-          <w:sz w:val="24"/>
-          <w:szCs w:val="24"/>
-        </w:rPr>
-      </w:pPr>
-    </w:p>
-    <w:p>
-      <w:pPr>
-        <w:spacing w:line="240" w:lineRule="auto"/>
-        <w:rPr>
-          <w:rFonts w:ascii="Arial" w:eastAsia="Times New Roman" w:hAnsi="Arial" w:cs="Arial"/>
-          <w:color w:val="000000" w:themeColor="text1"/>
-          <w:sz w:val="24"/>
-          <w:szCs w:val="24"/>
-        </w:rPr>
-      </w:pPr>
-      <w:r>
-        <w:rPr>
-          <w:rFonts w:ascii="Arial" w:eastAsia="Times New Roman" w:hAnsi="Arial" w:cs="Arial"/>
-          <w:i/>
-          <w:iCs/>
-          <w:color w:val="000000" w:themeColor="text1"/>
-          <w:sz w:val="24"/>
-          <w:szCs w:val="24"/>
+        <w:rPr>
+          <w:rFonts w:ascii="Arial" w:hAnsi="Arial" w:cs="Arial"/>
+          <w:color w:val="000000" w:themeColor="text1"/>
+        </w:rPr>
+      </w:pPr>
+    </w:p>
+    <w:p>
+      <w:pPr>
+        <w:rPr>
+          <w:rFonts w:ascii="Arial" w:hAnsi="Arial" w:cs="Arial"/>
+          <w:color w:val="000000" w:themeColor="text1"/>
+        </w:rPr>
+      </w:pPr>
+    </w:p>
+    <w:p>
+      <w:pPr>
+        <w:rPr>
+          <w:rFonts w:ascii="Arial" w:hAnsi="Arial" w:cs="Arial"/>
+          <w:color w:val="000000" w:themeColor="text1"/>
+        </w:rPr>
+      </w:pPr>
+      <w:r>
+        <w:rPr>
+          <w:rFonts w:ascii="Arial" w:hAnsi="Arial" w:cs="Arial"/>
+          <w:i/>
+          <w:iCs/>
+          <w:color w:val="000000" w:themeColor="text1"/>
         </w:rPr>
         <w:t>Course Repository</w:t>
       </w:r>
       <w:r>
         <w:rPr>
-          <w:rFonts w:ascii="Arial" w:eastAsia="Times New Roman" w:hAnsi="Arial" w:cs="Arial"/>
-          <w:color w:val="000000" w:themeColor="text1"/>
-          <w:sz w:val="24"/>
-          <w:szCs w:val="24"/>
+          <w:rFonts w:ascii="Arial" w:hAnsi="Arial" w:cs="Arial"/>
+          <w:color w:val="000000" w:themeColor="text1"/>
         </w:rPr>
         <w:t>:</w:t>
       </w:r>
       <w:r>
         <w:rPr>
-          <w:rFonts w:ascii="Arial" w:eastAsia="Times New Roman" w:hAnsi="Arial" w:cs="Arial"/>
-          <w:color w:val="000000" w:themeColor="text1"/>
-          <w:sz w:val="24"/>
-          <w:szCs w:val="24"/>
+          <w:rFonts w:ascii="Arial" w:hAnsi="Arial" w:cs="Arial"/>
+          <w:color w:val="000000" w:themeColor="text1"/>
         </w:rPr>
         <w:tab/>
       </w:r>
@@ -2128,9 +1737,7 @@
         <w:r>
           <w:rPr>
             <w:rStyle w:val="Hyperlink"/>
-            <w:rFonts w:ascii="Arial" w:eastAsia="Times New Roman" w:hAnsi="Arial" w:cs="Arial"/>
-            <w:sz w:val="24"/>
-            <w:szCs w:val="24"/>
+            <w:rFonts w:ascii="Arial" w:hAnsi="Arial" w:cs="Arial"/>
           </w:rPr>
           <w:t>https://github.com/dfict/MUSI-650-20</w:t>
         </w:r>
@@ -2138,107 +1745,85 @@
     </w:p>
     <w:p>
       <w:pPr>
-        <w:spacing w:line="240" w:lineRule="auto"/>
         <w:ind w:left="2160"/>
         <w:rPr>
-          <w:rFonts w:ascii="Arial" w:eastAsia="Times New Roman" w:hAnsi="Arial" w:cs="Arial"/>
-          <w:color w:val="000000" w:themeColor="text1"/>
-          <w:sz w:val="24"/>
-          <w:szCs w:val="24"/>
-        </w:rPr>
-      </w:pPr>
-      <w:r>
-        <w:rPr>
-          <w:rFonts w:ascii="Arial" w:eastAsia="Times New Roman" w:hAnsi="Arial" w:cs="Arial"/>
-          <w:color w:val="000000" w:themeColor="text1"/>
-          <w:sz w:val="24"/>
-          <w:szCs w:val="24"/>
+          <w:rFonts w:ascii="Arial" w:hAnsi="Arial" w:cs="Arial"/>
+          <w:color w:val="000000" w:themeColor="text1"/>
+        </w:rPr>
+      </w:pPr>
+      <w:r>
+        <w:rPr>
+          <w:rFonts w:ascii="Arial" w:hAnsi="Arial" w:cs="Arial"/>
+          <w:color w:val="000000" w:themeColor="text1"/>
         </w:rPr>
         <w:t xml:space="preserve">Since this is a coding class, we use Git for version tracking. I am </w:t>
       </w:r>
       <w:proofErr w:type="spellStart"/>
       <w:r>
         <w:rPr>
-          <w:rFonts w:ascii="Arial" w:eastAsia="Times New Roman" w:hAnsi="Arial" w:cs="Arial"/>
-          <w:color w:val="000000" w:themeColor="text1"/>
-          <w:sz w:val="24"/>
-          <w:szCs w:val="24"/>
+          <w:rFonts w:ascii="Arial" w:hAnsi="Arial" w:cs="Arial"/>
+          <w:color w:val="000000" w:themeColor="text1"/>
         </w:rPr>
         <w:t>constanting</w:t>
       </w:r>
       <w:proofErr w:type="spellEnd"/>
       <w:r>
         <w:rPr>
-          <w:rFonts w:ascii="Arial" w:eastAsia="Times New Roman" w:hAnsi="Arial" w:cs="Arial"/>
-          <w:color w:val="000000" w:themeColor="text1"/>
-          <w:sz w:val="24"/>
-          <w:szCs w:val="24"/>
+          <w:rFonts w:ascii="Arial" w:hAnsi="Arial" w:cs="Arial"/>
+          <w:color w:val="000000" w:themeColor="text1"/>
         </w:rPr>
         <w:t xml:space="preserve"> updating, refining, refactoring, and revising code bases throughout the semester and many times throughout the week. Please learn to use </w:t>
       </w:r>
       <w:proofErr w:type="spellStart"/>
       <w:r>
         <w:rPr>
-          <w:rFonts w:ascii="Arial" w:eastAsia="Times New Roman" w:hAnsi="Arial" w:cs="Arial"/>
+          <w:rFonts w:ascii="Arial" w:hAnsi="Arial" w:cs="Arial"/>
           <w:b/>
           <w:bCs/>
           <w:color w:val="000000" w:themeColor="text1"/>
-          <w:sz w:val="24"/>
-          <w:szCs w:val="24"/>
         </w:rPr>
         <w:t>Github</w:t>
       </w:r>
       <w:proofErr w:type="spellEnd"/>
       <w:r>
         <w:rPr>
-          <w:rFonts w:ascii="Arial" w:eastAsia="Times New Roman" w:hAnsi="Arial" w:cs="Arial"/>
+          <w:rFonts w:ascii="Arial" w:hAnsi="Arial" w:cs="Arial"/>
           <w:b/>
           <w:bCs/>
           <w:color w:val="000000" w:themeColor="text1"/>
-          <w:sz w:val="24"/>
-          <w:szCs w:val="24"/>
         </w:rPr>
         <w:t xml:space="preserve">! </w:t>
       </w:r>
       <w:r>
         <w:rPr>
-          <w:rFonts w:ascii="Arial" w:eastAsia="Times New Roman" w:hAnsi="Arial" w:cs="Arial"/>
-          <w:color w:val="000000" w:themeColor="text1"/>
-          <w:sz w:val="24"/>
-          <w:szCs w:val="24"/>
+          <w:rFonts w:ascii="Arial" w:hAnsi="Arial" w:cs="Arial"/>
+          <w:color w:val="000000" w:themeColor="text1"/>
         </w:rPr>
         <w:t xml:space="preserve">Download </w:t>
       </w:r>
       <w:proofErr w:type="spellStart"/>
       <w:r>
         <w:rPr>
-          <w:rFonts w:ascii="Arial" w:eastAsia="Times New Roman" w:hAnsi="Arial" w:cs="Arial"/>
-          <w:color w:val="000000" w:themeColor="text1"/>
-          <w:sz w:val="24"/>
-          <w:szCs w:val="24"/>
+          <w:rFonts w:ascii="Arial" w:hAnsi="Arial" w:cs="Arial"/>
+          <w:color w:val="000000" w:themeColor="text1"/>
         </w:rPr>
         <w:t>Github</w:t>
       </w:r>
       <w:proofErr w:type="spellEnd"/>
       <w:r>
         <w:rPr>
-          <w:rFonts w:ascii="Arial" w:eastAsia="Times New Roman" w:hAnsi="Arial" w:cs="Arial"/>
-          <w:color w:val="000000" w:themeColor="text1"/>
-          <w:sz w:val="24"/>
-          <w:szCs w:val="24"/>
+          <w:rFonts w:ascii="Arial" w:hAnsi="Arial" w:cs="Arial"/>
+          <w:color w:val="000000" w:themeColor="text1"/>
         </w:rPr>
         <w:t xml:space="preserve"> Desktop and make an account asap.</w:t>
       </w:r>
     </w:p>
     <w:p>
       <w:pPr>
-        <w:spacing w:line="240" w:lineRule="auto"/>
         <w:ind w:left="2160"/>
         <w:rPr>
-          <w:rFonts w:ascii="Arial" w:eastAsia="Times New Roman" w:hAnsi="Arial" w:cs="Arial"/>
-          <w:color w:val="000000" w:themeColor="text1"/>
-          <w:sz w:val="24"/>
-          <w:szCs w:val="24"/>
+          <w:rFonts w:ascii="Arial" w:hAnsi="Arial" w:cs="Arial"/>
+          <w:color w:val="000000" w:themeColor="text1"/>
         </w:rPr>
       </w:pPr>
     </w:p>
@@ -2253,14 +1838,11 @@
           <w:b/>
           <w:noProof/>
           <w:color w:val="000000" w:themeColor="text1"/>
-          <w:sz w:val="24"/>
-          <w:szCs w:val="24"/>
-        </w:rPr>
-        <w:lastRenderedPageBreak/>
+        </w:rPr>
         <w:drawing>
-          <wp:inline distT="0" distB="0" distL="0" distR="0" wp14:anchorId="677B26DB" wp14:editId="5E1C81F1">
-            <wp:extent cx="5725321" cy="3048000"/>
-            <wp:effectExtent l="0" t="0" r="2540" b="0"/>
+          <wp:inline distT="0" distB="0" distL="0" distR="0" wp14:anchorId="677B26DB" wp14:editId="6FE4C8DA">
+            <wp:extent cx="5465460" cy="2909657"/>
+            <wp:effectExtent l="0" t="0" r="0" b="0"/>
             <wp:docPr id="928599715" name="Picture 1" descr="A screenshot of a computer&#10;&#10;AI-generated content may be incorrect."/>
             <wp:cNvGraphicFramePr>
               <a:graphicFrameLocks xmlns:a="http://schemas.openxmlformats.org/drawingml/2006/main" noChangeAspect="1"/>
@@ -2281,7 +1863,7 @@
                   <pic:spPr>
                     <a:xfrm>
                       <a:off x="0" y="0"/>
-                      <a:ext cx="5749556" cy="3060902"/>
+                      <a:ext cx="5499240" cy="2927641"/>
                     </a:xfrm>
                     <a:prstGeom prst="rect">
                       <a:avLst/>
@@ -2481,13 +2063,10 @@
     </w:p>
     <w:p>
       <w:pPr>
-        <w:spacing w:line="240" w:lineRule="auto"/>
         <w:ind w:left="2160"/>
         <w:rPr>
-          <w:rFonts w:ascii="Arial" w:eastAsia="Times New Roman" w:hAnsi="Arial" w:cs="Arial"/>
-          <w:color w:val="000000" w:themeColor="text1"/>
-          <w:sz w:val="24"/>
-          <w:szCs w:val="24"/>
+          <w:rFonts w:ascii="Arial" w:hAnsi="Arial" w:cs="Arial"/>
+          <w:color w:val="000000" w:themeColor="text1"/>
         </w:rPr>
       </w:pPr>
     </w:p>
@@ -2500,40 +2079,30 @@
           <w:rFonts w:ascii="Arial" w:hAnsi="Arial" w:cs="Arial"/>
           <w:i/>
           <w:color w:val="000000" w:themeColor="text1"/>
-          <w:sz w:val="24"/>
-          <w:szCs w:val="24"/>
-        </w:rPr>
-      </w:pPr>
-    </w:p>
-    <w:p>
-      <w:pPr>
-        <w:rPr>
-          <w:rFonts w:ascii="Arial" w:hAnsi="Arial" w:cs="Arial"/>
-          <w:sz w:val="24"/>
-          <w:szCs w:val="24"/>
-        </w:rPr>
-      </w:pPr>
-      <w:r>
-        <w:rPr>
-          <w:rFonts w:ascii="Arial" w:hAnsi="Arial" w:cs="Arial"/>
-          <w:sz w:val="24"/>
-          <w:szCs w:val="24"/>
+        </w:rPr>
+      </w:pPr>
+    </w:p>
+    <w:p>
+      <w:pPr>
+        <w:rPr>
+          <w:rFonts w:ascii="Arial" w:hAnsi="Arial" w:cs="Arial"/>
+        </w:rPr>
+      </w:pPr>
+      <w:r>
+        <w:rPr>
+          <w:rFonts w:ascii="Arial" w:hAnsi="Arial" w:cs="Arial"/>
         </w:rPr>
         <w:t>Course Objective</w:t>
       </w:r>
       <w:r>
         <w:rPr>
           <w:rFonts w:ascii="Arial" w:hAnsi="Arial" w:cs="Arial"/>
-          <w:sz w:val="24"/>
-          <w:szCs w:val="24"/>
         </w:rPr>
         <w:t>s</w:t>
       </w:r>
       <w:r>
         <w:rPr>
           <w:rFonts w:ascii="Arial" w:hAnsi="Arial" w:cs="Arial"/>
-          <w:sz w:val="24"/>
-          <w:szCs w:val="24"/>
         </w:rPr>
         <w:t>:</w:t>
       </w:r>
@@ -2542,24 +2111,18 @@
       <w:pPr>
         <w:rPr>
           <w:rFonts w:ascii="Arial" w:hAnsi="Arial" w:cs="Arial"/>
-          <w:sz w:val="24"/>
-          <w:szCs w:val="24"/>
-        </w:rPr>
-      </w:pPr>
-    </w:p>
-    <w:p>
-      <w:pPr>
-        <w:rPr>
-          <w:rFonts w:ascii="Arial" w:hAnsi="Arial" w:cs="Arial"/>
-          <w:sz w:val="24"/>
-          <w:szCs w:val="24"/>
-        </w:rPr>
-      </w:pPr>
-      <w:r>
-        <w:rPr>
-          <w:rFonts w:ascii="Arial" w:hAnsi="Arial" w:cs="Arial"/>
-          <w:sz w:val="24"/>
-          <w:szCs w:val="24"/>
+        </w:rPr>
+      </w:pPr>
+    </w:p>
+    <w:p>
+      <w:pPr>
+        <w:rPr>
+          <w:rFonts w:ascii="Arial" w:hAnsi="Arial" w:cs="Arial"/>
+        </w:rPr>
+      </w:pPr>
+      <w:r>
+        <w:rPr>
+          <w:rFonts w:ascii="Arial" w:hAnsi="Arial" w:cs="Arial"/>
         </w:rPr>
         <w:t xml:space="preserve">● Production Techniques: evaluate and apply advanced techniques in music production, synthesis, recording, programming, editing, and </w:t>
       </w:r>
@@ -2567,8 +2130,6 @@
       <w:r>
         <w:rPr>
           <w:rFonts w:ascii="Arial" w:hAnsi="Arial" w:cs="Arial"/>
-          <w:sz w:val="24"/>
-          <w:szCs w:val="24"/>
         </w:rPr>
         <w:t>mastering;</w:t>
       </w:r>
@@ -2578,31 +2139,23 @@
       <w:pPr>
         <w:rPr>
           <w:rFonts w:ascii="Arial" w:hAnsi="Arial" w:cs="Arial"/>
-          <w:sz w:val="24"/>
-          <w:szCs w:val="24"/>
-        </w:rPr>
-      </w:pPr>
-      <w:r>
-        <w:rPr>
-          <w:rFonts w:ascii="Arial" w:hAnsi="Arial" w:cs="Arial"/>
-          <w:sz w:val="24"/>
-          <w:szCs w:val="24"/>
+        </w:rPr>
+      </w:pPr>
+      <w:r>
+        <w:rPr>
+          <w:rFonts w:ascii="Arial" w:hAnsi="Arial" w:cs="Arial"/>
         </w:rPr>
         <w:t>●</w:t>
       </w:r>
       <w:r>
         <w:rPr>
           <w:rFonts w:ascii="Arial" w:hAnsi="Arial" w:cs="Arial"/>
-          <w:sz w:val="24"/>
-          <w:szCs w:val="24"/>
         </w:rPr>
         <w:t xml:space="preserve"> </w:t>
       </w:r>
       <w:r>
         <w:rPr>
           <w:rFonts w:ascii="Arial" w:hAnsi="Arial" w:cs="Arial"/>
-          <w:sz w:val="24"/>
-          <w:szCs w:val="24"/>
         </w:rPr>
         <w:t xml:space="preserve">Theoretical Foundations: identify and interpret core theoretical foundations of </w:t>
       </w:r>
@@ -2610,8 +2163,6 @@
       <w:r>
         <w:rPr>
           <w:rFonts w:ascii="Arial" w:hAnsi="Arial" w:cs="Arial"/>
-          <w:sz w:val="24"/>
-          <w:szCs w:val="24"/>
         </w:rPr>
         <w:t>audio;</w:t>
       </w:r>
@@ -2621,31 +2172,24 @@
       <w:pPr>
         <w:rPr>
           <w:rFonts w:ascii="Arial" w:hAnsi="Arial" w:cs="Arial"/>
-          <w:sz w:val="24"/>
-          <w:szCs w:val="24"/>
-        </w:rPr>
-      </w:pPr>
-      <w:r>
-        <w:rPr>
-          <w:rFonts w:ascii="Arial" w:hAnsi="Arial" w:cs="Arial"/>
-          <w:sz w:val="24"/>
-          <w:szCs w:val="24"/>
-        </w:rPr>
+        </w:rPr>
+      </w:pPr>
+      <w:r>
+        <w:rPr>
+          <w:rFonts w:ascii="Arial" w:hAnsi="Arial" w:cs="Arial"/>
+        </w:rPr>
+        <w:lastRenderedPageBreak/>
         <w:t>●</w:t>
       </w:r>
       <w:r>
         <w:rPr>
           <w:rFonts w:ascii="Arial" w:hAnsi="Arial" w:cs="Arial"/>
-          <w:sz w:val="24"/>
-          <w:szCs w:val="24"/>
         </w:rPr>
         <w:t xml:space="preserve"> </w:t>
       </w:r>
       <w:r>
         <w:rPr>
           <w:rFonts w:ascii="Arial" w:hAnsi="Arial" w:cs="Arial"/>
-          <w:sz w:val="24"/>
-          <w:szCs w:val="24"/>
         </w:rPr>
         <w:t xml:space="preserve">Context: analyze and articulate the importance of context in diverse practices within music </w:t>
       </w:r>
@@ -2653,8 +2197,6 @@
       <w:r>
         <w:rPr>
           <w:rFonts w:ascii="Arial" w:hAnsi="Arial" w:cs="Arial"/>
-          <w:sz w:val="24"/>
-          <w:szCs w:val="24"/>
         </w:rPr>
         <w:t>technology;</w:t>
       </w:r>
@@ -2664,31 +2206,23 @@
       <w:pPr>
         <w:rPr>
           <w:rFonts w:ascii="Arial" w:hAnsi="Arial" w:cs="Arial"/>
-          <w:sz w:val="24"/>
-          <w:szCs w:val="24"/>
-        </w:rPr>
-      </w:pPr>
-      <w:r>
-        <w:rPr>
-          <w:rFonts w:ascii="Arial" w:hAnsi="Arial" w:cs="Arial"/>
-          <w:sz w:val="24"/>
-          <w:szCs w:val="24"/>
+        </w:rPr>
+      </w:pPr>
+      <w:r>
+        <w:rPr>
+          <w:rFonts w:ascii="Arial" w:hAnsi="Arial" w:cs="Arial"/>
         </w:rPr>
         <w:t>●</w:t>
       </w:r>
       <w:r>
         <w:rPr>
           <w:rFonts w:ascii="Arial" w:hAnsi="Arial" w:cs="Arial"/>
-          <w:sz w:val="24"/>
-          <w:szCs w:val="24"/>
         </w:rPr>
         <w:t xml:space="preserve"> </w:t>
       </w:r>
       <w:r>
         <w:rPr>
           <w:rFonts w:ascii="Arial" w:hAnsi="Arial" w:cs="Arial"/>
-          <w:sz w:val="24"/>
-          <w:szCs w:val="24"/>
         </w:rPr>
         <w:t xml:space="preserve">Musicianship and Production: integrate traditional, non-Western, and experimental approaches to musicianship and composition with music production </w:t>
       </w:r>
@@ -2696,8 +2230,6 @@
       <w:r>
         <w:rPr>
           <w:rFonts w:ascii="Arial" w:hAnsi="Arial" w:cs="Arial"/>
-          <w:sz w:val="24"/>
-          <w:szCs w:val="24"/>
         </w:rPr>
         <w:t>skills;</w:t>
       </w:r>
@@ -2707,31 +2239,23 @@
       <w:pPr>
         <w:rPr>
           <w:rFonts w:ascii="Arial" w:hAnsi="Arial" w:cs="Arial"/>
-          <w:sz w:val="24"/>
-          <w:szCs w:val="24"/>
-        </w:rPr>
-      </w:pPr>
-      <w:r>
-        <w:rPr>
-          <w:rFonts w:ascii="Arial" w:hAnsi="Arial" w:cs="Arial"/>
-          <w:sz w:val="24"/>
-          <w:szCs w:val="24"/>
+        </w:rPr>
+      </w:pPr>
+      <w:r>
+        <w:rPr>
+          <w:rFonts w:ascii="Arial" w:hAnsi="Arial" w:cs="Arial"/>
         </w:rPr>
         <w:t>●</w:t>
       </w:r>
       <w:r>
         <w:rPr>
           <w:rFonts w:ascii="Arial" w:hAnsi="Arial" w:cs="Arial"/>
-          <w:sz w:val="24"/>
-          <w:szCs w:val="24"/>
         </w:rPr>
         <w:t xml:space="preserve"> </w:t>
       </w:r>
       <w:r>
         <w:rPr>
           <w:rFonts w:ascii="Arial" w:hAnsi="Arial" w:cs="Arial"/>
-          <w:sz w:val="24"/>
-          <w:szCs w:val="24"/>
         </w:rPr>
         <w:t>Collaboration: collaborate with others effectively and demonstrate leadership in professional situations; and</w:t>
       </w:r>
@@ -2740,15 +2264,11 @@
       <w:pPr>
         <w:rPr>
           <w:rFonts w:ascii="Arial" w:hAnsi="Arial" w:cs="Arial"/>
-          <w:sz w:val="24"/>
-          <w:szCs w:val="24"/>
-        </w:rPr>
-      </w:pPr>
-      <w:r>
-        <w:rPr>
-          <w:rFonts w:ascii="Arial" w:hAnsi="Arial" w:cs="Arial"/>
-          <w:sz w:val="24"/>
-          <w:szCs w:val="24"/>
+        </w:rPr>
+      </w:pPr>
+      <w:r>
+        <w:rPr>
+          <w:rFonts w:ascii="Arial" w:hAnsi="Arial" w:cs="Arial"/>
         </w:rPr>
         <w:t>● Innovation: recognize and formulate innovative approaches to music technologies and careers.</w:t>
       </w:r>
@@ -2756,29 +2276,23 @@
     <w:p>
       <w:pPr>
         <w:rPr>
-          <w:rFonts w:ascii="Arial" w:eastAsia="Times New Roman" w:hAnsi="Arial" w:cs="Arial"/>
-          <w:sz w:val="24"/>
-          <w:szCs w:val="24"/>
-        </w:rPr>
-      </w:pPr>
-    </w:p>
-    <w:p>
-      <w:pPr>
-        <w:rPr>
-          <w:rFonts w:ascii="Arial" w:eastAsia="Times New Roman" w:hAnsi="Arial" w:cs="Arial"/>
+          <w:rFonts w:ascii="Arial" w:hAnsi="Arial" w:cs="Arial"/>
+        </w:rPr>
+      </w:pPr>
+    </w:p>
+    <w:p>
+      <w:pPr>
+        <w:rPr>
+          <w:rFonts w:ascii="Arial" w:hAnsi="Arial" w:cs="Arial"/>
           <w:b/>
           <w:bCs/>
-          <w:sz w:val="24"/>
-          <w:szCs w:val="24"/>
-        </w:rPr>
-      </w:pPr>
-      <w:r>
-        <w:rPr>
-          <w:rFonts w:ascii="Arial" w:eastAsia="Times New Roman" w:hAnsi="Arial" w:cs="Arial"/>
+        </w:rPr>
+      </w:pPr>
+      <w:r>
+        <w:rPr>
+          <w:rFonts w:ascii="Arial" w:hAnsi="Arial" w:cs="Arial"/>
           <w:b/>
           <w:bCs/>
-          <w:sz w:val="24"/>
-          <w:szCs w:val="24"/>
         </w:rPr>
         <w:t>Course Goals</w:t>
       </w:r>
@@ -2786,16 +2300,12 @@
     <w:p>
       <w:pPr>
         <w:rPr>
-          <w:rFonts w:ascii="Arial" w:eastAsia="Times New Roman" w:hAnsi="Arial" w:cs="Arial"/>
-          <w:sz w:val="24"/>
-          <w:szCs w:val="24"/>
-        </w:rPr>
-      </w:pPr>
-      <w:r>
-        <w:rPr>
-          <w:rFonts w:ascii="Arial" w:eastAsia="Times New Roman" w:hAnsi="Arial" w:cs="Arial"/>
-          <w:sz w:val="24"/>
-          <w:szCs w:val="24"/>
+          <w:rFonts w:ascii="Arial" w:hAnsi="Arial" w:cs="Arial"/>
+        </w:rPr>
+      </w:pPr>
+      <w:r>
+        <w:rPr>
+          <w:rFonts w:ascii="Arial" w:hAnsi="Arial" w:cs="Arial"/>
         </w:rPr>
         <w:t>● Understanding the relationship between computer programming, music, and digital audio</w:t>
       </w:r>
@@ -2803,16 +2313,12 @@
     <w:p>
       <w:pPr>
         <w:rPr>
-          <w:rFonts w:ascii="Arial" w:eastAsia="Times New Roman" w:hAnsi="Arial" w:cs="Arial"/>
-          <w:sz w:val="24"/>
-          <w:szCs w:val="24"/>
-        </w:rPr>
-      </w:pPr>
-      <w:r>
-        <w:rPr>
-          <w:rFonts w:ascii="Arial" w:eastAsia="Times New Roman" w:hAnsi="Arial" w:cs="Arial"/>
-          <w:sz w:val="24"/>
-          <w:szCs w:val="24"/>
+          <w:rFonts w:ascii="Arial" w:hAnsi="Arial" w:cs="Arial"/>
+        </w:rPr>
+      </w:pPr>
+      <w:r>
+        <w:rPr>
+          <w:rFonts w:ascii="Arial" w:hAnsi="Arial" w:cs="Arial"/>
         </w:rPr>
         <w:t>● Developing core proficiencies relevant to algorithmic composition, interface design, computer programming, analysis and signal processing</w:t>
       </w:r>
@@ -2820,16 +2326,12 @@
     <w:p>
       <w:pPr>
         <w:rPr>
-          <w:rFonts w:ascii="Arial" w:eastAsia="Times New Roman" w:hAnsi="Arial" w:cs="Arial"/>
-          <w:sz w:val="24"/>
-          <w:szCs w:val="24"/>
-        </w:rPr>
-      </w:pPr>
-      <w:r>
-        <w:rPr>
-          <w:rFonts w:ascii="Arial" w:eastAsia="Times New Roman" w:hAnsi="Arial" w:cs="Arial"/>
-          <w:sz w:val="24"/>
-          <w:szCs w:val="24"/>
+          <w:rFonts w:ascii="Arial" w:hAnsi="Arial" w:cs="Arial"/>
+        </w:rPr>
+      </w:pPr>
+      <w:r>
+        <w:rPr>
+          <w:rFonts w:ascii="Arial" w:hAnsi="Arial" w:cs="Arial"/>
         </w:rPr>
         <w:t>● Gaining the ability to read, write, and modify computer code related to music.</w:t>
       </w:r>
@@ -2837,29 +2339,23 @@
     <w:p>
       <w:pPr>
         <w:rPr>
-          <w:rFonts w:ascii="Arial" w:eastAsia="Times New Roman" w:hAnsi="Arial" w:cs="Arial"/>
-          <w:sz w:val="24"/>
-          <w:szCs w:val="24"/>
-        </w:rPr>
-      </w:pPr>
-    </w:p>
-    <w:p>
-      <w:pPr>
-        <w:rPr>
-          <w:rFonts w:ascii="Arial" w:eastAsia="Times New Roman" w:hAnsi="Arial" w:cs="Arial"/>
+          <w:rFonts w:ascii="Arial" w:hAnsi="Arial" w:cs="Arial"/>
+        </w:rPr>
+      </w:pPr>
+    </w:p>
+    <w:p>
+      <w:pPr>
+        <w:rPr>
+          <w:rFonts w:ascii="Arial" w:hAnsi="Arial" w:cs="Arial"/>
           <w:b/>
           <w:bCs/>
-          <w:sz w:val="24"/>
-          <w:szCs w:val="24"/>
-        </w:rPr>
-      </w:pPr>
-      <w:r>
-        <w:rPr>
-          <w:rFonts w:ascii="Arial" w:eastAsia="Times New Roman" w:hAnsi="Arial" w:cs="Arial"/>
+        </w:rPr>
+      </w:pPr>
+      <w:r>
+        <w:rPr>
+          <w:rFonts w:ascii="Arial" w:hAnsi="Arial" w:cs="Arial"/>
           <w:b/>
           <w:bCs/>
-          <w:sz w:val="24"/>
-          <w:szCs w:val="24"/>
         </w:rPr>
         <w:t>Measurable Student Learning Outcomes </w:t>
       </w:r>
@@ -2868,23 +2364,17 @@
       <w:pPr>
         <w:rPr>
           <w:rFonts w:ascii="Arial" w:hAnsi="Arial" w:cs="Arial"/>
-          <w:sz w:val="24"/>
-          <w:szCs w:val="24"/>
-        </w:rPr>
-      </w:pPr>
-      <w:r>
-        <w:rPr>
-          <w:rFonts w:ascii="Arial" w:eastAsia="Times New Roman" w:hAnsi="Arial" w:cs="Arial"/>
-          <w:sz w:val="24"/>
-          <w:szCs w:val="24"/>
+        </w:rPr>
+      </w:pPr>
+      <w:r>
+        <w:rPr>
+          <w:rFonts w:ascii="Arial" w:hAnsi="Arial" w:cs="Arial"/>
         </w:rPr>
         <w:t xml:space="preserve">● </w:t>
       </w:r>
       <w:r>
         <w:rPr>
           <w:rFonts w:ascii="Arial" w:hAnsi="Arial" w:cs="Arial"/>
-          <w:sz w:val="24"/>
-          <w:szCs w:val="24"/>
         </w:rPr>
         <w:t>Comprehend the importance of music programming in improvised and notated contemporary music (Projects)</w:t>
       </w:r>
@@ -2893,23 +2383,17 @@
       <w:pPr>
         <w:rPr>
           <w:rFonts w:ascii="Arial" w:hAnsi="Arial" w:cs="Arial"/>
-          <w:sz w:val="24"/>
-          <w:szCs w:val="24"/>
-        </w:rPr>
-      </w:pPr>
-      <w:r>
-        <w:rPr>
-          <w:rFonts w:ascii="Arial" w:eastAsia="Times New Roman" w:hAnsi="Arial" w:cs="Arial"/>
-          <w:sz w:val="24"/>
-          <w:szCs w:val="24"/>
+        </w:rPr>
+      </w:pPr>
+      <w:r>
+        <w:rPr>
+          <w:rFonts w:ascii="Arial" w:hAnsi="Arial" w:cs="Arial"/>
         </w:rPr>
         <w:t xml:space="preserve">● </w:t>
       </w:r>
       <w:r>
         <w:rPr>
           <w:rFonts w:ascii="Arial" w:hAnsi="Arial" w:cs="Arial"/>
-          <w:sz w:val="24"/>
-          <w:szCs w:val="24"/>
         </w:rPr>
         <w:t xml:space="preserve">Demonstrate the ability to create programs in </w:t>
       </w:r>
@@ -2917,8 +2401,6 @@
       <w:r>
         <w:rPr>
           <w:rFonts w:ascii="Arial" w:hAnsi="Arial" w:cs="Arial"/>
-          <w:sz w:val="24"/>
-          <w:szCs w:val="24"/>
         </w:rPr>
         <w:t>SuperCollider</w:t>
       </w:r>
@@ -2926,24 +2408,18 @@
       <w:r>
         <w:rPr>
           <w:rFonts w:ascii="Arial" w:hAnsi="Arial" w:cs="Arial"/>
-          <w:sz w:val="24"/>
-          <w:szCs w:val="24"/>
         </w:rPr>
         <w:t>, Python, Processing and C++ in the production of compositions an</w:t>
       </w:r>
       <w:r>
         <w:rPr>
           <w:rFonts w:ascii="Arial" w:hAnsi="Arial" w:cs="Arial"/>
-          <w:sz w:val="24"/>
-          <w:szCs w:val="24"/>
         </w:rPr>
         <w:t>d</w:t>
       </w:r>
       <w:r>
         <w:rPr>
           <w:rFonts w:ascii="Arial" w:hAnsi="Arial" w:cs="Arial"/>
-          <w:sz w:val="24"/>
-          <w:szCs w:val="24"/>
         </w:rPr>
         <w:t xml:space="preserve"> performances (Projects)</w:t>
       </w:r>
@@ -2952,23 +2428,17 @@
       <w:pPr>
         <w:rPr>
           <w:rFonts w:ascii="Arial" w:hAnsi="Arial" w:cs="Arial"/>
-          <w:sz w:val="24"/>
-          <w:szCs w:val="24"/>
-        </w:rPr>
-      </w:pPr>
-      <w:r>
-        <w:rPr>
-          <w:rFonts w:ascii="Arial" w:eastAsia="Times New Roman" w:hAnsi="Arial" w:cs="Arial"/>
-          <w:sz w:val="24"/>
-          <w:szCs w:val="24"/>
+        </w:rPr>
+      </w:pPr>
+      <w:r>
+        <w:rPr>
+          <w:rFonts w:ascii="Arial" w:hAnsi="Arial" w:cs="Arial"/>
         </w:rPr>
         <w:t xml:space="preserve">● </w:t>
       </w:r>
       <w:r>
         <w:rPr>
           <w:rFonts w:ascii="Arial" w:hAnsi="Arial" w:cs="Arial"/>
-          <w:sz w:val="24"/>
-          <w:szCs w:val="24"/>
         </w:rPr>
         <w:t xml:space="preserve">Understand the fundamentals of computer programming languages for music and be able to implement them to build original Audio Unit &amp; </w:t>
       </w:r>
@@ -2976,8 +2446,6 @@
       <w:r>
         <w:rPr>
           <w:rFonts w:ascii="Arial" w:hAnsi="Arial" w:cs="Arial"/>
-          <w:sz w:val="24"/>
-          <w:szCs w:val="24"/>
         </w:rPr>
         <w:t>VSTplugins</w:t>
       </w:r>
@@ -2985,8 +2453,6 @@
       <w:r>
         <w:rPr>
           <w:rFonts w:ascii="Arial" w:hAnsi="Arial" w:cs="Arial"/>
-          <w:sz w:val="24"/>
-          <w:szCs w:val="24"/>
         </w:rPr>
         <w:t xml:space="preserve"> (Projects)</w:t>
       </w:r>
@@ -3545,6 +3011,17 @@
           <w:szCs w:val="24"/>
         </w:rPr>
       </w:pPr>
+    </w:p>
+    <w:p>
+      <w:pPr>
+        <w:pStyle w:val="Normal1"/>
+        <w:spacing w:line="240" w:lineRule="auto"/>
+        <w:rPr>
+          <w:color w:val="000000" w:themeColor="text1"/>
+          <w:sz w:val="24"/>
+          <w:szCs w:val="24"/>
+        </w:rPr>
+      </w:pPr>
       <w:r>
         <w:rPr>
           <w:color w:val="000000" w:themeColor="text1"/>
@@ -3571,6 +3048,138 @@
         </w:rPr>
         <w:t xml:space="preserve"> unexcused absence permitted for the semester. Your final grade will drop by 4 points for each further unexcused absence. More than four absences will result in a failing grade for the course. You are expected to participate actively in class by asking questions, bringing energy to discussions, and arriving with prepared homework/projects. Independent motivation is expected. </w:t>
       </w:r>
+    </w:p>
+    <w:p>
+      <w:pPr>
+        <w:pStyle w:val="Normal1"/>
+        <w:spacing w:line="240" w:lineRule="auto"/>
+        <w:rPr>
+          <w:color w:val="000000" w:themeColor="text1"/>
+          <w:sz w:val="24"/>
+          <w:szCs w:val="24"/>
+        </w:rPr>
+      </w:pPr>
+    </w:p>
+    <w:p>
+      <w:pPr>
+        <w:rPr>
+          <w:b/>
+          <w:bCs/>
+        </w:rPr>
+      </w:pPr>
+      <w:r>
+        <w:rPr>
+          <w:b/>
+          <w:bCs/>
+        </w:rPr>
+        <w:t>The following classes will be online</w:t>
+      </w:r>
+    </w:p>
+    <w:p>
+      <w:pPr>
+        <w:rPr>
+          <w:b/>
+          <w:bCs/>
+        </w:rPr>
+      </w:pPr>
+      <w:r>
+        <w:rPr>
+          <w:b/>
+          <w:bCs/>
+        </w:rPr>
+        <w:t>(that does not mean cancelled)</w:t>
+      </w:r>
+    </w:p>
+    <w:p>
+      <w:pPr>
+        <w:rPr>
+          <w:b/>
+          <w:bCs/>
+        </w:rPr>
+      </w:pPr>
+      <w:r>
+        <w:rPr>
+          <w:b/>
+          <w:bCs/>
+        </w:rPr>
+        <w:t>9/9</w:t>
+      </w:r>
+    </w:p>
+    <w:p>
+      <w:pPr>
+        <w:rPr>
+          <w:b/>
+          <w:bCs/>
+        </w:rPr>
+      </w:pPr>
+      <w:r>
+        <w:rPr>
+          <w:b/>
+          <w:bCs/>
+        </w:rPr>
+        <w:t>9/16</w:t>
+      </w:r>
+    </w:p>
+    <w:p>
+      <w:pPr>
+        <w:rPr>
+          <w:b/>
+          <w:bCs/>
+        </w:rPr>
+      </w:pPr>
+      <w:r>
+        <w:rPr>
+          <w:b/>
+          <w:bCs/>
+        </w:rPr>
+        <w:lastRenderedPageBreak/>
+        <w:t>10/14</w:t>
+      </w:r>
+    </w:p>
+    <w:p>
+      <w:pPr>
+        <w:rPr>
+          <w:b/>
+          <w:bCs/>
+        </w:rPr>
+      </w:pPr>
+      <w:r>
+        <w:rPr>
+          <w:b/>
+          <w:bCs/>
+        </w:rPr>
+        <w:t>11/11</w:t>
+      </w:r>
+    </w:p>
+    <w:p/>
+    <w:p>
+      <w:r>
+        <w:t>10/7 (possibly)</w:t>
+      </w:r>
+    </w:p>
+    <w:p>
+      <w:r>
+        <w:t>11/4 (possibly)</w:t>
+      </w:r>
+    </w:p>
+    <w:p>
+      <w:pPr>
+        <w:rPr>
+          <w:b/>
+          <w:bCs/>
+        </w:rPr>
+      </w:pPr>
+    </w:p>
+    <w:p>
+      <w:pPr>
+        <w:pStyle w:val="Normal1"/>
+        <w:spacing w:line="240" w:lineRule="auto"/>
+        <w:rPr>
+          <w:color w:val="000000" w:themeColor="text1"/>
+          <w:sz w:val="24"/>
+          <w:szCs w:val="24"/>
+        </w:rPr>
+      </w:pPr>
     </w:p>
     <w:p>
       <w:pPr>
@@ -3879,6 +3488,137 @@
         </w:rPr>
         <w:t xml:space="preserve">, or an </w:t>
       </w:r>
+      <w:r>
+        <w:rPr>
+          <w:color w:val="000000" w:themeColor="text1"/>
+          <w:sz w:val="24"/>
+          <w:szCs w:val="24"/>
+        </w:rPr>
+        <w:t>instrument</w:t>
+      </w:r>
+      <w:r>
+        <w:rPr>
+          <w:color w:val="000000" w:themeColor="text1"/>
+          <w:sz w:val="24"/>
+          <w:szCs w:val="24"/>
+        </w:rPr>
+        <w:t>,</w:t>
+      </w:r>
+      <w:r>
+        <w:rPr>
+          <w:color w:val="000000" w:themeColor="text1"/>
+          <w:sz w:val="24"/>
+          <w:szCs w:val="24"/>
+        </w:rPr>
+        <w:t xml:space="preserve"> or piece of art that inspires you</w:t>
+      </w:r>
+      <w:r>
+        <w:rPr>
+          <w:color w:val="000000" w:themeColor="text1"/>
+          <w:sz w:val="24"/>
+          <w:szCs w:val="24"/>
+        </w:rPr>
+        <w:t>, taking into note how computation / programming is used as an integral part</w:t>
+      </w:r>
+      <w:r>
+        <w:rPr>
+          <w:color w:val="000000" w:themeColor="text1"/>
+          <w:sz w:val="24"/>
+          <w:szCs w:val="24"/>
+        </w:rPr>
+        <w:t xml:space="preserve">. </w:t>
+      </w:r>
+    </w:p>
+    <w:p>
+      <w:pPr>
+        <w:pStyle w:val="Normal1"/>
+        <w:spacing w:line="240" w:lineRule="auto"/>
+        <w:rPr>
+          <w:color w:val="000000" w:themeColor="text1"/>
+          <w:sz w:val="24"/>
+          <w:szCs w:val="24"/>
+        </w:rPr>
+      </w:pPr>
+      <w:r>
+        <w:rPr>
+          <w:color w:val="000000" w:themeColor="text1"/>
+          <w:sz w:val="24"/>
+          <w:szCs w:val="24"/>
+        </w:rPr>
+        <w:t xml:space="preserve">It’s not </w:t>
+      </w:r>
+      <w:r>
+        <w:rPr>
+          <w:color w:val="000000" w:themeColor="text1"/>
+          <w:sz w:val="24"/>
+          <w:szCs w:val="24"/>
+        </w:rPr>
+        <w:t>enough to merely</w:t>
+      </w:r>
+      <w:r>
+        <w:rPr>
+          <w:color w:val="000000" w:themeColor="text1"/>
+          <w:sz w:val="24"/>
+          <w:szCs w:val="24"/>
+        </w:rPr>
+        <w:t xml:space="preserve"> talk about a musician you like, and some synths they use. </w:t>
+      </w:r>
+    </w:p>
+    <w:p>
+      <w:pPr>
+        <w:pStyle w:val="Normal1"/>
+        <w:spacing w:line="240" w:lineRule="auto"/>
+        <w:rPr>
+          <w:color w:val="000000" w:themeColor="text1"/>
+          <w:sz w:val="24"/>
+          <w:szCs w:val="24"/>
+        </w:rPr>
+      </w:pPr>
+      <w:r>
+        <w:rPr>
+          <w:color w:val="000000" w:themeColor="text1"/>
+          <w:sz w:val="24"/>
+          <w:szCs w:val="24"/>
+        </w:rPr>
+        <w:t xml:space="preserve">You </w:t>
+      </w:r>
+      <w:proofErr w:type="gramStart"/>
+      <w:r>
+        <w:rPr>
+          <w:color w:val="000000" w:themeColor="text1"/>
+          <w:sz w:val="24"/>
+          <w:szCs w:val="24"/>
+        </w:rPr>
+        <w:t>have to</w:t>
+      </w:r>
+      <w:proofErr w:type="gramEnd"/>
+      <w:r>
+        <w:rPr>
+          <w:color w:val="000000" w:themeColor="text1"/>
+          <w:sz w:val="24"/>
+          <w:szCs w:val="24"/>
+        </w:rPr>
+        <w:t xml:space="preserve"> identify and explain a technological process.</w:t>
+      </w:r>
+    </w:p>
+    <w:p>
+      <w:pPr>
+        <w:pStyle w:val="Normal1"/>
+        <w:spacing w:line="240" w:lineRule="auto"/>
+        <w:rPr>
+          <w:color w:val="000000" w:themeColor="text1"/>
+          <w:sz w:val="24"/>
+          <w:szCs w:val="24"/>
+        </w:rPr>
+      </w:pPr>
+      <w:r>
+        <w:rPr>
+          <w:color w:val="000000" w:themeColor="text1"/>
+          <w:sz w:val="24"/>
+          <w:szCs w:val="24"/>
+        </w:rPr>
+        <w:t xml:space="preserve">It should be appropriately cited, referenced. You should not just link to </w:t>
+      </w:r>
       <w:proofErr w:type="spellStart"/>
       <w:r>
         <w:rPr>
@@ -3886,7 +3626,7 @@
           <w:sz w:val="24"/>
           <w:szCs w:val="24"/>
         </w:rPr>
-        <w:t>instrumet</w:t>
+        <w:t>Youtube</w:t>
       </w:r>
       <w:proofErr w:type="spellEnd"/>
       <w:r>
@@ -3895,31 +3635,7 @@
           <w:sz w:val="24"/>
           <w:szCs w:val="24"/>
         </w:rPr>
-        <w:t>,</w:t>
-      </w:r>
-      <w:r>
-        <w:rPr>
-          <w:color w:val="000000" w:themeColor="text1"/>
-          <w:sz w:val="24"/>
-          <w:szCs w:val="24"/>
-        </w:rPr>
-        <w:t xml:space="preserve"> or piece of art that inspires you</w:t>
-      </w:r>
-      <w:r>
-        <w:rPr>
-          <w:color w:val="000000" w:themeColor="text1"/>
-          <w:sz w:val="24"/>
-          <w:szCs w:val="24"/>
-        </w:rPr>
-        <w:t>, taking into note how computation / programming is used as an integral part</w:t>
-      </w:r>
-      <w:r>
-        <w:rPr>
-          <w:color w:val="000000" w:themeColor="text1"/>
-          <w:sz w:val="24"/>
-          <w:szCs w:val="24"/>
-        </w:rPr>
-        <w:t xml:space="preserve">. </w:t>
+        <w:t xml:space="preserve"> videos and let the video do the talking.</w:t>
       </w:r>
     </w:p>
     <w:p>
@@ -3938,23 +3654,7 @@
           <w:sz w:val="24"/>
           <w:szCs w:val="24"/>
         </w:rPr>
-        <w:t xml:space="preserve">It’s not </w:t>
-      </w:r>
-      <w:r>
-        <w:rPr>
-          <w:color w:val="000000" w:themeColor="text1"/>
-          <w:sz w:val="24"/>
-          <w:szCs w:val="24"/>
-        </w:rPr>
-        <w:t>enough to merely</w:t>
-      </w:r>
-      <w:r>
-        <w:rPr>
-          <w:color w:val="000000" w:themeColor="text1"/>
-          <w:sz w:val="24"/>
-          <w:szCs w:val="24"/>
-        </w:rPr>
-        <w:t xml:space="preserve"> talk about a musician you like, and some synths they use. </w:t>
+        <w:t xml:space="preserve">The purpose of this assignment is to aid the development of your final project by creating an opportunity to research something that interests you for your own creative purposes and research agenda. </w:t>
       </w:r>
     </w:p>
     <w:p>
@@ -3973,25 +3673,7 @@
           <w:sz w:val="24"/>
           <w:szCs w:val="24"/>
         </w:rPr>
-        <w:t xml:space="preserve">You </w:t>
-      </w:r>
-      <w:proofErr w:type="gramStart"/>
-      <w:r>
-        <w:rPr>
-          <w:color w:val="000000" w:themeColor="text1"/>
-          <w:sz w:val="24"/>
-          <w:szCs w:val="24"/>
-        </w:rPr>
-        <w:t>have to</w:t>
-      </w:r>
-      <w:proofErr w:type="gramEnd"/>
-      <w:r>
-        <w:rPr>
-          <w:color w:val="000000" w:themeColor="text1"/>
-          <w:sz w:val="24"/>
-          <w:szCs w:val="24"/>
-        </w:rPr>
-        <w:t xml:space="preserve"> identify and explain a technological process.</w:t>
+        <w:t xml:space="preserve">25 min. </w:t>
       </w:r>
     </w:p>
     <w:p>
@@ -4004,101 +3686,25 @@
           <w:szCs w:val="24"/>
         </w:rPr>
       </w:pPr>
-      <w:r>
-        <w:rPr>
-          <w:color w:val="000000" w:themeColor="text1"/>
-          <w:sz w:val="24"/>
-          <w:szCs w:val="24"/>
-        </w:rPr>
-        <w:t xml:space="preserve">It should be appropriately cited, referenced. You should not just link to </w:t>
-      </w:r>
-      <w:proofErr w:type="spellStart"/>
-      <w:r>
-        <w:rPr>
-          <w:color w:val="000000" w:themeColor="text1"/>
-          <w:sz w:val="24"/>
-          <w:szCs w:val="24"/>
-        </w:rPr>
-        <w:t>Youtube</w:t>
-      </w:r>
-      <w:proofErr w:type="spellEnd"/>
-      <w:r>
-        <w:rPr>
-          <w:color w:val="000000" w:themeColor="text1"/>
-          <w:sz w:val="24"/>
-          <w:szCs w:val="24"/>
-        </w:rPr>
-        <w:t xml:space="preserve"> videos and let the video do the talking.</w:t>
-      </w:r>
     </w:p>
     <w:p>
       <w:pPr>
         <w:pStyle w:val="Normal1"/>
         <w:spacing w:line="240" w:lineRule="auto"/>
         <w:rPr>
-          <w:color w:val="000000" w:themeColor="text1"/>
-          <w:sz w:val="24"/>
-          <w:szCs w:val="24"/>
-        </w:rPr>
-      </w:pPr>
-      <w:r>
-        <w:rPr>
-          <w:color w:val="000000" w:themeColor="text1"/>
-          <w:sz w:val="24"/>
-          <w:szCs w:val="24"/>
-        </w:rPr>
-        <w:t xml:space="preserve">The purpose of this assignment is to aid the development of your final project by creating an opportunity to research something that interests you for your own creative purposes and research agenda. </w:t>
-      </w:r>
-    </w:p>
-    <w:p>
-      <w:pPr>
-        <w:pStyle w:val="Normal1"/>
-        <w:spacing w:line="240" w:lineRule="auto"/>
-        <w:rPr>
-          <w:color w:val="000000" w:themeColor="text1"/>
-          <w:sz w:val="24"/>
-          <w:szCs w:val="24"/>
-        </w:rPr>
-      </w:pPr>
-      <w:r>
-        <w:rPr>
-          <w:color w:val="000000" w:themeColor="text1"/>
-          <w:sz w:val="24"/>
-          <w:szCs w:val="24"/>
-        </w:rPr>
-        <w:t xml:space="preserve">25 min. </w:t>
-      </w:r>
-    </w:p>
-    <w:p>
-      <w:pPr>
-        <w:pStyle w:val="Normal1"/>
-        <w:spacing w:line="240" w:lineRule="auto"/>
-        <w:rPr>
-          <w:color w:val="000000" w:themeColor="text1"/>
-          <w:sz w:val="24"/>
-          <w:szCs w:val="24"/>
-        </w:rPr>
-      </w:pPr>
-    </w:p>
-    <w:p>
-      <w:pPr>
-        <w:pStyle w:val="Normal1"/>
-        <w:spacing w:line="240" w:lineRule="auto"/>
-        <w:rPr>
-          <w:b/>
-          <w:color w:val="000000" w:themeColor="text1"/>
-          <w:sz w:val="24"/>
-          <w:szCs w:val="24"/>
-        </w:rPr>
-      </w:pPr>
-      <w:r>
-        <w:rPr>
-          <w:b/>
-          <w:color w:val="000000" w:themeColor="text1"/>
-          <w:sz w:val="24"/>
-          <w:szCs w:val="24"/>
-        </w:rPr>
-        <w:lastRenderedPageBreak/>
+          <w:b/>
+          <w:color w:val="000000" w:themeColor="text1"/>
+          <w:sz w:val="24"/>
+          <w:szCs w:val="24"/>
+        </w:rPr>
+      </w:pPr>
+      <w:r>
+        <w:rPr>
+          <w:b/>
+          <w:color w:val="000000" w:themeColor="text1"/>
+          <w:sz w:val="24"/>
+          <w:szCs w:val="24"/>
+        </w:rPr>
         <w:t xml:space="preserve">Final Project </w:t>
       </w:r>
       <w:r>
@@ -4283,7 +3889,7 @@
           <w:sz w:val="24"/>
           <w:szCs w:val="24"/>
         </w:rPr>
-        <w:t xml:space="preserve"> something mentioned in class but not explicitly explored. </w:t>
+        <w:t xml:space="preserve"> something mentioned in class but not explicitly explored.</w:t>
       </w:r>
       <w:r>
         <w:rPr>
@@ -4292,7 +3898,7 @@
           <w:sz w:val="24"/>
           <w:szCs w:val="24"/>
         </w:rPr>
-        <w:t xml:space="preserve">You can write code for the Flying Fish Board, for a Noise Toy, in Supercollider. </w:t>
+        <w:t xml:space="preserve"> </w:t>
       </w:r>
       <w:r>
         <w:rPr>
@@ -4330,66 +3936,39 @@
         </w:rPr>
         <w:t xml:space="preserve">Students may work collaboratively. The project must be proposed and accepted by instructor. </w:t>
       </w:r>
-      <w:r>
-        <w:rPr>
+    </w:p>
+    <w:p>
+      <w:pPr>
+        <w:pStyle w:val="noformatting"/>
+        <w:rPr>
+          <w:rFonts w:ascii="Arial" w:hAnsi="Arial" w:cs="Arial"/>
+          <w:b/>
           <w:bCs/>
-          <w:color w:val="000000" w:themeColor="text1"/>
-          <w:sz w:val="24"/>
-          <w:szCs w:val="24"/>
-        </w:rPr>
-        <w:t>We may present these projects at the Tristan Perich concert, on 12/11</w:t>
-      </w:r>
-      <w:r>
-        <w:rPr>
+          <w:i/>
+          <w:color w:val="000000" w:themeColor="text1"/>
+          <w:sz w:val="24"/>
+          <w:szCs w:val="24"/>
+        </w:rPr>
+      </w:pPr>
+    </w:p>
+    <w:p>
+      <w:pPr>
+        <w:pStyle w:val="noformatting"/>
+        <w:rPr>
+          <w:rFonts w:ascii="Arial" w:hAnsi="Arial" w:cs="Arial"/>
+          <w:b/>
           <w:bCs/>
-          <w:color w:val="000000" w:themeColor="text1"/>
-          <w:sz w:val="24"/>
-          <w:szCs w:val="24"/>
-        </w:rPr>
-        <w:t>, pending feasibility and student interest</w:t>
-      </w:r>
-      <w:r>
-        <w:rPr>
+          <w:iCs/>
+          <w:color w:val="000000" w:themeColor="text1"/>
+          <w:sz w:val="24"/>
+          <w:szCs w:val="24"/>
+        </w:rPr>
+      </w:pPr>
+      <w:r>
+        <w:rPr>
+          <w:rFonts w:ascii="Arial" w:hAnsi="Arial" w:cs="Arial"/>
+          <w:b/>
           <w:bCs/>
-          <w:color w:val="000000" w:themeColor="text1"/>
-          <w:sz w:val="24"/>
-          <w:szCs w:val="24"/>
-        </w:rPr>
-        <w:t>.</w:t>
-      </w:r>
-    </w:p>
-    <w:p>
-      <w:pPr>
-        <w:pStyle w:val="noformatting"/>
-        <w:rPr>
-          <w:rFonts w:ascii="Arial" w:hAnsi="Arial" w:cs="Arial"/>
-          <w:b/>
-          <w:bCs/>
-          <w:i/>
-          <w:color w:val="000000" w:themeColor="text1"/>
-          <w:sz w:val="24"/>
-          <w:szCs w:val="24"/>
-        </w:rPr>
-      </w:pPr>
-    </w:p>
-    <w:p>
-      <w:pPr>
-        <w:pStyle w:val="noformatting"/>
-        <w:rPr>
-          <w:rFonts w:ascii="Arial" w:hAnsi="Arial" w:cs="Arial"/>
-          <w:b/>
-          <w:bCs/>
-          <w:iCs/>
-          <w:color w:val="000000" w:themeColor="text1"/>
-          <w:sz w:val="24"/>
-          <w:szCs w:val="24"/>
-        </w:rPr>
-      </w:pPr>
-      <w:r>
-        <w:rPr>
-          <w:rFonts w:ascii="Arial" w:hAnsi="Arial" w:cs="Arial"/>
-          <w:b/>
-          <w:bCs/>
           <w:iCs/>
           <w:color w:val="000000" w:themeColor="text1"/>
           <w:sz w:val="24"/>
@@ -4400,18 +3979,13 @@
     </w:p>
     <w:p>
       <w:pPr>
-        <w:spacing w:line="240" w:lineRule="auto"/>
-        <w:rPr>
-          <w:rFonts w:ascii="Arial" w:hAnsi="Arial" w:cs="Arial"/>
-          <w:sz w:val="24"/>
-          <w:szCs w:val="24"/>
-        </w:rPr>
-      </w:pPr>
-      <w:r>
-        <w:rPr>
-          <w:rFonts w:ascii="Arial" w:hAnsi="Arial" w:cs="Arial"/>
-          <w:sz w:val="24"/>
-          <w:szCs w:val="24"/>
+        <w:rPr>
+          <w:rFonts w:ascii="Arial" w:hAnsi="Arial" w:cs="Arial"/>
+        </w:rPr>
+      </w:pPr>
+      <w:r>
+        <w:rPr>
+          <w:rFonts w:ascii="Arial" w:hAnsi="Arial" w:cs="Arial"/>
         </w:rPr>
         <w:t xml:space="preserve">The use of Machine Learning tools such as ChatGPT and Claude are permitted, generally. In some </w:t>
       </w:r>
@@ -4419,8 +3993,6 @@
       <w:r>
         <w:rPr>
           <w:rFonts w:ascii="Arial" w:hAnsi="Arial" w:cs="Arial"/>
-          <w:sz w:val="24"/>
-          <w:szCs w:val="24"/>
         </w:rPr>
         <w:t>cases</w:t>
       </w:r>
@@ -4428,8 +4000,6 @@
       <w:r>
         <w:rPr>
           <w:rFonts w:ascii="Arial" w:hAnsi="Arial" w:cs="Arial"/>
-          <w:sz w:val="24"/>
-          <w:szCs w:val="24"/>
         </w:rPr>
         <w:t xml:space="preserve"> we will explore them deliberately. In some </w:t>
       </w:r>
@@ -4437,8 +4007,6 @@
       <w:r>
         <w:rPr>
           <w:rFonts w:ascii="Arial" w:hAnsi="Arial" w:cs="Arial"/>
-          <w:sz w:val="24"/>
-          <w:szCs w:val="24"/>
         </w:rPr>
         <w:t>instances</w:t>
       </w:r>
@@ -4446,36 +4014,26 @@
       <w:r>
         <w:rPr>
           <w:rFonts w:ascii="Arial" w:hAnsi="Arial" w:cs="Arial"/>
-          <w:sz w:val="24"/>
-          <w:szCs w:val="24"/>
         </w:rPr>
         <w:t xml:space="preserve"> you will be discouraged from using these tools. AI represents a sea change for humanity. It also represents a paradigm shift for pedagogy in digital literacy.  </w:t>
       </w:r>
     </w:p>
     <w:p>
       <w:pPr>
-        <w:spacing w:line="240" w:lineRule="auto"/>
-        <w:rPr>
-          <w:rFonts w:ascii="Arial" w:hAnsi="Arial" w:cs="Arial"/>
-          <w:sz w:val="24"/>
-          <w:szCs w:val="24"/>
-        </w:rPr>
-      </w:pPr>
-    </w:p>
-    <w:p>
-      <w:pPr>
-        <w:spacing w:line="240" w:lineRule="auto"/>
-        <w:rPr>
-          <w:rFonts w:ascii="Arial" w:hAnsi="Arial" w:cs="Arial"/>
-          <w:sz w:val="24"/>
-          <w:szCs w:val="24"/>
-        </w:rPr>
-      </w:pPr>
-      <w:r>
-        <w:rPr>
-          <w:rFonts w:ascii="Arial" w:hAnsi="Arial" w:cs="Arial"/>
-          <w:sz w:val="24"/>
-          <w:szCs w:val="24"/>
+        <w:rPr>
+          <w:rFonts w:ascii="Arial" w:hAnsi="Arial" w:cs="Arial"/>
+        </w:rPr>
+      </w:pPr>
+    </w:p>
+    <w:p>
+      <w:pPr>
+        <w:rPr>
+          <w:rFonts w:ascii="Arial" w:hAnsi="Arial" w:cs="Arial"/>
+        </w:rPr>
+      </w:pPr>
+      <w:r>
+        <w:rPr>
+          <w:rFonts w:ascii="Arial" w:hAnsi="Arial" w:cs="Arial"/>
         </w:rPr>
         <w:t xml:space="preserve">I expect you will want to use AI (ChatGPT and image generation tools, at a minimum), in this class. In fact, some assignments will require it. Learning to use AI is an emerging skill—be aware of its limits. If you provide minimum effort prompts, you will get low quality results. You will need to refine your prompts </w:t>
       </w:r>
@@ -4483,8 +4041,6 @@
       <w:r>
         <w:rPr>
           <w:rFonts w:ascii="Arial" w:hAnsi="Arial" w:cs="Arial"/>
-          <w:sz w:val="24"/>
-          <w:szCs w:val="24"/>
         </w:rPr>
         <w:t>in order to</w:t>
       </w:r>
@@ -4492,55 +4048,46 @@
       <w:r>
         <w:rPr>
           <w:rFonts w:ascii="Arial" w:hAnsi="Arial" w:cs="Arial"/>
-          <w:sz w:val="24"/>
-          <w:szCs w:val="24"/>
         </w:rPr>
         <w:t xml:space="preserve"> get good outcomes. This will take work.</w:t>
       </w:r>
     </w:p>
     <w:p>
       <w:pPr>
-        <w:spacing w:line="240" w:lineRule="auto"/>
-        <w:rPr>
-          <w:rFonts w:ascii="Arial" w:hAnsi="Arial" w:cs="Arial"/>
-          <w:sz w:val="24"/>
-          <w:szCs w:val="24"/>
-        </w:rPr>
-      </w:pPr>
-    </w:p>
-    <w:p>
-      <w:pPr>
-        <w:spacing w:line="240" w:lineRule="auto"/>
-        <w:rPr>
-          <w:rFonts w:ascii="Arial" w:hAnsi="Arial" w:cs="Arial"/>
-          <w:sz w:val="24"/>
-          <w:szCs w:val="24"/>
-        </w:rPr>
-      </w:pPr>
-      <w:r>
-        <w:rPr>
-          <w:rFonts w:ascii="Arial" w:hAnsi="Arial" w:cs="Arial"/>
-          <w:sz w:val="24"/>
-          <w:szCs w:val="24"/>
+        <w:rPr>
+          <w:rFonts w:ascii="Arial" w:hAnsi="Arial" w:cs="Arial"/>
+        </w:rPr>
+      </w:pPr>
+    </w:p>
+    <w:p>
+      <w:pPr>
+        <w:rPr>
+          <w:rFonts w:ascii="Arial" w:hAnsi="Arial" w:cs="Arial"/>
+        </w:rPr>
+      </w:pPr>
+      <w:r>
+        <w:rPr>
+          <w:rFonts w:ascii="Arial" w:hAnsi="Arial" w:cs="Arial"/>
         </w:rPr>
         <w:t xml:space="preserve">Don’t trust any code that your AI provides you. You will be responsible for any errors or omissions provided by the tool. AI is a tool, but one that you need to acknowledge using. Please include a paragraph or citation on any assignment that uses AI explaining what you used the AI for and what prompts you used to get the results. Failure to do so </w:t>
       </w:r>
       <w:r>
         <w:rPr>
           <w:rFonts w:ascii="Arial" w:hAnsi="Arial" w:cs="Arial"/>
-          <w:sz w:val="24"/>
-          <w:szCs w:val="24"/>
         </w:rPr>
         <w:t>is in violation of the academic honesty policies.</w:t>
       </w:r>
-    </w:p>
-    <w:p>
-      <w:pPr>
-        <w:spacing w:line="240" w:lineRule="auto"/>
-        <w:rPr>
-          <w:rFonts w:ascii="Arial" w:hAnsi="Arial" w:cs="Arial"/>
-          <w:sz w:val="24"/>
-          <w:szCs w:val="24"/>
+      <w:r>
+        <w:rPr>
+          <w:rFonts w:ascii="Arial" w:hAnsi="Arial" w:cs="Arial"/>
+        </w:rPr>
+        <w:t xml:space="preserve"> Remember: it’s valuable to flow from functional code to interesting code and sharing that evolution shares your thought process.</w:t>
+      </w:r>
+    </w:p>
+    <w:p>
+      <w:pPr>
+        <w:rPr>
+          <w:rFonts w:ascii="Arial" w:hAnsi="Arial" w:cs="Arial"/>
         </w:rPr>
       </w:pPr>
     </w:p>
@@ -4551,8 +4098,6 @@
           <w:b/>
           <w:bCs/>
           <w:color w:val="141414"/>
-          <w:sz w:val="24"/>
-          <w:szCs w:val="24"/>
         </w:rPr>
       </w:pPr>
       <w:r>
@@ -4561,8 +4106,6 @@
           <w:b/>
           <w:bCs/>
           <w:color w:val="141414"/>
-          <w:sz w:val="24"/>
-          <w:szCs w:val="24"/>
         </w:rPr>
         <w:t>A Note on Sexual Misconduct</w:t>
       </w:r>
@@ -4572,8 +4115,6 @@
           <w:b/>
           <w:bCs/>
           <w:color w:val="141414"/>
-          <w:sz w:val="24"/>
-          <w:szCs w:val="24"/>
         </w:rPr>
         <w:t>  </w:t>
@@ -4584,16 +4125,12 @@
         <w:rPr>
           <w:rFonts w:ascii="Arial" w:hAnsi="Arial" w:cs="Arial"/>
           <w:color w:val="141414"/>
-          <w:sz w:val="24"/>
-          <w:szCs w:val="24"/>
         </w:rPr>
       </w:pPr>
       <w:r>
         <w:rPr>
           <w:rFonts w:ascii="Arial" w:hAnsi="Arial" w:cs="Arial"/>
           <w:color w:val="141414"/>
-          <w:sz w:val="24"/>
-          <w:szCs w:val="24"/>
         </w:rPr>
         <w:t xml:space="preserve">Ramapo College is committed to fostering a safe, productive learning environment. Title IX and our college policy prohibit discrimination </w:t>
       </w:r>
@@ -4602,8 +4139,6 @@
         <w:rPr>
           <w:rFonts w:ascii="Arial" w:hAnsi="Arial" w:cs="Arial"/>
           <w:color w:val="141414"/>
-          <w:sz w:val="24"/>
-          <w:szCs w:val="24"/>
         </w:rPr>
         <w:t>on the basis of</w:t>
       </w:r>
@@ -4612,8 +4147,6 @@
         <w:rPr>
           <w:rFonts w:ascii="Arial" w:hAnsi="Arial" w:cs="Arial"/>
           <w:color w:val="141414"/>
-          <w:sz w:val="24"/>
-          <w:szCs w:val="24"/>
         </w:rPr>
         <w:t xml:space="preserve"> sex or gender. Sexual misconduct — including harassment, domestic and dating violence, sexual assault, and stalking are prohibited. The College encourages anyone experiencing sexual misconduct to talk to someone about what happened, so they can get the support they need and our college can respond appropriately. </w:t>
       </w:r>
@@ -4622,8 +4155,6 @@
       <w:pPr>
         <w:rPr>
           <w:rFonts w:ascii="Arial" w:hAnsi="Arial" w:cs="Arial"/>
-          <w:sz w:val="24"/>
-          <w:szCs w:val="24"/>
         </w:rPr>
       </w:pPr>
     </w:p>
@@ -4632,16 +4163,12 @@
         <w:rPr>
           <w:rFonts w:ascii="Arial" w:hAnsi="Arial" w:cs="Arial"/>
           <w:color w:val="141414"/>
-          <w:sz w:val="24"/>
-          <w:szCs w:val="24"/>
         </w:rPr>
       </w:pPr>
       <w:r>
         <w:rPr>
           <w:rFonts w:ascii="Arial" w:hAnsi="Arial" w:cs="Arial"/>
           <w:color w:val="141414"/>
-          <w:sz w:val="24"/>
-          <w:szCs w:val="24"/>
         </w:rPr>
         <w:t xml:space="preserve">If you wish to speak confidentially about an incident of sexual misconduct, please contact the Counseling Center at </w:t>
       </w:r>
@@ -4649,8 +4176,6 @@
         <w:rPr>
           <w:rFonts w:ascii="Arial" w:hAnsi="Arial" w:cs="Arial"/>
           <w:color w:val="0E24B2"/>
-          <w:sz w:val="24"/>
-          <w:szCs w:val="24"/>
         </w:rPr>
         <w:t xml:space="preserve">201-684-7522 </w:t>
       </w:r>
@@ -4658,8 +4183,6 @@
         <w:rPr>
           <w:rFonts w:ascii="Arial" w:hAnsi="Arial" w:cs="Arial"/>
           <w:color w:val="141414"/>
-          <w:sz w:val="24"/>
-          <w:szCs w:val="24"/>
         </w:rPr>
         <w:t xml:space="preserve">or </w:t>
       </w:r>
@@ -4667,8 +4190,6 @@
         <w:rPr>
           <w:rFonts w:ascii="Arial" w:hAnsi="Arial" w:cs="Arial"/>
           <w:color w:val="0E24B2"/>
-          <w:sz w:val="24"/>
-          <w:szCs w:val="24"/>
         </w:rPr>
         <w:t xml:space="preserve">201-684-6666 </w:t>
       </w:r>
@@ -4676,8 +4197,6 @@
         <w:rPr>
           <w:rFonts w:ascii="Arial" w:hAnsi="Arial" w:cs="Arial"/>
           <w:color w:val="141414"/>
-          <w:sz w:val="24"/>
-          <w:szCs w:val="24"/>
         </w:rPr>
         <w:t xml:space="preserve">during nights and weekends. If you wish to report sexual misconduct or have questions about policies and procedures regarding sexual misconduct, please contact the College’s Title IX Coordinator at </w:t>
       </w:r>
@@ -4685,8 +4204,6 @@
         <w:rPr>
           <w:rFonts w:ascii="Arial" w:hAnsi="Arial" w:cs="Arial"/>
           <w:color w:val="0E24B2"/>
-          <w:sz w:val="24"/>
-          <w:szCs w:val="24"/>
         </w:rPr>
         <w:t>201-684-7540</w:t>
       </w:r>
@@ -4694,8 +4211,6 @@
         <w:rPr>
           <w:rFonts w:ascii="Arial" w:hAnsi="Arial" w:cs="Arial"/>
           <w:color w:val="141414"/>
-          <w:sz w:val="24"/>
-          <w:szCs w:val="24"/>
         </w:rPr>
         <w:t xml:space="preserve">. </w:t>
       </w:r>
@@ -4704,27 +4219,20 @@
       <w:pPr>
         <w:rPr>
           <w:rFonts w:ascii="Arial" w:hAnsi="Arial" w:cs="Arial"/>
-          <w:sz w:val="24"/>
-          <w:szCs w:val="24"/>
-        </w:rPr>
-      </w:pPr>
-    </w:p>
-    <w:p>
-      <w:pPr>
-        <w:rPr>
-          <w:rFonts w:ascii="Arial" w:hAnsi="Arial" w:cs="Arial"/>
-          <w:sz w:val="24"/>
-          <w:szCs w:val="24"/>
+        </w:rPr>
+      </w:pPr>
+    </w:p>
+    <w:p>
+      <w:pPr>
+        <w:rPr>
+          <w:rFonts w:ascii="Arial" w:hAnsi="Arial" w:cs="Arial"/>
         </w:rPr>
       </w:pPr>
       <w:r>
         <w:rPr>
           <w:rFonts w:ascii="Arial" w:hAnsi="Arial" w:cs="Arial"/>
           <w:color w:val="141414"/>
-          <w:sz w:val="24"/>
-          <w:szCs w:val="24"/>
-        </w:rPr>
-        <w:lastRenderedPageBreak/>
+        </w:rPr>
         <w:t xml:space="preserve">The College is legally obligated to investigate reports of sexual misconduct, and therefore it cannot guarantee the confidentiality of a report, but it will consider a request for confidentiality and respect it to the extent possible. </w:t>
       </w:r>
     </w:p>
@@ -4732,8 +4240,6 @@
       <w:pPr>
         <w:rPr>
           <w:rFonts w:ascii="Arial" w:hAnsi="Arial" w:cs="Arial"/>
-          <w:sz w:val="24"/>
-          <w:szCs w:val="24"/>
         </w:rPr>
       </w:pPr>
     </w:p>
@@ -4742,16 +4248,12 @@
         <w:rPr>
           <w:rFonts w:ascii="Arial" w:hAnsi="Arial" w:cs="Arial"/>
           <w:color w:val="141414"/>
-          <w:sz w:val="24"/>
-          <w:szCs w:val="24"/>
         </w:rPr>
       </w:pPr>
       <w:r>
         <w:rPr>
           <w:rFonts w:ascii="Arial" w:hAnsi="Arial" w:cs="Arial"/>
           <w:color w:val="141414"/>
-          <w:sz w:val="24"/>
-          <w:szCs w:val="24"/>
         </w:rPr>
         <w:t xml:space="preserve">As a faculty member, I am also required by our </w:t>
       </w:r>
@@ -4760,8 +4262,6 @@
         <w:rPr>
           <w:rFonts w:ascii="Arial" w:hAnsi="Arial" w:cs="Arial"/>
           <w:color w:val="141414"/>
-          <w:sz w:val="24"/>
-          <w:szCs w:val="24"/>
         </w:rPr>
         <w:t>College</w:t>
       </w:r>
@@ -4770,19 +4270,14 @@
         <w:rPr>
           <w:rFonts w:ascii="Arial" w:hAnsi="Arial" w:cs="Arial"/>
           <w:color w:val="141414"/>
-          <w:sz w:val="24"/>
-          <w:szCs w:val="24"/>
         </w:rPr>
         <w:t xml:space="preserve"> to report incidents of sexual misconduct and thus cannot guarantee confidentiality, but I will respect your privacy and only share the information with those who have a duty to respond. Should I become aware of an incident involving sexual misconduct, I must provide our Title IX Coordinator with relevant details such as the names of those involved in the incident. </w:t>
       </w:r>
     </w:p>
     <w:p>
       <w:pPr>
-        <w:spacing w:line="240" w:lineRule="auto"/>
-        <w:rPr>
-          <w:rFonts w:ascii="Arial" w:hAnsi="Arial" w:cs="Arial"/>
-          <w:sz w:val="24"/>
-          <w:szCs w:val="24"/>
+        <w:rPr>
+          <w:rFonts w:ascii="Arial" w:hAnsi="Arial" w:cs="Arial"/>
         </w:rPr>
       </w:pPr>
     </w:p>
@@ -5018,6 +4513,7 @@
           <w:sz w:val="24"/>
           <w:szCs w:val="24"/>
         </w:rPr>
+        <w:lastRenderedPageBreak/>
         <w:t>Server and Language</w:t>
       </w:r>
       <w:r>
@@ -5108,15 +4604,11 @@
       <w:pPr>
         <w:rPr>
           <w:rFonts w:ascii="Arial" w:hAnsi="Arial" w:cs="Arial"/>
-          <w:sz w:val="24"/>
-          <w:szCs w:val="24"/>
-        </w:rPr>
-      </w:pPr>
-      <w:r>
-        <w:rPr>
-          <w:rFonts w:ascii="Arial" w:hAnsi="Arial" w:cs="Arial"/>
-          <w:sz w:val="24"/>
-          <w:szCs w:val="24"/>
+        </w:rPr>
+      </w:pPr>
+      <w:r>
+        <w:rPr>
+          <w:rFonts w:ascii="Arial" w:hAnsi="Arial" w:cs="Arial"/>
         </w:rPr>
         <w:br/>
         <w:t xml:space="preserve">SC tutorial: Getting Started With SC: sections 1 – 5 </w:t>
@@ -5127,8 +4619,6 @@
         <w:rPr>
           <w:rStyle w:val="Hyperlink"/>
           <w:rFonts w:ascii="Arial" w:hAnsi="Arial" w:cs="Arial"/>
-          <w:sz w:val="24"/>
-          <w:szCs w:val="24"/>
         </w:rPr>
       </w:pPr>
       <w:hyperlink r:id="rId20" w:history="1">
@@ -5136,8 +4626,6 @@
           <w:rPr>
             <w:rStyle w:val="Hyperlink"/>
             <w:rFonts w:ascii="Arial" w:hAnsi="Arial" w:cs="Arial"/>
-            <w:sz w:val="24"/>
-            <w:szCs w:val="24"/>
           </w:rPr>
           <w:t>https://doc.sccode.org/Tutorials/Getting-Started/00-Getting-Started-With-SC.html</w:t>
         </w:r>
@@ -5147,8 +4635,6 @@
       <w:pPr>
         <w:rPr>
           <w:rFonts w:ascii="Arial" w:hAnsi="Arial" w:cs="Arial"/>
-          <w:sz w:val="24"/>
-          <w:szCs w:val="24"/>
         </w:rPr>
       </w:pPr>
     </w:p>
@@ -5158,8 +4644,6 @@
           <w:rFonts w:ascii="Arial" w:hAnsi="Arial" w:cs="Arial"/>
           <w:b/>
           <w:bCs/>
-          <w:sz w:val="24"/>
-          <w:szCs w:val="24"/>
         </w:rPr>
       </w:pPr>
       <w:r>
@@ -5167,8 +4651,6 @@
           <w:rFonts w:ascii="Arial" w:hAnsi="Arial" w:cs="Arial"/>
           <w:b/>
           <w:bCs/>
-          <w:sz w:val="24"/>
-          <w:szCs w:val="24"/>
         </w:rPr>
         <w:t>Etude</w:t>
       </w:r>
@@ -5177,8 +4659,6 @@
           <w:rFonts w:ascii="Arial" w:hAnsi="Arial" w:cs="Arial"/>
           <w:b/>
           <w:bCs/>
-          <w:sz w:val="24"/>
-          <w:szCs w:val="24"/>
         </w:rPr>
         <w:t xml:space="preserve"> </w:t>
       </w:r>
@@ -5187,8 +4667,6 @@
           <w:rFonts w:ascii="Arial" w:hAnsi="Arial" w:cs="Arial"/>
           <w:b/>
           <w:bCs/>
-          <w:sz w:val="24"/>
-          <w:szCs w:val="24"/>
         </w:rPr>
         <w:t>1</w:t>
       </w:r>
@@ -5197,8 +4675,6 @@
           <w:rFonts w:ascii="Arial" w:hAnsi="Arial" w:cs="Arial"/>
           <w:b/>
           <w:bCs/>
-          <w:sz w:val="24"/>
-          <w:szCs w:val="24"/>
         </w:rPr>
         <w:t xml:space="preserve"> (due 9/</w:t>
       </w:r>
@@ -5207,8 +4683,6 @@
           <w:rFonts w:ascii="Arial" w:hAnsi="Arial" w:cs="Arial"/>
           <w:b/>
           <w:bCs/>
-          <w:sz w:val="24"/>
-          <w:szCs w:val="24"/>
         </w:rPr>
         <w:t xml:space="preserve">3 </w:t>
       </w:r>
@@ -5217,8 +4691,6 @@
           <w:rFonts w:ascii="Arial" w:hAnsi="Arial" w:cs="Arial"/>
           <w:b/>
           <w:bCs/>
-          <w:sz w:val="24"/>
-          <w:szCs w:val="24"/>
         </w:rPr>
         <w:t xml:space="preserve">next week): </w:t>
       </w:r>
@@ -5229,17 +4701,13 @@
           <w:rFonts w:ascii="Arial" w:hAnsi="Arial" w:cs="Arial"/>
           <w:i/>
           <w:iCs/>
-          <w:sz w:val="24"/>
-          <w:szCs w:val="24"/>
-        </w:rPr>
-      </w:pPr>
-      <w:r>
-        <w:rPr>
-          <w:rFonts w:ascii="Arial" w:hAnsi="Arial" w:cs="Arial"/>
-          <w:i/>
-          <w:iCs/>
-          <w:sz w:val="24"/>
-          <w:szCs w:val="24"/>
+        </w:rPr>
+      </w:pPr>
+      <w:r>
+        <w:rPr>
+          <w:rFonts w:ascii="Arial" w:hAnsi="Arial" w:cs="Arial"/>
+          <w:i/>
+          <w:iCs/>
         </w:rPr>
         <w:t xml:space="preserve">Go shopping! </w:t>
       </w:r>
@@ -5248,16 +4716,12 @@
       <w:pPr>
         <w:rPr>
           <w:rFonts w:ascii="Arial" w:hAnsi="Arial" w:cs="Arial"/>
-          <w:sz w:val="24"/>
-          <w:szCs w:val="24"/>
-        </w:rPr>
-      </w:pPr>
-      <w:r>
-        <w:rPr>
-          <w:rFonts w:ascii="Arial" w:hAnsi="Arial" w:cs="Arial"/>
-          <w:color w:val="000000" w:themeColor="text1"/>
-          <w:sz w:val="24"/>
-          <w:szCs w:val="24"/>
+        </w:rPr>
+      </w:pPr>
+      <w:r>
+        <w:rPr>
+          <w:rFonts w:ascii="Arial" w:hAnsi="Arial" w:cs="Arial"/>
+          <w:color w:val="000000" w:themeColor="text1"/>
         </w:rPr>
         <w:t>Try out all examples from 2 - SC2-examples_1.</w:t>
       </w:r>
@@ -5267,16 +4731,12 @@
         <w:rPr>
           <w:rFonts w:ascii="Arial" w:hAnsi="Arial" w:cs="Arial"/>
           <w:color w:val="000000" w:themeColor="text1"/>
-          <w:sz w:val="24"/>
-          <w:szCs w:val="24"/>
-        </w:rPr>
-      </w:pPr>
-      <w:r>
-        <w:rPr>
-          <w:rFonts w:ascii="Arial" w:hAnsi="Arial" w:cs="Arial"/>
-          <w:color w:val="000000" w:themeColor="text1"/>
-          <w:sz w:val="24"/>
-          <w:szCs w:val="24"/>
+        </w:rPr>
+      </w:pPr>
+      <w:r>
+        <w:rPr>
+          <w:rFonts w:ascii="Arial" w:hAnsi="Arial" w:cs="Arial"/>
+          <w:color w:val="000000" w:themeColor="text1"/>
         </w:rPr>
         <w:t>Or</w:t>
       </w:r>
@@ -5285,16 +4745,12 @@
       <w:pPr>
         <w:rPr>
           <w:rFonts w:ascii="Arial" w:hAnsi="Arial" w:cs="Arial"/>
-          <w:sz w:val="24"/>
-          <w:szCs w:val="24"/>
-        </w:rPr>
-      </w:pPr>
-      <w:r>
-        <w:rPr>
-          <w:rFonts w:ascii="Arial" w:hAnsi="Arial" w:cs="Arial"/>
-          <w:color w:val="000000" w:themeColor="text1"/>
-          <w:sz w:val="24"/>
-          <w:szCs w:val="24"/>
+        </w:rPr>
+      </w:pPr>
+      <w:r>
+        <w:rPr>
+          <w:rFonts w:ascii="Arial" w:hAnsi="Arial" w:cs="Arial"/>
+          <w:color w:val="000000" w:themeColor="text1"/>
         </w:rPr>
         <w:t xml:space="preserve"> Go to </w:t>
       </w:r>
@@ -5303,8 +4759,6 @@
           <w:rPr>
             <w:rStyle w:val="Hyperlink"/>
             <w:rFonts w:ascii="Arial" w:hAnsi="Arial" w:cs="Arial"/>
-            <w:sz w:val="24"/>
-            <w:szCs w:val="24"/>
           </w:rPr>
           <w:t>http://sccode.org/</w:t>
         </w:r>
@@ -5313,16 +4767,12 @@
         <w:rPr>
           <w:rFonts w:ascii="Arial" w:hAnsi="Arial" w:cs="Arial"/>
           <w:color w:val="000000" w:themeColor="text1"/>
-          <w:sz w:val="24"/>
-          <w:szCs w:val="24"/>
         </w:rPr>
         <w:t xml:space="preserve">  </w:t>
       </w:r>
       <w:r>
         <w:rPr>
           <w:rFonts w:ascii="Arial" w:hAnsi="Arial" w:cs="Arial"/>
-          <w:sz w:val="24"/>
-          <w:szCs w:val="24"/>
         </w:rPr>
         <w:t xml:space="preserve">Try out at least 10 sound examples. </w:t>
       </w:r>
@@ -5331,31 +4781,23 @@
       <w:pPr>
         <w:rPr>
           <w:rFonts w:ascii="Arial" w:hAnsi="Arial" w:cs="Arial"/>
-          <w:sz w:val="24"/>
-          <w:szCs w:val="24"/>
-        </w:rPr>
-      </w:pPr>
-      <w:r>
-        <w:rPr>
-          <w:rFonts w:ascii="Arial" w:hAnsi="Arial" w:cs="Arial"/>
-          <w:sz w:val="24"/>
-          <w:szCs w:val="24"/>
+        </w:rPr>
+      </w:pPr>
+      <w:r>
+        <w:rPr>
+          <w:rFonts w:ascii="Arial" w:hAnsi="Arial" w:cs="Arial"/>
         </w:rPr>
         <w:t>Select one that you would like to understand better and</w:t>
       </w:r>
       <w:r>
         <w:rPr>
           <w:rFonts w:ascii="Arial" w:hAnsi="Arial" w:cs="Arial"/>
-          <w:sz w:val="24"/>
-          <w:szCs w:val="24"/>
         </w:rPr>
         <w:t xml:space="preserve"> modify it.</w:t>
       </w:r>
       <w:r>
         <w:rPr>
           <w:rFonts w:ascii="Arial" w:hAnsi="Arial" w:cs="Arial"/>
-          <w:sz w:val="24"/>
-          <w:szCs w:val="24"/>
         </w:rPr>
         <w:t xml:space="preserve"> </w:t>
       </w:r>
@@ -5364,15 +4806,11 @@
       <w:pPr>
         <w:rPr>
           <w:rFonts w:ascii="Arial" w:hAnsi="Arial" w:cs="Arial"/>
-          <w:sz w:val="24"/>
-          <w:szCs w:val="24"/>
-        </w:rPr>
-      </w:pPr>
-      <w:r>
-        <w:rPr>
-          <w:rFonts w:ascii="Arial" w:hAnsi="Arial" w:cs="Arial"/>
-          <w:sz w:val="24"/>
-          <w:szCs w:val="24"/>
+        </w:rPr>
+      </w:pPr>
+      <w:r>
+        <w:rPr>
+          <w:rFonts w:ascii="Arial" w:hAnsi="Arial" w:cs="Arial"/>
         </w:rPr>
         <w:t>Modify it so it sounds like something you are excited about.</w:t>
       </w:r>
@@ -5381,23 +4819,17 @@
       <w:pPr>
         <w:rPr>
           <w:rFonts w:ascii="Arial" w:hAnsi="Arial" w:cs="Arial"/>
-          <w:sz w:val="24"/>
-          <w:szCs w:val="24"/>
-        </w:rPr>
-      </w:pPr>
-      <w:r>
-        <w:rPr>
-          <w:rFonts w:ascii="Arial" w:hAnsi="Arial" w:cs="Arial"/>
-          <w:sz w:val="24"/>
-          <w:szCs w:val="24"/>
+        </w:rPr>
+      </w:pPr>
+      <w:r>
+        <w:rPr>
+          <w:rFonts w:ascii="Arial" w:hAnsi="Arial" w:cs="Arial"/>
         </w:rPr>
         <w:t>S</w:t>
       </w:r>
       <w:r>
         <w:rPr>
           <w:rFonts w:ascii="Arial" w:hAnsi="Arial" w:cs="Arial"/>
-          <w:sz w:val="24"/>
-          <w:szCs w:val="24"/>
         </w:rPr>
         <w:t xml:space="preserve">ubmit it on </w:t>
       </w:r>
@@ -5405,8 +4837,6 @@
       <w:r>
         <w:rPr>
           <w:rFonts w:ascii="Arial" w:hAnsi="Arial" w:cs="Arial"/>
-          <w:sz w:val="24"/>
-          <w:szCs w:val="24"/>
         </w:rPr>
         <w:t>github</w:t>
       </w:r>
@@ -5414,16 +4844,12 @@
       <w:r>
         <w:rPr>
           <w:rFonts w:ascii="Arial" w:hAnsi="Arial" w:cs="Arial"/>
-          <w:sz w:val="24"/>
-          <w:szCs w:val="24"/>
         </w:rPr>
         <w:t>.</w:t>
       </w:r>
       <w:r>
         <w:rPr>
           <w:rFonts w:ascii="Arial" w:hAnsi="Arial" w:cs="Arial"/>
-          <w:sz w:val="24"/>
-          <w:szCs w:val="24"/>
         </w:rPr>
         <w:t xml:space="preserve"> </w:t>
       </w:r>
@@ -6026,6 +5452,7 @@
           <w:sz w:val="24"/>
           <w:szCs w:val="24"/>
         </w:rPr>
+        <w:lastRenderedPageBreak/>
         <w:t>Bring to class these working instruments and prepare by learning how to use them. We will improvise together!</w:t>
       </w:r>
       <w:r>
@@ -6339,15 +5766,7 @@
           <w:sz w:val="24"/>
           <w:szCs w:val="24"/>
         </w:rPr>
-        <w:t xml:space="preserve">David Behrman is a composer and artist active since the 1960s. Over the years he has made sound and multimedia installations for gallery spaces as well as musical compositions for performance in concerts. Most of his pieces feature flexible structures and the use of technology in personal ways; compositions rely on interactive real-time relationships with imaginative </w:t>
-      </w:r>
-      <w:r>
-        <w:rPr>
-          <w:sz w:val="24"/>
-          <w:szCs w:val="24"/>
-        </w:rPr>
-        <w:lastRenderedPageBreak/>
-        <w:t xml:space="preserve">performers. Together with Robert Ashley, Alvin Lucier and Gordon Mumma, Behrman founded the Sonic Arts Union in 1966. He had a long association with the Merce Cunningham Dance Company as composer and performer, created music for several of the Company’s repertory pieces, and was a member of the Company’s Music Committee during its last years. He was a fellow at the American Academy in Berlin in 2016. Audio recordings of his works are on the XI, Lovely Music, Pogus, New World, WERGO, Black Truffle Records and Alga </w:t>
+        <w:t xml:space="preserve">David Behrman is a composer and artist active since the 1960s. Over the years he has made sound and multimedia installations for gallery spaces as well as musical compositions for performance in concerts. Most of his pieces feature flexible structures and the use of technology in personal ways; compositions rely on interactive real-time relationships with imaginative performers. Together with Robert Ashley, Alvin Lucier and Gordon Mumma, Behrman founded the Sonic Arts Union in 1966. He had a long association with the Merce Cunningham Dance Company as composer and performer, created music for several of the Company’s repertory pieces, and was a member of the Company’s Music Committee during its last years. He was a fellow at the American Academy in Berlin in 2016. Audio recordings of his works are on the XI, Lovely Music, Pogus, New World, WERGO, Black Truffle Records and Alga </w:t>
       </w:r>
       <w:proofErr w:type="spellStart"/>
       <w:r>
@@ -7474,6 +6893,7 @@
           <w:sz w:val="24"/>
           <w:szCs w:val="24"/>
         </w:rPr>
+        <w:lastRenderedPageBreak/>
         <w:t>Joh</w:t>
       </w:r>
       <w:r>
@@ -7967,7 +7387,6 @@
           <w:sz w:val="24"/>
           <w:szCs w:val="24"/>
         </w:rPr>
-        <w:lastRenderedPageBreak/>
         <w:t xml:space="preserve">Incorporate a sampler into your favorite </w:t>
       </w:r>
       <w:proofErr w:type="spellStart"/>
@@ -8807,7 +8226,6 @@
           <w:sz w:val="24"/>
           <w:szCs w:val="24"/>
         </w:rPr>
-        <w:lastRenderedPageBreak/>
         <w:t xml:space="preserve">Exploration of Daisy </w:t>
       </w:r>
       <w:proofErr w:type="spellStart"/>
@@ -9097,6 +8515,7 @@
           <w:sz w:val="24"/>
           <w:szCs w:val="24"/>
         </w:rPr>
+        <w:lastRenderedPageBreak/>
         <w:t xml:space="preserve">Class 10 Wednesday </w:t>
       </w:r>
       <w:r>
@@ -9441,17 +8860,7 @@
           <w:sz w:val="24"/>
           <w:szCs w:val="24"/>
         </w:rPr>
-        <w:t xml:space="preserve">, to allow groundbreaking sonic research into a rich unexploited area: the manipulation of large sound corpora. Indeed, with access to, genesis of, and storage of large sound </w:t>
-      </w:r>
-      <w:r>
-        <w:rPr>
-          <w:iCs/>
-          <w:color w:val="000000" w:themeColor="text1"/>
-          <w:sz w:val="24"/>
-          <w:szCs w:val="24"/>
-        </w:rPr>
-        <w:lastRenderedPageBreak/>
-        <w:t>banks now commonplace, novel ways of abstracting and manipulating them are needed to mine their inherent potential.</w:t>
+        <w:t>, to allow groundbreaking sonic research into a rich unexploited area: the manipulation of large sound corpora. Indeed, with access to, genesis of, and storage of large sound banks now commonplace, novel ways of abstracting and manipulating them are needed to mine their inherent potential.</w:t>
       </w:r>
       <w:r>
         <w:rPr>
@@ -9830,6 +9239,7 @@
           <w:sz w:val="24"/>
           <w:szCs w:val="24"/>
         </w:rPr>
+        <w:lastRenderedPageBreak/>
         <w:t>Class 1</w:t>
       </w:r>
       <w:r>
@@ -10003,8 +9413,6 @@
         <w:rPr>
           <w:rFonts w:ascii="Arial" w:hAnsi="Arial" w:cs="Arial"/>
           <w:color w:val="000000" w:themeColor="text1"/>
-          <w:sz w:val="24"/>
-          <w:szCs w:val="24"/>
         </w:rPr>
       </w:pPr>
     </w:p>
@@ -10029,9 +9437,6 @@
 <w:endnotes xmlns:wpc="http://schemas.microsoft.com/office/word/2010/wordprocessingCanvas" xmlns:cx="http://schemas.microsoft.com/office/drawing/2014/chartex" xmlns:cx1="http://schemas.microsoft.com/office/drawing/2015/9/8/chartex" xmlns:cx2="http://schemas.microsoft.com/office/drawing/2015/10/21/chartex" xmlns:cx3="http://schemas.microsoft.com/office/drawing/2016/5/9/chartex" xmlns:cx4="http://schemas.microsoft.com/office/drawing/2016/5/10/chartex" xmlns:cx5="http://schemas.microsoft.com/office/drawing/2016/5/11/chartex" xmlns:cx6="http://schemas.microsoft.com/office/drawing/2016/5/12/chartex" xmlns:cx7="http://schemas.microsoft.com/office/drawing/2016/5/13/chartex" xmlns:cx8="http://schemas.microsoft.com/office/drawing/2016/5/14/chartex" xmlns:mc="http://schemas.openxmlformats.org/markup-compatibility/2006" xmlns:aink="http://schemas.microsoft.com/office/drawing/2016/ink" xmlns:am3d="http://schemas.microsoft.com/office/drawing/2017/model3d" xmlns:o="urn:schemas-microsoft-com:office:office" xmlns:oel="http://schemas.microsoft.com/office/2019/extlst" xmlns:r="http://schemas.openxmlformats.org/officeDocument/2006/relationships" xmlns:m="http://schemas.openxmlformats.org/officeDocument/2006/math" xmlns:v="urn:schemas-microsoft-com:vml" xmlns:wp14="http://schemas.microsoft.com/office/word/2010/wordprocessingDrawing" xmlns:wp="http://schemas.openxmlformats.org/drawingml/2006/wordprocessingDrawing" xmlns:w10="urn:schemas-microsoft-com:office:word" xmlns:w="http://schemas.openxmlformats.org/wordprocessingml/2006/main" xmlns:w14="http://schemas.microsoft.com/office/word/2010/wordml" xmlns:w15="http://schemas.microsoft.com/office/word/2012/wordml" xmlns:w16cex="http://schemas.microsoft.com/office/word/2018/wordml/cex" xmlns:w16cid="http://schemas.microsoft.com/office/word/2016/wordml/cid" xmlns:w16="http://schemas.microsoft.com/office/word/2018/wordml" xmlns:w16du="http://schemas.microsoft.com/office/word/2023/wordml/word16du" xmlns:w16sdtdh="http://schemas.microsoft.com/office/word/2020/wordml/sdtdatahash" xmlns:w16sdtfl="http://schemas.microsoft.com/office/word/2024/wordml/sdtformatlock" xmlns:w16se="http://schemas.microsoft.com/office/word/2015/wordml/symex" xmlns:wpg="http://schemas.microsoft.com/office/word/2010/wordprocessingGroup" xmlns:wpi="http://schemas.microsoft.com/office/word/2010/wordprocessingInk" xmlns:wne="http://schemas.microsoft.com/office/word/2006/wordml" xmlns:wps="http://schemas.microsoft.com/office/word/2010/wordprocessingShape" mc:Ignorable="w14 w15 w16se w16cid w16 w16cex w16sdtdh w16sdtfl w16du wp14">
   <w:endnote w:type="separator" w:id="-1">
     <w:p>
-      <w:pPr>
-        <w:spacing w:line="240" w:lineRule="auto"/>
-      </w:pPr>
       <w:r>
         <w:separator/>
       </w:r>
@@ -10039,9 +9444,6 @@
   </w:endnote>
   <w:endnote w:type="continuationSeparator" w:id="0">
     <w:p>
-      <w:pPr>
-        <w:spacing w:line="240" w:lineRule="auto"/>
-      </w:pPr>
       <w:r>
         <w:continuationSeparator/>
       </w:r>
@@ -10084,9 +9486,6 @@
 <w:footnotes xmlns:wpc="http://schemas.microsoft.com/office/word/2010/wordprocessingCanvas" xmlns:cx="http://schemas.microsoft.com/office/drawing/2014/chartex" xmlns:cx1="http://schemas.microsoft.com/office/drawing/2015/9/8/chartex" xmlns:cx2="http://schemas.microsoft.com/office/drawing/2015/10/21/chartex" xmlns:cx3="http://schemas.microsoft.com/office/drawing/2016/5/9/chartex" xmlns:cx4="http://schemas.microsoft.com/office/drawing/2016/5/10/chartex" xmlns:cx5="http://schemas.microsoft.com/office/drawing/2016/5/11/chartex" xmlns:cx6="http://schemas.microsoft.com/office/drawing/2016/5/12/chartex" xmlns:cx7="http://schemas.microsoft.com/office/drawing/2016/5/13/chartex" xmlns:cx8="http://schemas.microsoft.com/office/drawing/2016/5/14/chartex" xmlns:mc="http://schemas.openxmlformats.org/markup-compatibility/2006" xmlns:aink="http://schemas.microsoft.com/office/drawing/2016/ink" xmlns:am3d="http://schemas.microsoft.com/office/drawing/2017/model3d" xmlns:o="urn:schemas-microsoft-com:office:office" xmlns:oel="http://schemas.microsoft.com/office/2019/extlst" xmlns:r="http://schemas.openxmlformats.org/officeDocument/2006/relationships" xmlns:m="http://schemas.openxmlformats.org/officeDocument/2006/math" xmlns:v="urn:schemas-microsoft-com:vml" xmlns:wp14="http://schemas.microsoft.com/office/word/2010/wordprocessingDrawing" xmlns:wp="http://schemas.openxmlformats.org/drawingml/2006/wordprocessingDrawing" xmlns:w10="urn:schemas-microsoft-com:office:word" xmlns:w="http://schemas.openxmlformats.org/wordprocessingml/2006/main" xmlns:w14="http://schemas.microsoft.com/office/word/2010/wordml" xmlns:w15="http://schemas.microsoft.com/office/word/2012/wordml" xmlns:w16cex="http://schemas.microsoft.com/office/word/2018/wordml/cex" xmlns:w16cid="http://schemas.microsoft.com/office/word/2016/wordml/cid" xmlns:w16="http://schemas.microsoft.com/office/word/2018/wordml" xmlns:w16du="http://schemas.microsoft.com/office/word/2023/wordml/word16du" xmlns:w16sdtdh="http://schemas.microsoft.com/office/word/2020/wordml/sdtdatahash" xmlns:w16sdtfl="http://schemas.microsoft.com/office/word/2024/wordml/sdtformatlock" xmlns:w16se="http://schemas.microsoft.com/office/word/2015/wordml/symex" xmlns:wpg="http://schemas.microsoft.com/office/word/2010/wordprocessingGroup" xmlns:wpi="http://schemas.microsoft.com/office/word/2010/wordprocessingInk" xmlns:wne="http://schemas.microsoft.com/office/word/2006/wordml" xmlns:wps="http://schemas.microsoft.com/office/word/2010/wordprocessingShape" mc:Ignorable="w14 w15 w16se w16cid w16 w16cex w16sdtdh w16sdtfl w16du wp14">
   <w:footnote w:type="separator" w:id="-1">
     <w:p>
-      <w:pPr>
-        <w:spacing w:line="240" w:lineRule="auto"/>
-      </w:pPr>
       <w:r>
         <w:separator/>
       </w:r>
@@ -10094,9 +9493,6 @@
   </w:footnote>
   <w:footnote w:type="continuationSeparator" w:id="0">
     <w:p>
-      <w:pPr>
-        <w:spacing w:line="240" w:lineRule="auto"/>
-      </w:pPr>
       <w:r>
         <w:continuationSeparator/>
       </w:r>
@@ -14874,12 +14270,14 @@
   <w:style w:type="paragraph" w:default="1" w:styleId="Normal">
     <w:name w:val="Normal"/>
     <w:qFormat/>
-    <w:rsid w:val="000F7326"/>
+    <w:rsid w:val="00B86F06"/>
     <w:pPr>
-      <w:spacing w:after="0"/>
+      <w:spacing w:after="0" w:line="240" w:lineRule="auto"/>
     </w:pPr>
     <w:rPr>
-      <w:rFonts w:ascii="Times New Roman" w:hAnsi="Times New Roman"/>
+      <w:rFonts w:ascii="Times New Roman" w:eastAsia="Times New Roman" w:hAnsi="Times New Roman" w:cs="Times New Roman"/>
+      <w:sz w:val="24"/>
+      <w:szCs w:val="24"/>
     </w:rPr>
   </w:style>
   <w:style w:type="paragraph" w:styleId="Heading2">
@@ -14890,11 +14288,10 @@
     <w:qFormat/>
     <w:rsid w:val="00832527"/>
     <w:pPr>
-      <w:spacing w:before="100" w:beforeAutospacing="1" w:after="100" w:afterAutospacing="1" w:line="240" w:lineRule="auto"/>
+      <w:spacing w:before="100" w:beforeAutospacing="1" w:after="100" w:afterAutospacing="1"/>
       <w:outlineLvl w:val="1"/>
     </w:pPr>
     <w:rPr>
-      <w:rFonts w:eastAsia="Times New Roman" w:cs="Times New Roman"/>
       <w:b/>
       <w:bCs/>
       <w:sz w:val="36"/>
@@ -14966,9 +14363,6 @@
     <w:semiHidden/>
     <w:unhideWhenUsed/>
     <w:rsid w:val="007D5786"/>
-    <w:pPr>
-      <w:spacing w:line="240" w:lineRule="auto"/>
-    </w:pPr>
     <w:rPr>
       <w:rFonts w:ascii="Tahoma" w:hAnsi="Tahoma" w:cs="Tahoma"/>
       <w:sz w:val="16"/>
@@ -14995,12 +14389,14 @@
     <w:qFormat/>
     <w:rsid w:val="009F2409"/>
     <w:pPr>
-      <w:spacing w:after="200"/>
+      <w:spacing w:after="200" w:line="276" w:lineRule="auto"/>
       <w:ind w:left="720"/>
       <w:contextualSpacing/>
     </w:pPr>
     <w:rPr>
-      <w:rFonts w:asciiTheme="minorHAnsi" w:hAnsiTheme="minorHAnsi"/>
+      <w:rFonts w:asciiTheme="minorHAnsi" w:eastAsiaTheme="minorHAnsi" w:hAnsiTheme="minorHAnsi" w:cstheme="minorBidi"/>
+      <w:sz w:val="22"/>
+      <w:szCs w:val="22"/>
     </w:rPr>
   </w:style>
   <w:style w:type="paragraph" w:styleId="NormalWeb">
@@ -15010,13 +14406,8 @@
     <w:unhideWhenUsed/>
     <w:rsid w:val="00386D11"/>
     <w:pPr>
-      <w:spacing w:before="100" w:beforeAutospacing="1" w:after="100" w:afterAutospacing="1" w:line="240" w:lineRule="auto"/>
+      <w:spacing w:before="100" w:beforeAutospacing="1" w:after="100" w:afterAutospacing="1"/>
     </w:pPr>
-    <w:rPr>
-      <w:rFonts w:eastAsia="Times New Roman" w:cs="Times New Roman"/>
-      <w:sz w:val="24"/>
-      <w:szCs w:val="24"/>
-    </w:rPr>
   </w:style>
   <w:style w:type="paragraph" w:styleId="Header">
     <w:name w:val="header"/>
@@ -15030,8 +14421,12 @@
         <w:tab w:val="center" w:pos="4680"/>
         <w:tab w:val="right" w:pos="9360"/>
       </w:tabs>
-      <w:spacing w:line="240" w:lineRule="auto"/>
     </w:pPr>
+    <w:rPr>
+      <w:rFonts w:eastAsiaTheme="minorHAnsi" w:cstheme="minorBidi"/>
+      <w:sz w:val="22"/>
+      <w:szCs w:val="22"/>
+    </w:rPr>
   </w:style>
   <w:style w:type="character" w:customStyle="1" w:styleId="HeaderChar">
     <w:name w:val="Header Char"/>
@@ -15055,8 +14450,12 @@
         <w:tab w:val="center" w:pos="4680"/>
         <w:tab w:val="right" w:pos="9360"/>
       </w:tabs>
-      <w:spacing w:line="240" w:lineRule="auto"/>
     </w:pPr>
+    <w:rPr>
+      <w:rFonts w:eastAsiaTheme="minorHAnsi" w:cstheme="minorBidi"/>
+      <w:sz w:val="22"/>
+      <w:szCs w:val="22"/>
+    </w:rPr>
   </w:style>
   <w:style w:type="character" w:customStyle="1" w:styleId="FooterChar">
     <w:name w:val="Footer Char"/>
@@ -15090,10 +14489,11 @@
     <w:rsid w:val="00570BB8"/>
     <w:pPr>
       <w:widowControl w:val="0"/>
-      <w:spacing w:line="240" w:lineRule="auto"/>
     </w:pPr>
     <w:rPr>
-      <w:rFonts w:ascii="Calibri" w:hAnsi="Calibri" w:cs="Times New Roman"/>
+      <w:rFonts w:ascii="Calibri" w:eastAsiaTheme="minorHAnsi" w:hAnsi="Calibri"/>
+      <w:sz w:val="22"/>
+      <w:szCs w:val="22"/>
     </w:rPr>
   </w:style>
   <w:style w:type="character" w:styleId="FollowedHyperlink">
@@ -15135,10 +14535,9 @@
         <w:tab w:val="left" w:pos="13740"/>
         <w:tab w:val="left" w:pos="14656"/>
       </w:tabs>
-      <w:spacing w:line="240" w:lineRule="auto"/>
     </w:pPr>
     <w:rPr>
-      <w:rFonts w:ascii="Courier New" w:eastAsia="Times New Roman" w:hAnsi="Courier New" w:cs="Courier New"/>
+      <w:rFonts w:ascii="Courier New" w:hAnsi="Courier New" w:cs="Courier New"/>
       <w:sz w:val="20"/>
       <w:szCs w:val="20"/>
     </w:rPr>
@@ -15199,10 +14598,8 @@
     <w:semiHidden/>
     <w:unhideWhenUsed/>
     <w:rsid w:val="00DE59D3"/>
-    <w:pPr>
-      <w:spacing w:line="240" w:lineRule="auto"/>
-    </w:pPr>
     <w:rPr>
+      <w:rFonts w:eastAsiaTheme="minorHAnsi" w:cstheme="minorBidi"/>
       <w:sz w:val="20"/>
       <w:szCs w:val="20"/>
     </w:rPr>
@@ -15313,9 +14710,10 @@
     <w:qFormat/>
     <w:rsid w:val="00374F41"/>
     <w:pPr>
-      <w:spacing w:after="200" w:line="240" w:lineRule="auto"/>
+      <w:spacing w:after="200"/>
     </w:pPr>
     <w:rPr>
+      <w:rFonts w:eastAsiaTheme="minorHAnsi" w:cstheme="minorBidi"/>
       <w:i/>
       <w:iCs/>
       <w:color w:val="1F497D" w:themeColor="text2"/>

</xml_diff>